<commit_message>
hw3 q3 1-4 itemsets
</commit_message>
<xml_diff>
--- a/data_mining/839/hw3.docx
+++ b/data_mining/839/hw3.docx
@@ -3901,7 +3901,7 @@
                 </mc:Choice>
                 <mc:Fallback>
                   <w:pict>
-                    <v:oval w14:anchorId="2719E5AC" id="Oval 7" o:spid="_x0000_s1026" style="position:absolute;margin-left:23.05pt;margin-top:13.3pt;width:25.5pt;height:16pt;z-index:251723776;visibility:visible;mso-wrap-style:square;mso-width-percent:0;mso-height-percent:0;mso-wrap-distance-left:9pt;mso-wrap-distance-top:0;mso-wrap-distance-right:9pt;mso-wrap-distance-bottom:0;mso-position-horizontal:absolute;mso-position-horizontal-relative:text;mso-position-vertical:absolute;mso-position-vertical-relative:text;mso-width-percent:0;mso-height-percent:0;mso-width-relative:margin;mso-height-relative:margin;v-text-anchor:middle" o:gfxdata="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" filled="f" strokecolor="red" strokeweight="1pt">
+                    <v:oval w14:anchorId="6B76EB5A" id="Oval 7" o:spid="_x0000_s1026" style="position:absolute;margin-left:23.05pt;margin-top:13.3pt;width:25.5pt;height:16pt;z-index:251723776;visibility:visible;mso-wrap-style:square;mso-width-percent:0;mso-height-percent:0;mso-wrap-distance-left:9pt;mso-wrap-distance-top:0;mso-wrap-distance-right:9pt;mso-wrap-distance-bottom:0;mso-position-horizontal:absolute;mso-position-horizontal-relative:text;mso-position-vertical:absolute;mso-position-vertical-relative:text;mso-width-percent:0;mso-height-percent:0;mso-width-relative:margin;mso-height-relative:margin;v-text-anchor:middle" o:gfxdata="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" filled="f" strokecolor="red" strokeweight="1pt">
                       <v:stroke joinstyle="miter"/>
                     </v:oval>
                   </w:pict>
@@ -4181,7 +4181,7 @@
                 </mc:Choice>
                 <mc:Fallback>
                   <w:pict>
-                    <v:oval w14:anchorId="78C00802" id="Oval 2" o:spid="_x0000_s1026" style="position:absolute;margin-left:-4.65pt;margin-top:-.2pt;width:25.5pt;height:16pt;z-index:251734016;visibility:visible;mso-wrap-style:square;mso-width-percent:0;mso-wrap-distance-left:9pt;mso-wrap-distance-top:0;mso-wrap-distance-right:9pt;mso-wrap-distance-bottom:0;mso-position-horizontal:absolute;mso-position-horizontal-relative:text;mso-position-vertical:absolute;mso-position-vertical-relative:text;mso-width-percent:0;mso-width-relative:margin;v-text-anchor:middle" o:gfxdata="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" filled="f" strokecolor="red" strokeweight="1pt">
+                    <v:oval w14:anchorId="4BD95C9C" id="Oval 2" o:spid="_x0000_s1026" style="position:absolute;margin-left:-4.65pt;margin-top:-.2pt;width:25.5pt;height:16pt;z-index:251734016;visibility:visible;mso-wrap-style:square;mso-width-percent:0;mso-wrap-distance-left:9pt;mso-wrap-distance-top:0;mso-wrap-distance-right:9pt;mso-wrap-distance-bottom:0;mso-position-horizontal:absolute;mso-position-horizontal-relative:text;mso-position-vertical:absolute;mso-position-vertical-relative:text;mso-width-percent:0;mso-width-relative:margin;v-text-anchor:middle" o:gfxdata="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" filled="f" strokecolor="red" strokeweight="1pt">
                       <v:stroke joinstyle="miter"/>
                     </v:oval>
                   </w:pict>
@@ -4335,7 +4335,7 @@
                 </mc:Choice>
                 <mc:Fallback>
                   <w:pict>
-                    <v:oval w14:anchorId="1E32C7AD" id="Oval 4" o:spid="_x0000_s1026" style="position:absolute;margin-left:28.9pt;margin-top:13.4pt;width:25.5pt;height:16pt;z-index:251737088;visibility:visible;mso-wrap-style:square;mso-width-percent:0;mso-height-percent:0;mso-wrap-distance-left:9pt;mso-wrap-distance-top:0;mso-wrap-distance-right:9pt;mso-wrap-distance-bottom:0;mso-position-horizontal:absolute;mso-position-horizontal-relative:text;mso-position-vertical:absolute;mso-position-vertical-relative:text;mso-width-percent:0;mso-height-percent:0;mso-width-relative:margin;mso-height-relative:margin;v-text-anchor:middle" o:gfxdata="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" filled="f" strokecolor="red" strokeweight="1pt">
+                    <v:oval w14:anchorId="6208308C" id="Oval 4" o:spid="_x0000_s1026" style="position:absolute;margin-left:28.9pt;margin-top:13.4pt;width:25.5pt;height:16pt;z-index:251737088;visibility:visible;mso-wrap-style:square;mso-width-percent:0;mso-height-percent:0;mso-wrap-distance-left:9pt;mso-wrap-distance-top:0;mso-wrap-distance-right:9pt;mso-wrap-distance-bottom:0;mso-position-horizontal:absolute;mso-position-horizontal-relative:text;mso-position-vertical:absolute;mso-position-vertical-relative:text;mso-width-percent:0;mso-height-percent:0;mso-width-relative:margin;mso-height-relative:margin;v-text-anchor:middle" o:gfxdata="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" filled="f" strokecolor="red" strokeweight="1pt">
                       <v:stroke joinstyle="miter"/>
                     </v:oval>
                   </w:pict>
@@ -5153,7 +5153,7 @@
                 </mc:Choice>
                 <mc:Fallback>
                   <w:pict>
-                    <v:oval w14:anchorId="34E2232B" id="Oval 8" o:spid="_x0000_s1026" style="position:absolute;margin-left:28.7pt;margin-top:13.5pt;width:25.5pt;height:16pt;z-index:251739136;visibility:visible;mso-wrap-style:square;mso-width-percent:0;mso-height-percent:0;mso-wrap-distance-left:9pt;mso-wrap-distance-top:0;mso-wrap-distance-right:9pt;mso-wrap-distance-bottom:0;mso-position-horizontal:absolute;mso-position-horizontal-relative:text;mso-position-vertical:absolute;mso-position-vertical-relative:text;mso-width-percent:0;mso-height-percent:0;mso-width-relative:margin;mso-height-relative:margin;v-text-anchor:middle" o:gfxdata="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" filled="f" strokecolor="red" strokeweight="1pt">
+                    <v:oval w14:anchorId="2AC97DE6" id="Oval 8" o:spid="_x0000_s1026" style="position:absolute;margin-left:28.7pt;margin-top:13.5pt;width:25.5pt;height:16pt;z-index:251739136;visibility:visible;mso-wrap-style:square;mso-width-percent:0;mso-height-percent:0;mso-wrap-distance-left:9pt;mso-wrap-distance-top:0;mso-wrap-distance-right:9pt;mso-wrap-distance-bottom:0;mso-position-horizontal:absolute;mso-position-horizontal-relative:text;mso-position-vertical:absolute;mso-position-vertical-relative:text;mso-width-percent:0;mso-height-percent:0;mso-width-relative:margin;mso-height-relative:margin;v-text-anchor:middle" o:gfxdata="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" filled="f" strokecolor="red" strokeweight="1pt">
                       <v:stroke joinstyle="miter"/>
                     </v:oval>
                   </w:pict>
@@ -5446,7 +5446,7 @@
                 </mc:Choice>
                 <mc:Fallback>
                   <w:pict>
-                    <v:oval w14:anchorId="65FC703F" id="Oval 3" o:spid="_x0000_s1026" style="position:absolute;margin-left:-3.05pt;margin-top:13.2pt;width:25.5pt;height:16pt;z-index:251735040;visibility:visible;mso-wrap-style:square;mso-width-percent:0;mso-wrap-distance-left:9pt;mso-wrap-distance-top:0;mso-wrap-distance-right:9pt;mso-wrap-distance-bottom:0;mso-position-horizontal:absolute;mso-position-horizontal-relative:text;mso-position-vertical:absolute;mso-position-vertical-relative:text;mso-width-percent:0;mso-width-relative:margin;v-text-anchor:middle" o:gfxdata="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" filled="f" strokecolor="red" strokeweight="1pt">
+                    <v:oval w14:anchorId="43CFE78B" id="Oval 3" o:spid="_x0000_s1026" style="position:absolute;margin-left:-3.05pt;margin-top:13.2pt;width:25.5pt;height:16pt;z-index:251735040;visibility:visible;mso-wrap-style:square;mso-width-percent:0;mso-wrap-distance-left:9pt;mso-wrap-distance-top:0;mso-wrap-distance-right:9pt;mso-wrap-distance-bottom:0;mso-position-horizontal:absolute;mso-position-horizontal-relative:text;mso-position-vertical:absolute;mso-position-vertical-relative:text;mso-width-percent:0;mso-width-relative:margin;v-text-anchor:middle" o:gfxdata="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" filled="f" strokecolor="red" strokeweight="1pt">
                       <v:stroke joinstyle="miter"/>
                     </v:oval>
                   </w:pict>
@@ -5829,7 +5829,7 @@
                 </mc:Choice>
                 <mc:Fallback>
                   <w:pict>
-                    <v:oval w14:anchorId="0F1F1D6C" id="Oval 1" o:spid="_x0000_s1026" style="position:absolute;margin-left:-3.5pt;margin-top:13.05pt;width:30.5pt;height:16pt;z-index:251732992;visibility:visible;mso-wrap-style:square;mso-wrap-distance-left:9pt;mso-wrap-distance-top:0;mso-wrap-distance-right:9pt;mso-wrap-distance-bottom:0;mso-position-horizontal:absolute;mso-position-horizontal-relative:text;mso-position-vertical:absolute;mso-position-vertical-relative:text;v-text-anchor:middle" o:gfxdata="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" filled="f" strokecolor="red" strokeweight="1pt">
+                    <v:oval w14:anchorId="1050C88E" id="Oval 1" o:spid="_x0000_s1026" style="position:absolute;margin-left:-3.5pt;margin-top:13.05pt;width:30.5pt;height:16pt;z-index:251732992;visibility:visible;mso-wrap-style:square;mso-wrap-distance-left:9pt;mso-wrap-distance-top:0;mso-wrap-distance-right:9pt;mso-wrap-distance-bottom:0;mso-position-horizontal:absolute;mso-position-horizontal-relative:text;mso-position-vertical:absolute;mso-position-vertical-relative:text;v-text-anchor:middle" o:gfxdata="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" filled="f" strokecolor="red" strokeweight="1pt">
                       <v:stroke joinstyle="miter"/>
                     </v:oval>
                   </w:pict>
@@ -5990,7 +5990,7 @@
                 </mc:Choice>
                 <mc:Fallback>
                   <w:pict>
-                    <v:oval w14:anchorId="4C2FBCD2" id="Oval 5" o:spid="_x0000_s1026" style="position:absolute;margin-left:36.95pt;margin-top:13.05pt;width:25.5pt;height:16pt;z-index:251736064;visibility:visible;mso-wrap-style:square;mso-width-percent:0;mso-wrap-distance-left:9pt;mso-wrap-distance-top:0;mso-wrap-distance-right:9pt;mso-wrap-distance-bottom:0;mso-position-horizontal:absolute;mso-position-horizontal-relative:text;mso-position-vertical:absolute;mso-position-vertical-relative:text;mso-width-percent:0;mso-width-relative:margin;v-text-anchor:middle" o:gfxdata="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" filled="f" strokecolor="red" strokeweight="1pt">
+                    <v:oval w14:anchorId="6BFDAA1C" id="Oval 5" o:spid="_x0000_s1026" style="position:absolute;margin-left:36.95pt;margin-top:13.05pt;width:25.5pt;height:16pt;z-index:251736064;visibility:visible;mso-wrap-style:square;mso-width-percent:0;mso-wrap-distance-left:9pt;mso-wrap-distance-top:0;mso-wrap-distance-right:9pt;mso-wrap-distance-bottom:0;mso-position-horizontal:absolute;mso-position-horizontal-relative:text;mso-position-vertical:absolute;mso-position-vertical-relative:text;mso-width-percent:0;mso-width-relative:margin;v-text-anchor:middle" o:gfxdata="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" filled="f" strokecolor="red" strokeweight="1pt">
                       <v:stroke joinstyle="miter"/>
                     </v:oval>
                   </w:pict>
@@ -6487,7 +6487,7 @@
                 </mc:Choice>
                 <mc:Fallback>
                   <w:pict>
-                    <v:oval w14:anchorId="6A15F3FF" id="Oval 6" o:spid="_x0000_s1026" style="position:absolute;margin-left:29.95pt;margin-top:12.7pt;width:25.5pt;height:16pt;z-index:251738112;visibility:visible;mso-wrap-style:square;mso-width-percent:0;mso-height-percent:0;mso-wrap-distance-left:9pt;mso-wrap-distance-top:0;mso-wrap-distance-right:9pt;mso-wrap-distance-bottom:0;mso-position-horizontal:absolute;mso-position-horizontal-relative:text;mso-position-vertical:absolute;mso-position-vertical-relative:text;mso-width-percent:0;mso-height-percent:0;mso-width-relative:margin;mso-height-relative:margin;v-text-anchor:middle" o:gfxdata="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" filled="f" strokecolor="red" strokeweight="1pt">
+                    <v:oval w14:anchorId="508D889A" id="Oval 6" o:spid="_x0000_s1026" style="position:absolute;margin-left:29.95pt;margin-top:12.7pt;width:25.5pt;height:16pt;z-index:251738112;visibility:visible;mso-wrap-style:square;mso-width-percent:0;mso-height-percent:0;mso-wrap-distance-left:9pt;mso-wrap-distance-top:0;mso-wrap-distance-right:9pt;mso-wrap-distance-bottom:0;mso-position-horizontal:absolute;mso-position-horizontal-relative:text;mso-position-vertical:absolute;mso-position-vertical-relative:text;mso-width-percent:0;mso-height-percent:0;mso-width-relative:margin;mso-height-relative:margin;v-text-anchor:middle" o:gfxdata="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" filled="f" strokecolor="red" strokeweight="1pt">
                       <v:stroke joinstyle="miter"/>
                     </v:oval>
                   </w:pict>
@@ -8536,6 +8536,14 @@
       <w:tblPr>
         <w:tblStyle w:val="TableGrid"/>
         <w:tblW w:w="0" w:type="auto"/>
+        <w:tblBorders>
+          <w:top w:val="none" w:sz="0" w:space="0" w:color="auto"/>
+          <w:left w:val="none" w:sz="0" w:space="0" w:color="auto"/>
+          <w:bottom w:val="none" w:sz="0" w:space="0" w:color="auto"/>
+          <w:right w:val="none" w:sz="0" w:space="0" w:color="auto"/>
+          <w:insideH w:val="none" w:sz="0" w:space="0" w:color="auto"/>
+          <w:insideV w:val="none" w:sz="0" w:space="0" w:color="auto"/>
+        </w:tblBorders>
         <w:tblLook w:val="04A0" w:firstRow="1" w:lastRow="0" w:firstColumn="1" w:lastColumn="0" w:noHBand="0" w:noVBand="1"/>
       </w:tblPr>
       <w:tblGrid>
@@ -8644,6 +8652,7 @@
                     <w:spacing w:before="0" w:beforeAutospacing="0" w:after="0" w:afterAutospacing="0"/>
                     <w:rPr>
                       <w:rFonts w:ascii="Calibri" w:hAnsi="Calibri" w:cs="Calibri"/>
+                      <w:color w:val="92D050"/>
                       <w:sz w:val="22"/>
                       <w:szCs w:val="22"/>
                       <w:lang w:val="en-US"/>
@@ -8652,6 +8661,7 @@
                   <w:r>
                     <w:rPr>
                       <w:rFonts w:ascii="Calibri" w:hAnsi="Calibri" w:cs="Calibri"/>
+                      <w:color w:val="92D050"/>
                       <w:sz w:val="22"/>
                       <w:szCs w:val="22"/>
                       <w:lang w:val="en-US"/>
@@ -8670,6 +8680,7 @@
                     <w:spacing w:before="0" w:beforeAutospacing="0" w:after="0" w:afterAutospacing="0"/>
                     <w:rPr>
                       <w:rFonts w:ascii="Calibri" w:hAnsi="Calibri" w:cs="Calibri"/>
+                      <w:color w:val="92D050"/>
                       <w:sz w:val="22"/>
                       <w:szCs w:val="22"/>
                       <w:lang w:val="en-US"/>
@@ -8678,6 +8689,7 @@
                   <w:r>
                     <w:rPr>
                       <w:rFonts w:ascii="Calibri" w:hAnsi="Calibri" w:cs="Calibri"/>
+                      <w:color w:val="92D050"/>
                       <w:sz w:val="22"/>
                       <w:szCs w:val="22"/>
                       <w:lang w:val="en-US"/>
@@ -8698,6 +8710,7 @@
                     <w:spacing w:before="0" w:beforeAutospacing="0" w:after="0" w:afterAutospacing="0"/>
                     <w:rPr>
                       <w:rFonts w:ascii="Calibri" w:hAnsi="Calibri" w:cs="Calibri"/>
+                      <w:color w:val="92D050"/>
                       <w:sz w:val="22"/>
                       <w:szCs w:val="22"/>
                       <w:lang w:val="en-US"/>
@@ -8706,6 +8719,7 @@
                   <w:r>
                     <w:rPr>
                       <w:rFonts w:ascii="Calibri" w:hAnsi="Calibri" w:cs="Calibri"/>
+                      <w:color w:val="92D050"/>
                       <w:sz w:val="22"/>
                       <w:szCs w:val="22"/>
                       <w:lang w:val="en-US"/>
@@ -8724,6 +8738,7 @@
                     <w:spacing w:before="0" w:beforeAutospacing="0" w:after="0" w:afterAutospacing="0"/>
                     <w:rPr>
                       <w:rFonts w:ascii="Calibri" w:hAnsi="Calibri" w:cs="Calibri"/>
+                      <w:color w:val="92D050"/>
                       <w:sz w:val="22"/>
                       <w:szCs w:val="22"/>
                       <w:lang w:val="en-US"/>
@@ -8732,6 +8747,7 @@
                   <w:r>
                     <w:rPr>
                       <w:rFonts w:ascii="Calibri" w:hAnsi="Calibri" w:cs="Calibri"/>
+                      <w:color w:val="92D050"/>
                       <w:sz w:val="22"/>
                       <w:szCs w:val="22"/>
                       <w:lang w:val="en-US"/>
@@ -8752,6 +8768,7 @@
                     <w:spacing w:before="0" w:beforeAutospacing="0" w:after="0" w:afterAutospacing="0"/>
                     <w:rPr>
                       <w:rFonts w:ascii="Calibri" w:hAnsi="Calibri" w:cs="Calibri"/>
+                      <w:color w:val="92D050"/>
                       <w:sz w:val="22"/>
                       <w:szCs w:val="22"/>
                       <w:lang w:val="en-US"/>
@@ -8760,6 +8777,7 @@
                   <w:r>
                     <w:rPr>
                       <w:rFonts w:ascii="Calibri" w:hAnsi="Calibri" w:cs="Calibri"/>
+                      <w:color w:val="92D050"/>
                       <w:sz w:val="22"/>
                       <w:szCs w:val="22"/>
                       <w:lang w:val="en-US"/>
@@ -8778,6 +8796,7 @@
                     <w:spacing w:before="0" w:beforeAutospacing="0" w:after="0" w:afterAutospacing="0"/>
                     <w:rPr>
                       <w:rFonts w:ascii="Calibri" w:hAnsi="Calibri" w:cs="Calibri"/>
+                      <w:color w:val="92D050"/>
                       <w:sz w:val="22"/>
                       <w:szCs w:val="22"/>
                       <w:lang w:val="en-US"/>
@@ -8786,6 +8805,7 @@
                   <w:r>
                     <w:rPr>
                       <w:rFonts w:ascii="Calibri" w:hAnsi="Calibri" w:cs="Calibri"/>
+                      <w:color w:val="92D050"/>
                       <w:sz w:val="22"/>
                       <w:szCs w:val="22"/>
                       <w:lang w:val="en-US"/>
@@ -8806,6 +8826,7 @@
                     <w:spacing w:before="0" w:beforeAutospacing="0" w:after="0" w:afterAutospacing="0"/>
                     <w:rPr>
                       <w:rFonts w:ascii="Calibri" w:hAnsi="Calibri" w:cs="Calibri"/>
+                      <w:color w:val="92D050"/>
                       <w:sz w:val="22"/>
                       <w:szCs w:val="22"/>
                       <w:lang w:val="en-US"/>
@@ -8814,6 +8835,7 @@
                   <w:r>
                     <w:rPr>
                       <w:rFonts w:ascii="Calibri" w:hAnsi="Calibri" w:cs="Calibri"/>
+                      <w:color w:val="92D050"/>
                       <w:sz w:val="22"/>
                       <w:szCs w:val="22"/>
                       <w:lang w:val="en-US"/>
@@ -8832,6 +8854,7 @@
                     <w:spacing w:before="0" w:beforeAutospacing="0" w:after="0" w:afterAutospacing="0"/>
                     <w:rPr>
                       <w:rFonts w:ascii="Calibri" w:hAnsi="Calibri" w:cs="Calibri"/>
+                      <w:color w:val="92D050"/>
                       <w:sz w:val="22"/>
                       <w:szCs w:val="22"/>
                       <w:lang w:val="en-US"/>
@@ -8840,6 +8863,7 @@
                   <w:r>
                     <w:rPr>
                       <w:rFonts w:ascii="Calibri" w:hAnsi="Calibri" w:cs="Calibri"/>
+                      <w:color w:val="92D050"/>
                       <w:sz w:val="22"/>
                       <w:szCs w:val="22"/>
                       <w:lang w:val="en-US"/>
@@ -8860,6 +8884,7 @@
                     <w:spacing w:before="0" w:beforeAutospacing="0" w:after="0" w:afterAutospacing="0"/>
                     <w:rPr>
                       <w:rFonts w:ascii="Calibri" w:hAnsi="Calibri" w:cs="Calibri"/>
+                      <w:color w:val="92D050"/>
                       <w:sz w:val="22"/>
                       <w:szCs w:val="22"/>
                       <w:lang w:val="en-US"/>
@@ -8868,6 +8893,7 @@
                   <w:r>
                     <w:rPr>
                       <w:rFonts w:ascii="Calibri" w:hAnsi="Calibri" w:cs="Calibri"/>
+                      <w:color w:val="92D050"/>
                       <w:sz w:val="22"/>
                       <w:szCs w:val="22"/>
                       <w:lang w:val="en-US"/>
@@ -8886,6 +8912,7 @@
                     <w:spacing w:before="0" w:beforeAutospacing="0" w:after="0" w:afterAutospacing="0"/>
                     <w:rPr>
                       <w:rFonts w:ascii="Calibri" w:hAnsi="Calibri" w:cs="Calibri"/>
+                      <w:color w:val="92D050"/>
                       <w:sz w:val="22"/>
                       <w:szCs w:val="22"/>
                       <w:lang w:val="en-US"/>
@@ -8894,6 +8921,7 @@
                   <w:r>
                     <w:rPr>
                       <w:rFonts w:ascii="Calibri" w:hAnsi="Calibri" w:cs="Calibri"/>
+                      <w:color w:val="92D050"/>
                       <w:sz w:val="22"/>
                       <w:szCs w:val="22"/>
                       <w:lang w:val="en-US"/>
@@ -8915,6 +8943,15 @@
                 <w:lang w:val="en-US"/>
               </w:rPr>
             </w:pPr>
+            <w:r>
+              <w:rPr>
+                <w:rFonts w:ascii="Calibri" w:hAnsi="Calibri" w:cs="Calibri"/>
+                <w:sz w:val="22"/>
+                <w:szCs w:val="22"/>
+                <w:lang w:val="en-US"/>
+              </w:rPr>
+              <w:t>all frequent</w:t>
+            </w:r>
           </w:p>
         </w:tc>
         <w:tc>
@@ -9818,6 +9855,222 @@
                 <w:lang w:val="en-US"/>
               </w:rPr>
             </w:pPr>
+            <w:r>
+              <w:rPr>
+                <w:rFonts w:ascii="Calibri" w:hAnsi="Calibri" w:cs="Calibri"/>
+                <w:sz w:val="22"/>
+                <w:szCs w:val="22"/>
+                <w:lang w:val="en-US"/>
+              </w:rPr>
+              <w:t>{I1,I2,I3} not frequent</w:t>
+            </w:r>
+          </w:p>
+          <w:p>
+            <w:pPr>
+              <w:pStyle w:val="NormalWeb"/>
+              <w:spacing w:before="0" w:beforeAutospacing="0" w:after="0" w:afterAutospacing="0"/>
+              <w:rPr>
+                <w:rFonts w:ascii="Calibri" w:hAnsi="Calibri" w:cs="Calibri"/>
+                <w:sz w:val="22"/>
+                <w:szCs w:val="22"/>
+                <w:lang w:val="en-US"/>
+              </w:rPr>
+            </w:pPr>
+            <w:r>
+              <w:rPr>
+                <w:rFonts w:ascii="Calibri" w:hAnsi="Calibri" w:cs="Calibri"/>
+                <w:sz w:val="22"/>
+                <w:szCs w:val="22"/>
+                <w:lang w:val="en-US"/>
+              </w:rPr>
+              <w:t>{I1,I</w:t>
+            </w:r>
+            <w:r>
+              <w:rPr>
+                <w:rFonts w:ascii="Calibri" w:hAnsi="Calibri" w:cs="Calibri"/>
+                <w:sz w:val="22"/>
+                <w:szCs w:val="22"/>
+                <w:lang w:val="en-US"/>
+              </w:rPr>
+              <w:t>4</w:t>
+            </w:r>
+            <w:r>
+              <w:rPr>
+                <w:rFonts w:ascii="Calibri" w:hAnsi="Calibri" w:cs="Calibri"/>
+                <w:sz w:val="22"/>
+                <w:szCs w:val="22"/>
+                <w:lang w:val="en-US"/>
+              </w:rPr>
+              <w:t>,I</w:t>
+            </w:r>
+            <w:r>
+              <w:rPr>
+                <w:rFonts w:ascii="Calibri" w:hAnsi="Calibri" w:cs="Calibri"/>
+                <w:sz w:val="22"/>
+                <w:szCs w:val="22"/>
+                <w:lang w:val="en-US"/>
+              </w:rPr>
+              <w:t>5</w:t>
+            </w:r>
+            <w:r>
+              <w:rPr>
+                <w:rFonts w:ascii="Calibri" w:hAnsi="Calibri" w:cs="Calibri"/>
+                <w:sz w:val="22"/>
+                <w:szCs w:val="22"/>
+                <w:lang w:val="en-US"/>
+              </w:rPr>
+              <w:t>} not frequent</w:t>
+            </w:r>
+          </w:p>
+          <w:p>
+            <w:pPr>
+              <w:pStyle w:val="NormalWeb"/>
+              <w:spacing w:before="0" w:beforeAutospacing="0" w:after="0" w:afterAutospacing="0"/>
+              <w:rPr>
+                <w:rFonts w:ascii="Calibri" w:hAnsi="Calibri" w:cs="Calibri"/>
+                <w:sz w:val="22"/>
+                <w:szCs w:val="22"/>
+                <w:lang w:val="en-US"/>
+              </w:rPr>
+            </w:pPr>
+            <w:r>
+              <w:rPr>
+                <w:rFonts w:ascii="Calibri" w:hAnsi="Calibri" w:cs="Calibri"/>
+                <w:sz w:val="22"/>
+                <w:szCs w:val="22"/>
+                <w:lang w:val="en-US"/>
+              </w:rPr>
+              <w:t>{I</w:t>
+            </w:r>
+            <w:r>
+              <w:rPr>
+                <w:rFonts w:ascii="Calibri" w:hAnsi="Calibri" w:cs="Calibri"/>
+                <w:sz w:val="22"/>
+                <w:szCs w:val="22"/>
+                <w:lang w:val="en-US"/>
+              </w:rPr>
+              <w:t>2</w:t>
+            </w:r>
+            <w:r>
+              <w:rPr>
+                <w:rFonts w:ascii="Calibri" w:hAnsi="Calibri" w:cs="Calibri"/>
+                <w:sz w:val="22"/>
+                <w:szCs w:val="22"/>
+                <w:lang w:val="en-US"/>
+              </w:rPr>
+              <w:t>,I</w:t>
+            </w:r>
+            <w:r>
+              <w:rPr>
+                <w:rFonts w:ascii="Calibri" w:hAnsi="Calibri" w:cs="Calibri"/>
+                <w:sz w:val="22"/>
+                <w:szCs w:val="22"/>
+                <w:lang w:val="en-US"/>
+              </w:rPr>
+              <w:t>3</w:t>
+            </w:r>
+            <w:r>
+              <w:rPr>
+                <w:rFonts w:ascii="Calibri" w:hAnsi="Calibri" w:cs="Calibri"/>
+                <w:sz w:val="22"/>
+                <w:szCs w:val="22"/>
+                <w:lang w:val="en-US"/>
+              </w:rPr>
+              <w:t>,I</w:t>
+            </w:r>
+            <w:r>
+              <w:rPr>
+                <w:rFonts w:ascii="Calibri" w:hAnsi="Calibri" w:cs="Calibri"/>
+                <w:sz w:val="22"/>
+                <w:szCs w:val="22"/>
+                <w:lang w:val="en-US"/>
+              </w:rPr>
+              <w:t>5</w:t>
+            </w:r>
+            <w:r>
+              <w:rPr>
+                <w:rFonts w:ascii="Calibri" w:hAnsi="Calibri" w:cs="Calibri"/>
+                <w:sz w:val="22"/>
+                <w:szCs w:val="22"/>
+                <w:lang w:val="en-US"/>
+              </w:rPr>
+              <w:t>} not frequent</w:t>
+            </w:r>
+          </w:p>
+          <w:p>
+            <w:pPr>
+              <w:pStyle w:val="NormalWeb"/>
+              <w:spacing w:before="0" w:beforeAutospacing="0" w:after="0" w:afterAutospacing="0"/>
+              <w:rPr>
+                <w:rFonts w:ascii="Calibri" w:hAnsi="Calibri" w:cs="Calibri"/>
+                <w:sz w:val="22"/>
+                <w:szCs w:val="22"/>
+                <w:lang w:val="en-US"/>
+              </w:rPr>
+            </w:pPr>
+            <w:r>
+              <w:rPr>
+                <w:rFonts w:ascii="Calibri" w:hAnsi="Calibri" w:cs="Calibri"/>
+                <w:sz w:val="22"/>
+                <w:szCs w:val="22"/>
+                <w:lang w:val="en-US"/>
+              </w:rPr>
+              <w:t>{I</w:t>
+            </w:r>
+            <w:r>
+              <w:rPr>
+                <w:rFonts w:ascii="Calibri" w:hAnsi="Calibri" w:cs="Calibri"/>
+                <w:sz w:val="22"/>
+                <w:szCs w:val="22"/>
+                <w:lang w:val="en-US"/>
+              </w:rPr>
+              <w:t>2</w:t>
+            </w:r>
+            <w:r>
+              <w:rPr>
+                <w:rFonts w:ascii="Calibri" w:hAnsi="Calibri" w:cs="Calibri"/>
+                <w:sz w:val="22"/>
+                <w:szCs w:val="22"/>
+                <w:lang w:val="en-US"/>
+              </w:rPr>
+              <w:t>,I</w:t>
+            </w:r>
+            <w:r>
+              <w:rPr>
+                <w:rFonts w:ascii="Calibri" w:hAnsi="Calibri" w:cs="Calibri"/>
+                <w:sz w:val="22"/>
+                <w:szCs w:val="22"/>
+                <w:lang w:val="en-US"/>
+              </w:rPr>
+              <w:t>4</w:t>
+            </w:r>
+            <w:r>
+              <w:rPr>
+                <w:rFonts w:ascii="Calibri" w:hAnsi="Calibri" w:cs="Calibri"/>
+                <w:sz w:val="22"/>
+                <w:szCs w:val="22"/>
+                <w:lang w:val="en-US"/>
+              </w:rPr>
+              <w:t>,I</w:t>
+            </w:r>
+            <w:r>
+              <w:rPr>
+                <w:rFonts w:ascii="Calibri" w:hAnsi="Calibri" w:cs="Calibri"/>
+                <w:sz w:val="22"/>
+                <w:szCs w:val="22"/>
+                <w:lang w:val="en-US"/>
+              </w:rPr>
+              <w:t>5</w:t>
+            </w:r>
+            <w:r>
+              <w:rPr>
+                <w:rFonts w:ascii="Calibri" w:hAnsi="Calibri" w:cs="Calibri"/>
+                <w:sz w:val="22"/>
+                <w:szCs w:val="22"/>
+                <w:lang w:val="en-US"/>
+              </w:rPr>
+              <w:t>} not frequent</w:t>
+            </w:r>
           </w:p>
         </w:tc>
         <w:tc>
@@ -9994,6 +10247,84 @@
                       <w:szCs w:val="22"/>
                       <w:lang w:val="en-US"/>
                     </w:rPr>
+                    <w:t>1</w:t>
+                  </w:r>
+                </w:p>
+              </w:tc>
+            </w:tr>
+            <w:tr>
+              <w:tc>
+                <w:tcPr>
+                  <w:tcW w:w="965" w:type="dxa"/>
+                </w:tcPr>
+                <w:p>
+                  <w:pPr>
+                    <w:pStyle w:val="NormalWeb"/>
+                    <w:spacing w:before="0" w:beforeAutospacing="0" w:after="0" w:afterAutospacing="0"/>
+                    <w:rPr>
+                      <w:rFonts w:ascii="Calibri" w:hAnsi="Calibri" w:cs="Calibri"/>
+                      <w:color w:val="92D050"/>
+                      <w:sz w:val="22"/>
+                      <w:szCs w:val="22"/>
+                      <w:lang w:val="en-US"/>
+                    </w:rPr>
+                  </w:pPr>
+                  <w:r>
+                    <w:rPr>
+                      <w:rFonts w:ascii="Calibri" w:hAnsi="Calibri" w:cs="Calibri"/>
+                      <w:color w:val="92D050"/>
+                      <w:sz w:val="22"/>
+                      <w:szCs w:val="22"/>
+                      <w:lang w:val="en-US"/>
+                    </w:rPr>
+                    <w:t>{I</w:t>
+                  </w:r>
+                  <w:r>
+                    <w:rPr>
+                      <w:rFonts w:ascii="Calibri" w:hAnsi="Calibri" w:cs="Calibri"/>
+                      <w:color w:val="92D050"/>
+                      <w:sz w:val="22"/>
+                      <w:szCs w:val="22"/>
+                      <w:lang w:val="en-US"/>
+                    </w:rPr>
+                    <w:t>2,I3,I4</w:t>
+                  </w:r>
+                  <w:r>
+                    <w:rPr>
+                      <w:rFonts w:ascii="Calibri" w:hAnsi="Calibri" w:cs="Calibri"/>
+                      <w:color w:val="92D050"/>
+                      <w:sz w:val="22"/>
+                      <w:szCs w:val="22"/>
+                      <w:lang w:val="en-US"/>
+                    </w:rPr>
+                    <w:t>}</w:t>
+                  </w:r>
+                </w:p>
+              </w:tc>
+              <w:tc>
+                <w:tcPr>
+                  <w:tcW w:w="1510" w:type="dxa"/>
+                </w:tcPr>
+                <w:p>
+                  <w:pPr>
+                    <w:pStyle w:val="NormalWeb"/>
+                    <w:spacing w:before="0" w:beforeAutospacing="0" w:after="0" w:afterAutospacing="0"/>
+                    <w:rPr>
+                      <w:rFonts w:ascii="Calibri" w:hAnsi="Calibri" w:cs="Calibri"/>
+                      <w:color w:val="92D050"/>
+                      <w:sz w:val="22"/>
+                      <w:szCs w:val="22"/>
+                      <w:lang w:val="en-US"/>
+                    </w:rPr>
+                  </w:pPr>
+                  <w:r>
+                    <w:rPr>
+                      <w:rFonts w:ascii="Calibri" w:hAnsi="Calibri" w:cs="Calibri"/>
+                      <w:color w:val="92D050"/>
+                      <w:sz w:val="22"/>
+                      <w:szCs w:val="22"/>
+                      <w:lang w:val="en-US"/>
+                    </w:rPr>
                     <w:t>3</w:t>
                   </w:r>
                 </w:p>
@@ -10003,6 +10334,192 @@
               <w:tc>
                 <w:tcPr>
                   <w:tcW w:w="965" w:type="dxa"/>
+                </w:tcPr>
+                <w:p>
+                  <w:pPr>
+                    <w:pStyle w:val="NormalWeb"/>
+                    <w:spacing w:before="0" w:beforeAutospacing="0" w:after="0" w:afterAutospacing="0"/>
+                    <w:rPr>
+                      <w:rFonts w:ascii="Calibri" w:hAnsi="Calibri" w:cs="Calibri"/>
+                      <w:color w:val="92D050"/>
+                      <w:sz w:val="22"/>
+                      <w:szCs w:val="22"/>
+                      <w:lang w:val="en-US"/>
+                    </w:rPr>
+                  </w:pPr>
+                  <w:r>
+                    <w:rPr>
+                      <w:rFonts w:ascii="Calibri" w:hAnsi="Calibri" w:cs="Calibri"/>
+                      <w:color w:val="92D050"/>
+                      <w:sz w:val="22"/>
+                      <w:szCs w:val="22"/>
+                      <w:lang w:val="en-US"/>
+                    </w:rPr>
+                    <w:t>{I3,I4,I5}</w:t>
+                  </w:r>
+                </w:p>
+              </w:tc>
+              <w:tc>
+                <w:tcPr>
+                  <w:tcW w:w="1510" w:type="dxa"/>
+                </w:tcPr>
+                <w:p>
+                  <w:pPr>
+                    <w:pStyle w:val="NormalWeb"/>
+                    <w:spacing w:before="0" w:beforeAutospacing="0" w:after="0" w:afterAutospacing="0"/>
+                    <w:rPr>
+                      <w:rFonts w:ascii="Calibri" w:hAnsi="Calibri" w:cs="Calibri"/>
+                      <w:color w:val="92D050"/>
+                      <w:sz w:val="22"/>
+                      <w:szCs w:val="22"/>
+                      <w:lang w:val="en-US"/>
+                    </w:rPr>
+                  </w:pPr>
+                  <w:r>
+                    <w:rPr>
+                      <w:rFonts w:ascii="Calibri" w:hAnsi="Calibri" w:cs="Calibri"/>
+                      <w:color w:val="92D050"/>
+                      <w:sz w:val="22"/>
+                      <w:szCs w:val="22"/>
+                      <w:lang w:val="en-US"/>
+                    </w:rPr>
+                    <w:t>2</w:t>
+                  </w:r>
+                </w:p>
+              </w:tc>
+            </w:tr>
+          </w:tbl>
+          <w:p>
+            <w:pPr>
+              <w:pStyle w:val="NormalWeb"/>
+              <w:spacing w:before="0" w:beforeAutospacing="0" w:after="0" w:afterAutospacing="0"/>
+              <w:rPr>
+                <w:rFonts w:ascii="Calibri" w:hAnsi="Calibri" w:cs="Calibri"/>
+                <w:sz w:val="22"/>
+                <w:szCs w:val="22"/>
+                <w:lang w:val="en-US"/>
+              </w:rPr>
+            </w:pPr>
+            <w:r>
+              <w:rPr>
+                <w:rFonts w:ascii="Calibri" w:hAnsi="Calibri" w:cs="Calibri"/>
+                <w:sz w:val="22"/>
+                <w:szCs w:val="22"/>
+                <w:lang w:val="en-US"/>
+              </w:rPr>
+              <w:t>{I2,I3,I4,I5}</w:t>
+            </w:r>
+            <w:r>
+              <w:rPr>
+                <w:rFonts w:ascii="Calibri" w:hAnsi="Calibri" w:cs="Calibri"/>
+                <w:sz w:val="22"/>
+                <w:szCs w:val="22"/>
+                <w:lang w:val="en-US"/>
+              </w:rPr>
+              <w:t xml:space="preserve"> not frequent</w:t>
+            </w:r>
+          </w:p>
+          <w:p>
+            <w:pPr>
+              <w:pStyle w:val="NormalWeb"/>
+              <w:spacing w:before="0" w:beforeAutospacing="0" w:after="0" w:afterAutospacing="0"/>
+              <w:rPr>
+                <w:rFonts w:ascii="Calibri" w:hAnsi="Calibri" w:cs="Calibri"/>
+                <w:sz w:val="22"/>
+                <w:szCs w:val="22"/>
+                <w:lang w:val="en-US"/>
+              </w:rPr>
+            </w:pPr>
+          </w:p>
+          <w:p>
+            <w:pPr>
+              <w:pStyle w:val="NormalWeb"/>
+              <w:spacing w:before="0" w:beforeAutospacing="0" w:after="0" w:afterAutospacing="0"/>
+              <w:rPr>
+                <w:rFonts w:ascii="Calibri" w:hAnsi="Calibri" w:cs="Calibri"/>
+                <w:sz w:val="22"/>
+                <w:szCs w:val="22"/>
+                <w:lang w:val="en-US"/>
+              </w:rPr>
+            </w:pPr>
+            <w:r>
+              <w:rPr>
+                <w:rFonts w:ascii="Calibri" w:hAnsi="Calibri" w:cs="Calibri"/>
+                <w:sz w:val="22"/>
+                <w:szCs w:val="22"/>
+                <w:lang w:val="en-US"/>
+              </w:rPr>
+              <w:t>generating 4-itemsets</w:t>
+            </w:r>
+          </w:p>
+          <w:tbl>
+            <w:tblPr>
+              <w:tblStyle w:val="TableGrid"/>
+              <w:tblW w:w="0" w:type="auto"/>
+              <w:tblLook w:val="04A0" w:firstRow="1" w:lastRow="0" w:firstColumn="1" w:lastColumn="0" w:noHBand="0" w:noVBand="1"/>
+            </w:tblPr>
+            <w:tblGrid>
+              <w:gridCol w:w="1187"/>
+              <w:gridCol w:w="1510"/>
+            </w:tblGrid>
+            <w:tr>
+              <w:tc>
+                <w:tcPr>
+                  <w:tcW w:w="895" w:type="dxa"/>
+                </w:tcPr>
+                <w:p>
+                  <w:pPr>
+                    <w:pStyle w:val="NormalWeb"/>
+                    <w:spacing w:before="0" w:beforeAutospacing="0" w:after="0" w:afterAutospacing="0"/>
+                    <w:rPr>
+                      <w:rFonts w:ascii="Calibri" w:hAnsi="Calibri" w:cs="Calibri"/>
+                      <w:sz w:val="22"/>
+                      <w:szCs w:val="22"/>
+                      <w:lang w:val="en-US"/>
+                    </w:rPr>
+                  </w:pPr>
+                  <w:r>
+                    <w:rPr>
+                      <w:rFonts w:ascii="Calibri" w:hAnsi="Calibri" w:cs="Calibri"/>
+                      <w:sz w:val="22"/>
+                      <w:szCs w:val="22"/>
+                      <w:lang w:val="en-US"/>
+                    </w:rPr>
+                    <w:t>itemset</w:t>
+                  </w:r>
+                </w:p>
+              </w:tc>
+              <w:tc>
+                <w:tcPr>
+                  <w:tcW w:w="1510" w:type="dxa"/>
+                </w:tcPr>
+                <w:p>
+                  <w:pPr>
+                    <w:pStyle w:val="NormalWeb"/>
+                    <w:spacing w:before="0" w:beforeAutospacing="0" w:after="0" w:afterAutospacing="0"/>
+                    <w:rPr>
+                      <w:rFonts w:ascii="Calibri" w:hAnsi="Calibri" w:cs="Calibri"/>
+                      <w:sz w:val="22"/>
+                      <w:szCs w:val="22"/>
+                      <w:lang w:val="en-US"/>
+                    </w:rPr>
+                  </w:pPr>
+                  <w:r>
+                    <w:rPr>
+                      <w:rFonts w:ascii="Calibri" w:hAnsi="Calibri" w:cs="Calibri"/>
+                      <w:sz w:val="22"/>
+                      <w:szCs w:val="22"/>
+                      <w:lang w:val="en-US"/>
+                    </w:rPr>
+                    <w:t>support count</w:t>
+                  </w:r>
+                </w:p>
+              </w:tc>
+            </w:tr>
+            <w:tr>
+              <w:tc>
+                <w:tcPr>
+                  <w:tcW w:w="895" w:type="dxa"/>
                 </w:tcPr>
                 <w:p>
                   <w:pPr>
@@ -10031,7 +10548,7 @@
                       <w:szCs w:val="22"/>
                       <w:lang w:val="en-US"/>
                     </w:rPr>
-                    <w:t>1,I2,I3</w:t>
+                    <w:t>2,I3,I4,I5</w:t>
                   </w:r>
                   <w:r>
                     <w:rPr>
@@ -10066,317 +10583,11 @@
                       <w:szCs w:val="22"/>
                       <w:lang w:val="en-US"/>
                     </w:rPr>
-                    <w:t>4</w:t>
+                    <w:t>-</w:t>
                   </w:r>
                 </w:p>
               </w:tc>
             </w:tr>
-            <w:tr>
-              <w:tc>
-                <w:tcPr>
-                  <w:tcW w:w="965" w:type="dxa"/>
-                </w:tcPr>
-                <w:p>
-                  <w:pPr>
-                    <w:pStyle w:val="NormalWeb"/>
-                    <w:spacing w:before="0" w:beforeAutospacing="0" w:after="0" w:afterAutospacing="0"/>
-                    <w:rPr>
-                      <w:rFonts w:ascii="Calibri" w:hAnsi="Calibri" w:cs="Calibri"/>
-                      <w:sz w:val="22"/>
-                      <w:szCs w:val="22"/>
-                      <w:lang w:val="en-US"/>
-                    </w:rPr>
-                  </w:pPr>
-                  <w:r>
-                    <w:rPr>
-                      <w:rFonts w:ascii="Calibri" w:hAnsi="Calibri" w:cs="Calibri"/>
-                      <w:sz w:val="22"/>
-                      <w:szCs w:val="22"/>
-                      <w:lang w:val="en-US"/>
-                    </w:rPr>
-                    <w:t>{I</w:t>
-                  </w:r>
-                  <w:r>
-                    <w:rPr>
-                      <w:rFonts w:ascii="Calibri" w:hAnsi="Calibri" w:cs="Calibri"/>
-                      <w:sz w:val="22"/>
-                      <w:szCs w:val="22"/>
-                      <w:lang w:val="en-US"/>
-                    </w:rPr>
-                    <w:t>1,I4,I5</w:t>
-                  </w:r>
-                  <w:r>
-                    <w:rPr>
-                      <w:rFonts w:ascii="Calibri" w:hAnsi="Calibri" w:cs="Calibri"/>
-                      <w:sz w:val="22"/>
-                      <w:szCs w:val="22"/>
-                      <w:lang w:val="en-US"/>
-                    </w:rPr>
-                    <w:t>}</w:t>
-                  </w:r>
-                </w:p>
-              </w:tc>
-              <w:tc>
-                <w:tcPr>
-                  <w:tcW w:w="1510" w:type="dxa"/>
-                </w:tcPr>
-                <w:p>
-                  <w:pPr>
-                    <w:pStyle w:val="NormalWeb"/>
-                    <w:spacing w:before="0" w:beforeAutospacing="0" w:after="0" w:afterAutospacing="0"/>
-                    <w:rPr>
-                      <w:rFonts w:ascii="Calibri" w:hAnsi="Calibri" w:cs="Calibri"/>
-                      <w:sz w:val="22"/>
-                      <w:szCs w:val="22"/>
-                      <w:lang w:val="en-US"/>
-                    </w:rPr>
-                  </w:pPr>
-                  <w:r>
-                    <w:rPr>
-                      <w:rFonts w:ascii="Calibri" w:hAnsi="Calibri" w:cs="Calibri"/>
-                      <w:sz w:val="22"/>
-                      <w:szCs w:val="22"/>
-                      <w:lang w:val="en-US"/>
-                    </w:rPr>
-                    <w:t>5</w:t>
-                  </w:r>
-                </w:p>
-              </w:tc>
-            </w:tr>
-            <w:tr>
-              <w:tc>
-                <w:tcPr>
-                  <w:tcW w:w="965" w:type="dxa"/>
-                </w:tcPr>
-                <w:p>
-                  <w:pPr>
-                    <w:pStyle w:val="NormalWeb"/>
-                    <w:spacing w:before="0" w:beforeAutospacing="0" w:after="0" w:afterAutospacing="0"/>
-                    <w:rPr>
-                      <w:rFonts w:ascii="Calibri" w:hAnsi="Calibri" w:cs="Calibri"/>
-                      <w:sz w:val="22"/>
-                      <w:szCs w:val="22"/>
-                      <w:lang w:val="en-US"/>
-                    </w:rPr>
-                  </w:pPr>
-                  <w:r>
-                    <w:rPr>
-                      <w:rFonts w:ascii="Calibri" w:hAnsi="Calibri" w:cs="Calibri"/>
-                      <w:sz w:val="22"/>
-                      <w:szCs w:val="22"/>
-                      <w:lang w:val="en-US"/>
-                    </w:rPr>
-                    <w:t>{I</w:t>
-                  </w:r>
-                  <w:r>
-                    <w:rPr>
-                      <w:rFonts w:ascii="Calibri" w:hAnsi="Calibri" w:cs="Calibri"/>
-                      <w:sz w:val="22"/>
-                      <w:szCs w:val="22"/>
-                      <w:lang w:val="en-US"/>
-                    </w:rPr>
-                    <w:t>2,I3,I4</w:t>
-                  </w:r>
-                  <w:r>
-                    <w:rPr>
-                      <w:rFonts w:ascii="Calibri" w:hAnsi="Calibri" w:cs="Calibri"/>
-                      <w:sz w:val="22"/>
-                      <w:szCs w:val="22"/>
-                      <w:lang w:val="en-US"/>
-                    </w:rPr>
-                    <w:t>}</w:t>
-                  </w:r>
-                </w:p>
-              </w:tc>
-              <w:tc>
-                <w:tcPr>
-                  <w:tcW w:w="1510" w:type="dxa"/>
-                </w:tcPr>
-                <w:p>
-                  <w:pPr>
-                    <w:pStyle w:val="NormalWeb"/>
-                    <w:spacing w:before="0" w:beforeAutospacing="0" w:after="0" w:afterAutospacing="0"/>
-                    <w:rPr>
-                      <w:rFonts w:ascii="Calibri" w:hAnsi="Calibri" w:cs="Calibri"/>
-                      <w:sz w:val="22"/>
-                      <w:szCs w:val="22"/>
-                      <w:lang w:val="en-US"/>
-                    </w:rPr>
-                  </w:pPr>
-                  <w:r>
-                    <w:rPr>
-                      <w:rFonts w:ascii="Calibri" w:hAnsi="Calibri" w:cs="Calibri"/>
-                      <w:sz w:val="22"/>
-                      <w:szCs w:val="22"/>
-                      <w:lang w:val="en-US"/>
-                    </w:rPr>
-                    <w:t>5</w:t>
-                  </w:r>
-                </w:p>
-              </w:tc>
-            </w:tr>
-            <w:tr>
-              <w:tc>
-                <w:tcPr>
-                  <w:tcW w:w="965" w:type="dxa"/>
-                </w:tcPr>
-                <w:p>
-                  <w:pPr>
-                    <w:pStyle w:val="NormalWeb"/>
-                    <w:spacing w:before="0" w:beforeAutospacing="0" w:after="0" w:afterAutospacing="0"/>
-                    <w:rPr>
-                      <w:rFonts w:ascii="Calibri" w:hAnsi="Calibri" w:cs="Calibri"/>
-                      <w:sz w:val="22"/>
-                      <w:szCs w:val="22"/>
-                      <w:lang w:val="en-US"/>
-                    </w:rPr>
-                  </w:pPr>
-                  <w:r>
-                    <w:rPr>
-                      <w:rFonts w:ascii="Calibri" w:hAnsi="Calibri" w:cs="Calibri"/>
-                      <w:sz w:val="22"/>
-                      <w:szCs w:val="22"/>
-                      <w:lang w:val="en-US"/>
-                    </w:rPr>
-                    <w:t>{I</w:t>
-                  </w:r>
-                  <w:r>
-                    <w:rPr>
-                      <w:rFonts w:ascii="Calibri" w:hAnsi="Calibri" w:cs="Calibri"/>
-                      <w:sz w:val="22"/>
-                      <w:szCs w:val="22"/>
-                      <w:lang w:val="en-US"/>
-                    </w:rPr>
-                    <w:t>2,I3,I5</w:t>
-                  </w:r>
-                  <w:r>
-                    <w:rPr>
-                      <w:rFonts w:ascii="Calibri" w:hAnsi="Calibri" w:cs="Calibri"/>
-                      <w:sz w:val="22"/>
-                      <w:szCs w:val="22"/>
-                      <w:lang w:val="en-US"/>
-                    </w:rPr>
-                    <w:t>}</w:t>
-                  </w:r>
-                </w:p>
-              </w:tc>
-              <w:tc>
-                <w:tcPr>
-                  <w:tcW w:w="1510" w:type="dxa"/>
-                </w:tcPr>
-                <w:p>
-                  <w:pPr>
-                    <w:pStyle w:val="NormalWeb"/>
-                    <w:spacing w:before="0" w:beforeAutospacing="0" w:after="0" w:afterAutospacing="0"/>
-                    <w:rPr>
-                      <w:rFonts w:ascii="Calibri" w:hAnsi="Calibri" w:cs="Calibri"/>
-                      <w:sz w:val="22"/>
-                      <w:szCs w:val="22"/>
-                      <w:lang w:val="en-US"/>
-                    </w:rPr>
-                  </w:pPr>
-                  <w:r>
-                    <w:rPr>
-                      <w:rFonts w:ascii="Calibri" w:hAnsi="Calibri" w:cs="Calibri"/>
-                      <w:sz w:val="22"/>
-                      <w:szCs w:val="22"/>
-                      <w:lang w:val="en-US"/>
-                    </w:rPr>
-                    <w:t>4</w:t>
-                  </w:r>
-                </w:p>
-              </w:tc>
-            </w:tr>
-            <w:tr>
-              <w:tc>
-                <w:tcPr>
-                  <w:tcW w:w="965" w:type="dxa"/>
-                </w:tcPr>
-                <w:p>
-                  <w:pPr>
-                    <w:pStyle w:val="NormalWeb"/>
-                    <w:spacing w:before="0" w:beforeAutospacing="0" w:after="0" w:afterAutospacing="0"/>
-                    <w:rPr>
-                      <w:rFonts w:ascii="Calibri" w:hAnsi="Calibri" w:cs="Calibri"/>
-                      <w:sz w:val="22"/>
-                      <w:szCs w:val="22"/>
-                      <w:lang w:val="en-US"/>
-                    </w:rPr>
-                  </w:pPr>
-                  <w:r>
-                    <w:rPr>
-                      <w:rFonts w:ascii="Calibri" w:hAnsi="Calibri" w:cs="Calibri"/>
-                      <w:sz w:val="22"/>
-                      <w:szCs w:val="22"/>
-                      <w:lang w:val="en-US"/>
-                    </w:rPr>
-                    <w:t>{I2,I4,I5}</w:t>
-                  </w:r>
-                </w:p>
-              </w:tc>
-              <w:tc>
-                <w:tcPr>
-                  <w:tcW w:w="1510" w:type="dxa"/>
-                </w:tcPr>
-                <w:p>
-                  <w:pPr>
-                    <w:pStyle w:val="NormalWeb"/>
-                    <w:spacing w:before="0" w:beforeAutospacing="0" w:after="0" w:afterAutospacing="0"/>
-                    <w:rPr>
-                      <w:rFonts w:ascii="Calibri" w:hAnsi="Calibri" w:cs="Calibri"/>
-                      <w:sz w:val="22"/>
-                      <w:szCs w:val="22"/>
-                      <w:lang w:val="en-US"/>
-                    </w:rPr>
-                  </w:pPr>
-                </w:p>
-              </w:tc>
-            </w:tr>
-            <w:tr>
-              <w:tc>
-                <w:tcPr>
-                  <w:tcW w:w="965" w:type="dxa"/>
-                </w:tcPr>
-                <w:p>
-                  <w:pPr>
-                    <w:pStyle w:val="NormalWeb"/>
-                    <w:spacing w:before="0" w:beforeAutospacing="0" w:after="0" w:afterAutospacing="0"/>
-                    <w:rPr>
-                      <w:rFonts w:ascii="Calibri" w:hAnsi="Calibri" w:cs="Calibri"/>
-                      <w:sz w:val="22"/>
-                      <w:szCs w:val="22"/>
-                      <w:lang w:val="en-US"/>
-                    </w:rPr>
-                  </w:pPr>
-                  <w:r>
-                    <w:rPr>
-                      <w:rFonts w:ascii="Calibri" w:hAnsi="Calibri" w:cs="Calibri"/>
-                      <w:sz w:val="22"/>
-                      <w:szCs w:val="22"/>
-                      <w:lang w:val="en-US"/>
-                    </w:rPr>
-                    <w:t>{I3,I4,I5}</w:t>
-                  </w:r>
-                </w:p>
-              </w:tc>
-              <w:tc>
-                <w:tcPr>
-                  <w:tcW w:w="1510" w:type="dxa"/>
-                </w:tcPr>
-                <w:p>
-                  <w:pPr>
-                    <w:pStyle w:val="NormalWeb"/>
-                    <w:spacing w:before="0" w:beforeAutospacing="0" w:after="0" w:afterAutospacing="0"/>
-                    <w:rPr>
-                      <w:rFonts w:ascii="Calibri" w:hAnsi="Calibri" w:cs="Calibri"/>
-                      <w:sz w:val="22"/>
-                      <w:szCs w:val="22"/>
-                      <w:lang w:val="en-US"/>
-                    </w:rPr>
-                  </w:pPr>
-                </w:p>
-              </w:tc>
-            </w:tr>
           </w:tbl>
           <w:p>
             <w:pPr>
@@ -10393,6 +10604,1067 @@
         </w:tc>
       </w:tr>
     </w:tbl>
+    <w:p>
+      <w:pPr>
+        <w:pStyle w:val="NormalWeb"/>
+        <w:spacing w:before="0" w:beforeAutospacing="0" w:after="0" w:afterAutospacing="0"/>
+        <w:rPr>
+          <w:rFonts w:ascii="Calibri" w:hAnsi="Calibri" w:cs="Calibri"/>
+          <w:sz w:val="22"/>
+          <w:szCs w:val="22"/>
+          <w:lang w:val="en-US"/>
+        </w:rPr>
+      </w:pPr>
+    </w:p>
+    <w:p>
+      <w:pPr>
+        <w:pStyle w:val="NormalWeb"/>
+        <w:spacing w:before="0" w:beforeAutospacing="0" w:after="0" w:afterAutospacing="0"/>
+        <w:rPr>
+          <w:rFonts w:ascii="Calibri" w:hAnsi="Calibri" w:cs="Calibri"/>
+          <w:sz w:val="22"/>
+          <w:szCs w:val="22"/>
+          <w:lang w:val="en-US"/>
+        </w:rPr>
+      </w:pPr>
+      <w:r>
+        <w:rPr>
+          <w:rFonts w:ascii="Calibri" w:hAnsi="Calibri" w:cs="Calibri"/>
+          <w:sz w:val="22"/>
+          <w:szCs w:val="22"/>
+          <w:lang w:val="en-US"/>
+        </w:rPr>
+        <w:t xml:space="preserve">frequent items: </w:t>
+      </w:r>
+    </w:p>
+    <w:p>
+      <w:pPr>
+        <w:pStyle w:val="NormalWeb"/>
+        <w:spacing w:before="0" w:beforeAutospacing="0" w:after="0" w:afterAutospacing="0"/>
+        <w:rPr>
+          <w:rFonts w:ascii="Calibri" w:hAnsi="Calibri" w:cs="Calibri"/>
+          <w:sz w:val="22"/>
+          <w:szCs w:val="22"/>
+          <w:lang w:val="en-US"/>
+        </w:rPr>
+      </w:pPr>
+      <w:r>
+        <w:rPr>
+          <w:rFonts w:ascii="Calibri" w:hAnsi="Calibri" w:cs="Calibri"/>
+          <w:sz w:val="22"/>
+          <w:szCs w:val="22"/>
+          <w:lang w:val="en-US"/>
+        </w:rPr>
+        <w:t>{</w:t>
+      </w:r>
+      <w:r>
+        <w:rPr>
+          <w:rFonts w:ascii="Calibri" w:hAnsi="Calibri" w:cs="Calibri"/>
+          <w:color w:val="AEAAAA" w:themeColor="background2" w:themeShade="BF"/>
+          <w:sz w:val="22"/>
+          <w:szCs w:val="22"/>
+          <w:lang w:val="en-US"/>
+        </w:rPr>
+        <w:t>{I1},</w:t>
+      </w:r>
+      <w:r>
+        <w:rPr>
+          <w:rFonts w:ascii="Calibri" w:hAnsi="Calibri" w:cs="Calibri"/>
+          <w:color w:val="AEAAAA" w:themeColor="background2" w:themeShade="BF"/>
+          <w:sz w:val="22"/>
+          <w:szCs w:val="22"/>
+          <w:lang w:val="en-US"/>
+        </w:rPr>
+        <w:t>{I</w:t>
+      </w:r>
+      <w:r>
+        <w:rPr>
+          <w:rFonts w:ascii="Calibri" w:hAnsi="Calibri" w:cs="Calibri"/>
+          <w:color w:val="AEAAAA" w:themeColor="background2" w:themeShade="BF"/>
+          <w:sz w:val="22"/>
+          <w:szCs w:val="22"/>
+          <w:lang w:val="en-US"/>
+        </w:rPr>
+        <w:t>2</w:t>
+      </w:r>
+      <w:r>
+        <w:rPr>
+          <w:rFonts w:ascii="Calibri" w:hAnsi="Calibri" w:cs="Calibri"/>
+          <w:color w:val="AEAAAA" w:themeColor="background2" w:themeShade="BF"/>
+          <w:sz w:val="22"/>
+          <w:szCs w:val="22"/>
+          <w:lang w:val="en-US"/>
+        </w:rPr>
+        <w:t>},{I</w:t>
+      </w:r>
+      <w:r>
+        <w:rPr>
+          <w:rFonts w:ascii="Calibri" w:hAnsi="Calibri" w:cs="Calibri"/>
+          <w:color w:val="AEAAAA" w:themeColor="background2" w:themeShade="BF"/>
+          <w:sz w:val="22"/>
+          <w:szCs w:val="22"/>
+          <w:lang w:val="en-US"/>
+        </w:rPr>
+        <w:t>3</w:t>
+      </w:r>
+      <w:r>
+        <w:rPr>
+          <w:rFonts w:ascii="Calibri" w:hAnsi="Calibri" w:cs="Calibri"/>
+          <w:color w:val="AEAAAA" w:themeColor="background2" w:themeShade="BF"/>
+          <w:sz w:val="22"/>
+          <w:szCs w:val="22"/>
+          <w:lang w:val="en-US"/>
+        </w:rPr>
+        <w:t>},{I</w:t>
+      </w:r>
+      <w:r>
+        <w:rPr>
+          <w:rFonts w:ascii="Calibri" w:hAnsi="Calibri" w:cs="Calibri"/>
+          <w:color w:val="AEAAAA" w:themeColor="background2" w:themeShade="BF"/>
+          <w:sz w:val="22"/>
+          <w:szCs w:val="22"/>
+          <w:lang w:val="en-US"/>
+        </w:rPr>
+        <w:t>4</w:t>
+      </w:r>
+      <w:r>
+        <w:rPr>
+          <w:rFonts w:ascii="Calibri" w:hAnsi="Calibri" w:cs="Calibri"/>
+          <w:color w:val="AEAAAA" w:themeColor="background2" w:themeShade="BF"/>
+          <w:sz w:val="22"/>
+          <w:szCs w:val="22"/>
+          <w:lang w:val="en-US"/>
+        </w:rPr>
+        <w:t>},{I</w:t>
+      </w:r>
+      <w:r>
+        <w:rPr>
+          <w:rFonts w:ascii="Calibri" w:hAnsi="Calibri" w:cs="Calibri"/>
+          <w:color w:val="AEAAAA" w:themeColor="background2" w:themeShade="BF"/>
+          <w:sz w:val="22"/>
+          <w:szCs w:val="22"/>
+          <w:lang w:val="en-US"/>
+        </w:rPr>
+        <w:t>5</w:t>
+      </w:r>
+      <w:r>
+        <w:rPr>
+          <w:rFonts w:ascii="Calibri" w:hAnsi="Calibri" w:cs="Calibri"/>
+          <w:color w:val="AEAAAA" w:themeColor="background2" w:themeShade="BF"/>
+          <w:sz w:val="22"/>
+          <w:szCs w:val="22"/>
+          <w:lang w:val="en-US"/>
+        </w:rPr>
+        <w:t>},{</w:t>
+      </w:r>
+      <w:r>
+        <w:rPr>
+          <w:rFonts w:ascii="Calibri" w:hAnsi="Calibri" w:cs="Calibri"/>
+          <w:sz w:val="22"/>
+          <w:szCs w:val="22"/>
+          <w:lang w:val="en-US"/>
+        </w:rPr>
+        <w:t>I1</w:t>
+      </w:r>
+      <w:r>
+        <w:rPr>
+          <w:rFonts w:ascii="Calibri" w:hAnsi="Calibri" w:cs="Calibri"/>
+          <w:sz w:val="22"/>
+          <w:szCs w:val="22"/>
+          <w:lang w:val="en-US"/>
+        </w:rPr>
+        <w:t>,I3</w:t>
+      </w:r>
+      <w:r>
+        <w:rPr>
+          <w:rFonts w:ascii="Calibri" w:hAnsi="Calibri" w:cs="Calibri"/>
+          <w:sz w:val="22"/>
+          <w:szCs w:val="22"/>
+          <w:lang w:val="en-US"/>
+        </w:rPr>
+        <w:t>},{I1,I</w:t>
+      </w:r>
+      <w:r>
+        <w:rPr>
+          <w:rFonts w:ascii="Calibri" w:hAnsi="Calibri" w:cs="Calibri"/>
+          <w:sz w:val="22"/>
+          <w:szCs w:val="22"/>
+          <w:lang w:val="en-US"/>
+        </w:rPr>
+        <w:t>5</w:t>
+      </w:r>
+      <w:r>
+        <w:rPr>
+          <w:rFonts w:ascii="Calibri" w:hAnsi="Calibri" w:cs="Calibri"/>
+          <w:sz w:val="22"/>
+          <w:szCs w:val="22"/>
+          <w:lang w:val="en-US"/>
+        </w:rPr>
+        <w:t>},{I</w:t>
+      </w:r>
+      <w:r>
+        <w:rPr>
+          <w:rFonts w:ascii="Calibri" w:hAnsi="Calibri" w:cs="Calibri"/>
+          <w:sz w:val="22"/>
+          <w:szCs w:val="22"/>
+          <w:lang w:val="en-US"/>
+        </w:rPr>
+        <w:t>2</w:t>
+      </w:r>
+      <w:r>
+        <w:rPr>
+          <w:rFonts w:ascii="Calibri" w:hAnsi="Calibri" w:cs="Calibri"/>
+          <w:sz w:val="22"/>
+          <w:szCs w:val="22"/>
+          <w:lang w:val="en-US"/>
+        </w:rPr>
+        <w:t>,I3},{I</w:t>
+      </w:r>
+      <w:r>
+        <w:rPr>
+          <w:rFonts w:ascii="Calibri" w:hAnsi="Calibri" w:cs="Calibri"/>
+          <w:sz w:val="22"/>
+          <w:szCs w:val="22"/>
+          <w:lang w:val="en-US"/>
+        </w:rPr>
+        <w:t>2</w:t>
+      </w:r>
+      <w:r>
+        <w:rPr>
+          <w:rFonts w:ascii="Calibri" w:hAnsi="Calibri" w:cs="Calibri"/>
+          <w:sz w:val="22"/>
+          <w:szCs w:val="22"/>
+          <w:lang w:val="en-US"/>
+        </w:rPr>
+        <w:t>,I</w:t>
+      </w:r>
+      <w:r>
+        <w:rPr>
+          <w:rFonts w:ascii="Calibri" w:hAnsi="Calibri" w:cs="Calibri"/>
+          <w:sz w:val="22"/>
+          <w:szCs w:val="22"/>
+          <w:lang w:val="en-US"/>
+        </w:rPr>
+        <w:t>4</w:t>
+      </w:r>
+      <w:r>
+        <w:rPr>
+          <w:rFonts w:ascii="Calibri" w:hAnsi="Calibri" w:cs="Calibri"/>
+          <w:sz w:val="22"/>
+          <w:szCs w:val="22"/>
+          <w:lang w:val="en-US"/>
+        </w:rPr>
+        <w:t>},{I</w:t>
+      </w:r>
+      <w:r>
+        <w:rPr>
+          <w:rFonts w:ascii="Calibri" w:hAnsi="Calibri" w:cs="Calibri"/>
+          <w:sz w:val="22"/>
+          <w:szCs w:val="22"/>
+          <w:lang w:val="en-US"/>
+        </w:rPr>
+        <w:t>3</w:t>
+      </w:r>
+      <w:r>
+        <w:rPr>
+          <w:rFonts w:ascii="Calibri" w:hAnsi="Calibri" w:cs="Calibri"/>
+          <w:sz w:val="22"/>
+          <w:szCs w:val="22"/>
+          <w:lang w:val="en-US"/>
+        </w:rPr>
+        <w:t>,I</w:t>
+      </w:r>
+      <w:r>
+        <w:rPr>
+          <w:rFonts w:ascii="Calibri" w:hAnsi="Calibri" w:cs="Calibri"/>
+          <w:sz w:val="22"/>
+          <w:szCs w:val="22"/>
+          <w:lang w:val="en-US"/>
+        </w:rPr>
+        <w:t>4</w:t>
+      </w:r>
+      <w:r>
+        <w:rPr>
+          <w:rFonts w:ascii="Calibri" w:hAnsi="Calibri" w:cs="Calibri"/>
+          <w:sz w:val="22"/>
+          <w:szCs w:val="22"/>
+          <w:lang w:val="en-US"/>
+        </w:rPr>
+        <w:t>},{I</w:t>
+      </w:r>
+      <w:r>
+        <w:rPr>
+          <w:rFonts w:ascii="Calibri" w:hAnsi="Calibri" w:cs="Calibri"/>
+          <w:sz w:val="22"/>
+          <w:szCs w:val="22"/>
+          <w:lang w:val="en-US"/>
+        </w:rPr>
+        <w:t>3</w:t>
+      </w:r>
+      <w:r>
+        <w:rPr>
+          <w:rFonts w:ascii="Calibri" w:hAnsi="Calibri" w:cs="Calibri"/>
+          <w:sz w:val="22"/>
+          <w:szCs w:val="22"/>
+          <w:lang w:val="en-US"/>
+        </w:rPr>
+        <w:t>,I</w:t>
+      </w:r>
+      <w:r>
+        <w:rPr>
+          <w:rFonts w:ascii="Calibri" w:hAnsi="Calibri" w:cs="Calibri"/>
+          <w:sz w:val="22"/>
+          <w:szCs w:val="22"/>
+          <w:lang w:val="en-US"/>
+        </w:rPr>
+        <w:t>5</w:t>
+      </w:r>
+      <w:r>
+        <w:rPr>
+          <w:rFonts w:ascii="Calibri" w:hAnsi="Calibri" w:cs="Calibri"/>
+          <w:sz w:val="22"/>
+          <w:szCs w:val="22"/>
+          <w:lang w:val="en-US"/>
+        </w:rPr>
+        <w:t>},{I</w:t>
+      </w:r>
+      <w:r>
+        <w:rPr>
+          <w:rFonts w:ascii="Calibri" w:hAnsi="Calibri" w:cs="Calibri"/>
+          <w:sz w:val="22"/>
+          <w:szCs w:val="22"/>
+          <w:lang w:val="en-US"/>
+        </w:rPr>
+        <w:t>4</w:t>
+      </w:r>
+      <w:r>
+        <w:rPr>
+          <w:rFonts w:ascii="Calibri" w:hAnsi="Calibri" w:cs="Calibri"/>
+          <w:sz w:val="22"/>
+          <w:szCs w:val="22"/>
+          <w:lang w:val="en-US"/>
+        </w:rPr>
+        <w:t>,I</w:t>
+      </w:r>
+      <w:r>
+        <w:rPr>
+          <w:rFonts w:ascii="Calibri" w:hAnsi="Calibri" w:cs="Calibri"/>
+          <w:sz w:val="22"/>
+          <w:szCs w:val="22"/>
+          <w:lang w:val="en-US"/>
+        </w:rPr>
+        <w:t>5</w:t>
+      </w:r>
+      <w:r>
+        <w:rPr>
+          <w:rFonts w:ascii="Calibri" w:hAnsi="Calibri" w:cs="Calibri"/>
+          <w:sz w:val="22"/>
+          <w:szCs w:val="22"/>
+          <w:lang w:val="en-US"/>
+        </w:rPr>
+        <w:t>},</w:t>
+      </w:r>
+      <w:r>
+        <w:rPr>
+          <w:rFonts w:ascii="Calibri" w:hAnsi="Calibri" w:cs="Calibri"/>
+          <w:sz w:val="22"/>
+          <w:szCs w:val="22"/>
+          <w:lang w:val="en-US"/>
+        </w:rPr>
+        <w:t>{I2,I3,I4},{I3,I4,I5}}</w:t>
+      </w:r>
+    </w:p>
+    <w:p>
+      <w:pPr>
+        <w:pStyle w:val="NormalWeb"/>
+        <w:spacing w:before="0" w:beforeAutospacing="0" w:after="0" w:afterAutospacing="0"/>
+        <w:rPr>
+          <w:rFonts w:ascii="Calibri" w:hAnsi="Calibri" w:cs="Calibri"/>
+          <w:color w:val="70AD47" w:themeColor="accent6"/>
+          <w:sz w:val="22"/>
+          <w:szCs w:val="22"/>
+          <w:lang w:val="en-US"/>
+        </w:rPr>
+      </w:pPr>
+      <w:r>
+        <w:rPr>
+          <w:rFonts w:ascii="Calibri" w:hAnsi="Calibri" w:cs="Calibri"/>
+          <w:color w:val="70AD47" w:themeColor="accent6"/>
+          <w:sz w:val="22"/>
+          <w:szCs w:val="22"/>
+          <w:lang w:val="en-US"/>
+        </w:rPr>
+        <w:t>I1 -&gt; I3: confidence = 2/3 = 0.67</w:t>
+      </w:r>
+    </w:p>
+    <w:p>
+      <w:pPr>
+        <w:pStyle w:val="NormalWeb"/>
+        <w:spacing w:before="0" w:beforeAutospacing="0" w:after="0" w:afterAutospacing="0"/>
+        <w:rPr>
+          <w:rFonts w:ascii="Calibri" w:hAnsi="Calibri" w:cs="Calibri"/>
+          <w:sz w:val="22"/>
+          <w:szCs w:val="22"/>
+          <w:lang w:val="en-US"/>
+        </w:rPr>
+      </w:pPr>
+      <w:r>
+        <w:rPr>
+          <w:rFonts w:ascii="Calibri" w:hAnsi="Calibri" w:cs="Calibri"/>
+          <w:sz w:val="22"/>
+          <w:szCs w:val="22"/>
+          <w:lang w:val="en-US"/>
+        </w:rPr>
+        <w:t>I</w:t>
+      </w:r>
+      <w:r>
+        <w:rPr>
+          <w:rFonts w:ascii="Calibri" w:hAnsi="Calibri" w:cs="Calibri"/>
+          <w:sz w:val="22"/>
+          <w:szCs w:val="22"/>
+          <w:lang w:val="en-US"/>
+        </w:rPr>
+        <w:t>3</w:t>
+      </w:r>
+      <w:r>
+        <w:rPr>
+          <w:rFonts w:ascii="Calibri" w:hAnsi="Calibri" w:cs="Calibri"/>
+          <w:sz w:val="22"/>
+          <w:szCs w:val="22"/>
+          <w:lang w:val="en-US"/>
+        </w:rPr>
+        <w:t xml:space="preserve"> -&gt; I</w:t>
+      </w:r>
+      <w:r>
+        <w:rPr>
+          <w:rFonts w:ascii="Calibri" w:hAnsi="Calibri" w:cs="Calibri"/>
+          <w:sz w:val="22"/>
+          <w:szCs w:val="22"/>
+          <w:lang w:val="en-US"/>
+        </w:rPr>
+        <w:t>1</w:t>
+      </w:r>
+      <w:r>
+        <w:rPr>
+          <w:rFonts w:ascii="Calibri" w:hAnsi="Calibri" w:cs="Calibri"/>
+          <w:sz w:val="22"/>
+          <w:szCs w:val="22"/>
+          <w:lang w:val="en-US"/>
+        </w:rPr>
+        <w:t>: confidence = 2/</w:t>
+      </w:r>
+      <w:r>
+        <w:rPr>
+          <w:rFonts w:ascii="Calibri" w:hAnsi="Calibri" w:cs="Calibri"/>
+          <w:sz w:val="22"/>
+          <w:szCs w:val="22"/>
+          <w:lang w:val="en-US"/>
+        </w:rPr>
+        <w:t>5</w:t>
+      </w:r>
+      <w:r>
+        <w:rPr>
+          <w:rFonts w:ascii="Calibri" w:hAnsi="Calibri" w:cs="Calibri"/>
+          <w:sz w:val="22"/>
+          <w:szCs w:val="22"/>
+          <w:lang w:val="en-US"/>
+        </w:rPr>
+        <w:t xml:space="preserve"> = 0.</w:t>
+      </w:r>
+      <w:r>
+        <w:rPr>
+          <w:rFonts w:ascii="Calibri" w:hAnsi="Calibri" w:cs="Calibri"/>
+          <w:sz w:val="22"/>
+          <w:szCs w:val="22"/>
+          <w:lang w:val="en-US"/>
+        </w:rPr>
+        <w:t>4</w:t>
+      </w:r>
+    </w:p>
+    <w:p>
+      <w:pPr>
+        <w:pStyle w:val="NormalWeb"/>
+        <w:spacing w:before="0" w:beforeAutospacing="0" w:after="0" w:afterAutospacing="0"/>
+        <w:rPr>
+          <w:rFonts w:ascii="Calibri" w:hAnsi="Calibri" w:cs="Calibri"/>
+          <w:color w:val="70AD47" w:themeColor="accent6"/>
+          <w:sz w:val="22"/>
+          <w:szCs w:val="22"/>
+          <w:lang w:val="en-US"/>
+        </w:rPr>
+      </w:pPr>
+      <w:r>
+        <w:rPr>
+          <w:rFonts w:ascii="Calibri" w:hAnsi="Calibri" w:cs="Calibri"/>
+          <w:color w:val="70AD47" w:themeColor="accent6"/>
+          <w:sz w:val="22"/>
+          <w:szCs w:val="22"/>
+          <w:lang w:val="en-US"/>
+        </w:rPr>
+        <w:t>I</w:t>
+      </w:r>
+      <w:r>
+        <w:rPr>
+          <w:rFonts w:ascii="Calibri" w:hAnsi="Calibri" w:cs="Calibri"/>
+          <w:color w:val="70AD47" w:themeColor="accent6"/>
+          <w:sz w:val="22"/>
+          <w:szCs w:val="22"/>
+          <w:lang w:val="en-US"/>
+        </w:rPr>
+        <w:t>1</w:t>
+      </w:r>
+      <w:r>
+        <w:rPr>
+          <w:rFonts w:ascii="Calibri" w:hAnsi="Calibri" w:cs="Calibri"/>
+          <w:color w:val="70AD47" w:themeColor="accent6"/>
+          <w:sz w:val="22"/>
+          <w:szCs w:val="22"/>
+          <w:lang w:val="en-US"/>
+        </w:rPr>
+        <w:t xml:space="preserve"> -&gt; I</w:t>
+      </w:r>
+      <w:r>
+        <w:rPr>
+          <w:rFonts w:ascii="Calibri" w:hAnsi="Calibri" w:cs="Calibri"/>
+          <w:color w:val="70AD47" w:themeColor="accent6"/>
+          <w:sz w:val="22"/>
+          <w:szCs w:val="22"/>
+          <w:lang w:val="en-US"/>
+        </w:rPr>
+        <w:t>5</w:t>
+      </w:r>
+      <w:r>
+        <w:rPr>
+          <w:rFonts w:ascii="Calibri" w:hAnsi="Calibri" w:cs="Calibri"/>
+          <w:color w:val="70AD47" w:themeColor="accent6"/>
+          <w:sz w:val="22"/>
+          <w:szCs w:val="22"/>
+          <w:lang w:val="en-US"/>
+        </w:rPr>
+        <w:t>: confidence = 2/</w:t>
+      </w:r>
+      <w:r>
+        <w:rPr>
+          <w:rFonts w:ascii="Calibri" w:hAnsi="Calibri" w:cs="Calibri"/>
+          <w:color w:val="70AD47" w:themeColor="accent6"/>
+          <w:sz w:val="22"/>
+          <w:szCs w:val="22"/>
+          <w:lang w:val="en-US"/>
+        </w:rPr>
+        <w:t>3</w:t>
+      </w:r>
+      <w:r>
+        <w:rPr>
+          <w:rFonts w:ascii="Calibri" w:hAnsi="Calibri" w:cs="Calibri"/>
+          <w:color w:val="70AD47" w:themeColor="accent6"/>
+          <w:sz w:val="22"/>
+          <w:szCs w:val="22"/>
+          <w:lang w:val="en-US"/>
+        </w:rPr>
+        <w:t xml:space="preserve"> = 0.</w:t>
+      </w:r>
+      <w:r>
+        <w:rPr>
+          <w:rFonts w:ascii="Calibri" w:hAnsi="Calibri" w:cs="Calibri"/>
+          <w:color w:val="70AD47" w:themeColor="accent6"/>
+          <w:sz w:val="22"/>
+          <w:szCs w:val="22"/>
+          <w:lang w:val="en-US"/>
+        </w:rPr>
+        <w:t>67</w:t>
+      </w:r>
+    </w:p>
+    <w:p>
+      <w:pPr>
+        <w:pStyle w:val="NormalWeb"/>
+        <w:spacing w:before="0" w:beforeAutospacing="0" w:after="0" w:afterAutospacing="0"/>
+        <w:rPr>
+          <w:rFonts w:ascii="Calibri" w:hAnsi="Calibri" w:cs="Calibri"/>
+          <w:sz w:val="22"/>
+          <w:szCs w:val="22"/>
+          <w:lang w:val="en-US"/>
+        </w:rPr>
+      </w:pPr>
+      <w:r>
+        <w:rPr>
+          <w:rFonts w:ascii="Calibri" w:hAnsi="Calibri" w:cs="Calibri"/>
+          <w:sz w:val="22"/>
+          <w:szCs w:val="22"/>
+          <w:lang w:val="en-US"/>
+        </w:rPr>
+        <w:t>I</w:t>
+      </w:r>
+      <w:r>
+        <w:rPr>
+          <w:rFonts w:ascii="Calibri" w:hAnsi="Calibri" w:cs="Calibri"/>
+          <w:sz w:val="22"/>
+          <w:szCs w:val="22"/>
+          <w:lang w:val="en-US"/>
+        </w:rPr>
+        <w:t>5</w:t>
+      </w:r>
+      <w:r>
+        <w:rPr>
+          <w:rFonts w:ascii="Calibri" w:hAnsi="Calibri" w:cs="Calibri"/>
+          <w:sz w:val="22"/>
+          <w:szCs w:val="22"/>
+          <w:lang w:val="en-US"/>
+        </w:rPr>
+        <w:t xml:space="preserve"> -&gt; I1: confidence = 2/</w:t>
+      </w:r>
+      <w:r>
+        <w:rPr>
+          <w:rFonts w:ascii="Calibri" w:hAnsi="Calibri" w:cs="Calibri"/>
+          <w:sz w:val="22"/>
+          <w:szCs w:val="22"/>
+          <w:lang w:val="en-US"/>
+        </w:rPr>
+        <w:t>4</w:t>
+      </w:r>
+      <w:r>
+        <w:rPr>
+          <w:rFonts w:ascii="Calibri" w:hAnsi="Calibri" w:cs="Calibri"/>
+          <w:sz w:val="22"/>
+          <w:szCs w:val="22"/>
+          <w:lang w:val="en-US"/>
+        </w:rPr>
+        <w:t xml:space="preserve"> = 0.</w:t>
+      </w:r>
+      <w:r>
+        <w:rPr>
+          <w:rFonts w:ascii="Calibri" w:hAnsi="Calibri" w:cs="Calibri"/>
+          <w:sz w:val="22"/>
+          <w:szCs w:val="22"/>
+          <w:lang w:val="en-US"/>
+        </w:rPr>
+        <w:t>5</w:t>
+      </w:r>
+    </w:p>
+    <w:p>
+      <w:pPr>
+        <w:pStyle w:val="NormalWeb"/>
+        <w:spacing w:before="0" w:beforeAutospacing="0" w:after="0" w:afterAutospacing="0"/>
+        <w:rPr>
+          <w:rFonts w:ascii="Calibri" w:hAnsi="Calibri" w:cs="Calibri"/>
+          <w:color w:val="70AD47" w:themeColor="accent6"/>
+          <w:sz w:val="22"/>
+          <w:szCs w:val="22"/>
+          <w:lang w:val="en-US"/>
+        </w:rPr>
+      </w:pPr>
+      <w:r>
+        <w:rPr>
+          <w:rFonts w:ascii="Calibri" w:hAnsi="Calibri" w:cs="Calibri"/>
+          <w:color w:val="70AD47" w:themeColor="accent6"/>
+          <w:sz w:val="22"/>
+          <w:szCs w:val="22"/>
+          <w:lang w:val="en-US"/>
+        </w:rPr>
+        <w:t>I</w:t>
+      </w:r>
+      <w:r>
+        <w:rPr>
+          <w:rFonts w:ascii="Calibri" w:hAnsi="Calibri" w:cs="Calibri"/>
+          <w:color w:val="70AD47" w:themeColor="accent6"/>
+          <w:sz w:val="22"/>
+          <w:szCs w:val="22"/>
+          <w:lang w:val="en-US"/>
+        </w:rPr>
+        <w:t>2</w:t>
+      </w:r>
+      <w:r>
+        <w:rPr>
+          <w:rFonts w:ascii="Calibri" w:hAnsi="Calibri" w:cs="Calibri"/>
+          <w:color w:val="70AD47" w:themeColor="accent6"/>
+          <w:sz w:val="22"/>
+          <w:szCs w:val="22"/>
+          <w:lang w:val="en-US"/>
+        </w:rPr>
+        <w:t xml:space="preserve"> -&gt; I</w:t>
+      </w:r>
+      <w:r>
+        <w:rPr>
+          <w:rFonts w:ascii="Calibri" w:hAnsi="Calibri" w:cs="Calibri"/>
+          <w:color w:val="70AD47" w:themeColor="accent6"/>
+          <w:sz w:val="22"/>
+          <w:szCs w:val="22"/>
+          <w:lang w:val="en-US"/>
+        </w:rPr>
+        <w:t>3</w:t>
+      </w:r>
+      <w:r>
+        <w:rPr>
+          <w:rFonts w:ascii="Calibri" w:hAnsi="Calibri" w:cs="Calibri"/>
+          <w:color w:val="70AD47" w:themeColor="accent6"/>
+          <w:sz w:val="22"/>
+          <w:szCs w:val="22"/>
+          <w:lang w:val="en-US"/>
+        </w:rPr>
+        <w:t xml:space="preserve">: confidence = </w:t>
+      </w:r>
+      <w:r>
+        <w:rPr>
+          <w:rFonts w:ascii="Calibri" w:hAnsi="Calibri" w:cs="Calibri"/>
+          <w:color w:val="70AD47" w:themeColor="accent6"/>
+          <w:sz w:val="22"/>
+          <w:szCs w:val="22"/>
+          <w:lang w:val="en-US"/>
+        </w:rPr>
+        <w:t>3</w:t>
+      </w:r>
+      <w:r>
+        <w:rPr>
+          <w:rFonts w:ascii="Calibri" w:hAnsi="Calibri" w:cs="Calibri"/>
+          <w:color w:val="70AD47" w:themeColor="accent6"/>
+          <w:sz w:val="22"/>
+          <w:szCs w:val="22"/>
+          <w:lang w:val="en-US"/>
+        </w:rPr>
+        <w:t>/</w:t>
+      </w:r>
+      <w:r>
+        <w:rPr>
+          <w:rFonts w:ascii="Calibri" w:hAnsi="Calibri" w:cs="Calibri"/>
+          <w:color w:val="70AD47" w:themeColor="accent6"/>
+          <w:sz w:val="22"/>
+          <w:szCs w:val="22"/>
+          <w:lang w:val="en-US"/>
+        </w:rPr>
+        <w:t>4</w:t>
+      </w:r>
+      <w:r>
+        <w:rPr>
+          <w:rFonts w:ascii="Calibri" w:hAnsi="Calibri" w:cs="Calibri"/>
+          <w:color w:val="70AD47" w:themeColor="accent6"/>
+          <w:sz w:val="22"/>
+          <w:szCs w:val="22"/>
+          <w:lang w:val="en-US"/>
+        </w:rPr>
+        <w:t xml:space="preserve"> = 0.</w:t>
+      </w:r>
+      <w:r>
+        <w:rPr>
+          <w:rFonts w:ascii="Calibri" w:hAnsi="Calibri" w:cs="Calibri"/>
+          <w:color w:val="70AD47" w:themeColor="accent6"/>
+          <w:sz w:val="22"/>
+          <w:szCs w:val="22"/>
+          <w:lang w:val="en-US"/>
+        </w:rPr>
+        <w:t>75</w:t>
+      </w:r>
+    </w:p>
+    <w:p>
+      <w:pPr>
+        <w:pStyle w:val="NormalWeb"/>
+        <w:spacing w:before="0" w:beforeAutospacing="0" w:after="0" w:afterAutospacing="0"/>
+        <w:rPr>
+          <w:rFonts w:ascii="Calibri" w:hAnsi="Calibri" w:cs="Calibri"/>
+          <w:color w:val="70AD47" w:themeColor="accent6"/>
+          <w:sz w:val="22"/>
+          <w:szCs w:val="22"/>
+          <w:lang w:val="en-US"/>
+        </w:rPr>
+      </w:pPr>
+      <w:r>
+        <w:rPr>
+          <w:rFonts w:ascii="Calibri" w:hAnsi="Calibri" w:cs="Calibri"/>
+          <w:color w:val="70AD47" w:themeColor="accent6"/>
+          <w:sz w:val="22"/>
+          <w:szCs w:val="22"/>
+          <w:lang w:val="en-US"/>
+        </w:rPr>
+        <w:t>I3 -&gt; I</w:t>
+      </w:r>
+      <w:r>
+        <w:rPr>
+          <w:rFonts w:ascii="Calibri" w:hAnsi="Calibri" w:cs="Calibri"/>
+          <w:color w:val="70AD47" w:themeColor="accent6"/>
+          <w:sz w:val="22"/>
+          <w:szCs w:val="22"/>
+          <w:lang w:val="en-US"/>
+        </w:rPr>
+        <w:t>2</w:t>
+      </w:r>
+      <w:r>
+        <w:rPr>
+          <w:rFonts w:ascii="Calibri" w:hAnsi="Calibri" w:cs="Calibri"/>
+          <w:color w:val="70AD47" w:themeColor="accent6"/>
+          <w:sz w:val="22"/>
+          <w:szCs w:val="22"/>
+          <w:lang w:val="en-US"/>
+        </w:rPr>
+        <w:t xml:space="preserve">: confidence = </w:t>
+      </w:r>
+      <w:r>
+        <w:rPr>
+          <w:rFonts w:ascii="Calibri" w:hAnsi="Calibri" w:cs="Calibri"/>
+          <w:color w:val="70AD47" w:themeColor="accent6"/>
+          <w:sz w:val="22"/>
+          <w:szCs w:val="22"/>
+          <w:lang w:val="en-US"/>
+        </w:rPr>
+        <w:t>3</w:t>
+      </w:r>
+      <w:r>
+        <w:rPr>
+          <w:rFonts w:ascii="Calibri" w:hAnsi="Calibri" w:cs="Calibri"/>
+          <w:color w:val="70AD47" w:themeColor="accent6"/>
+          <w:sz w:val="22"/>
+          <w:szCs w:val="22"/>
+          <w:lang w:val="en-US"/>
+        </w:rPr>
+        <w:t>/5 = 0.</w:t>
+      </w:r>
+      <w:r>
+        <w:rPr>
+          <w:rFonts w:ascii="Calibri" w:hAnsi="Calibri" w:cs="Calibri"/>
+          <w:color w:val="70AD47" w:themeColor="accent6"/>
+          <w:sz w:val="22"/>
+          <w:szCs w:val="22"/>
+          <w:lang w:val="en-US"/>
+        </w:rPr>
+        <w:t>6</w:t>
+      </w:r>
+    </w:p>
+    <w:p>
+      <w:pPr>
+        <w:pStyle w:val="NormalWeb"/>
+        <w:spacing w:before="0" w:beforeAutospacing="0" w:after="0" w:afterAutospacing="0"/>
+        <w:rPr>
+          <w:rFonts w:ascii="Calibri" w:hAnsi="Calibri" w:cs="Calibri"/>
+          <w:color w:val="70AD47" w:themeColor="accent6"/>
+          <w:sz w:val="22"/>
+          <w:szCs w:val="22"/>
+          <w:lang w:val="en-US"/>
+        </w:rPr>
+      </w:pPr>
+      <w:r>
+        <w:rPr>
+          <w:rFonts w:ascii="Calibri" w:hAnsi="Calibri" w:cs="Calibri"/>
+          <w:color w:val="70AD47" w:themeColor="accent6"/>
+          <w:sz w:val="22"/>
+          <w:szCs w:val="22"/>
+          <w:lang w:val="en-US"/>
+        </w:rPr>
+        <w:t>I</w:t>
+      </w:r>
+      <w:r>
+        <w:rPr>
+          <w:rFonts w:ascii="Calibri" w:hAnsi="Calibri" w:cs="Calibri"/>
+          <w:color w:val="70AD47" w:themeColor="accent6"/>
+          <w:sz w:val="22"/>
+          <w:szCs w:val="22"/>
+          <w:lang w:val="en-US"/>
+        </w:rPr>
+        <w:t>2</w:t>
+      </w:r>
+      <w:r>
+        <w:rPr>
+          <w:rFonts w:ascii="Calibri" w:hAnsi="Calibri" w:cs="Calibri"/>
+          <w:color w:val="70AD47" w:themeColor="accent6"/>
+          <w:sz w:val="22"/>
+          <w:szCs w:val="22"/>
+          <w:lang w:val="en-US"/>
+        </w:rPr>
+        <w:t xml:space="preserve"> -&gt; I</w:t>
+      </w:r>
+      <w:r>
+        <w:rPr>
+          <w:rFonts w:ascii="Calibri" w:hAnsi="Calibri" w:cs="Calibri"/>
+          <w:color w:val="70AD47" w:themeColor="accent6"/>
+          <w:sz w:val="22"/>
+          <w:szCs w:val="22"/>
+          <w:lang w:val="en-US"/>
+        </w:rPr>
+        <w:t>4</w:t>
+      </w:r>
+      <w:r>
+        <w:rPr>
+          <w:rFonts w:ascii="Calibri" w:hAnsi="Calibri" w:cs="Calibri"/>
+          <w:color w:val="70AD47" w:themeColor="accent6"/>
+          <w:sz w:val="22"/>
+          <w:szCs w:val="22"/>
+          <w:lang w:val="en-US"/>
+        </w:rPr>
+        <w:t xml:space="preserve">: confidence = </w:t>
+      </w:r>
+      <w:r>
+        <w:rPr>
+          <w:rFonts w:ascii="Calibri" w:hAnsi="Calibri" w:cs="Calibri"/>
+          <w:color w:val="70AD47" w:themeColor="accent6"/>
+          <w:sz w:val="22"/>
+          <w:szCs w:val="22"/>
+          <w:lang w:val="en-US"/>
+        </w:rPr>
+        <w:t>4</w:t>
+      </w:r>
+      <w:r>
+        <w:rPr>
+          <w:rFonts w:ascii="Calibri" w:hAnsi="Calibri" w:cs="Calibri"/>
+          <w:color w:val="70AD47" w:themeColor="accent6"/>
+          <w:sz w:val="22"/>
+          <w:szCs w:val="22"/>
+          <w:lang w:val="en-US"/>
+        </w:rPr>
+        <w:t>/</w:t>
+      </w:r>
+      <w:r>
+        <w:rPr>
+          <w:rFonts w:ascii="Calibri" w:hAnsi="Calibri" w:cs="Calibri"/>
+          <w:color w:val="70AD47" w:themeColor="accent6"/>
+          <w:sz w:val="22"/>
+          <w:szCs w:val="22"/>
+          <w:lang w:val="en-US"/>
+        </w:rPr>
+        <w:t>4</w:t>
+      </w:r>
+      <w:r>
+        <w:rPr>
+          <w:rFonts w:ascii="Calibri" w:hAnsi="Calibri" w:cs="Calibri"/>
+          <w:color w:val="70AD47" w:themeColor="accent6"/>
+          <w:sz w:val="22"/>
+          <w:szCs w:val="22"/>
+          <w:lang w:val="en-US"/>
+        </w:rPr>
+        <w:t xml:space="preserve"> = </w:t>
+      </w:r>
+      <w:r>
+        <w:rPr>
+          <w:rFonts w:ascii="Calibri" w:hAnsi="Calibri" w:cs="Calibri"/>
+          <w:color w:val="70AD47" w:themeColor="accent6"/>
+          <w:sz w:val="22"/>
+          <w:szCs w:val="22"/>
+          <w:lang w:val="en-US"/>
+        </w:rPr>
+        <w:t>1</w:t>
+      </w:r>
+    </w:p>
+    <w:p>
+      <w:pPr>
+        <w:pStyle w:val="NormalWeb"/>
+        <w:spacing w:before="0" w:beforeAutospacing="0" w:after="0" w:afterAutospacing="0"/>
+        <w:rPr>
+          <w:rFonts w:ascii="Calibri" w:hAnsi="Calibri" w:cs="Calibri"/>
+          <w:color w:val="70AD47" w:themeColor="accent6"/>
+          <w:sz w:val="22"/>
+          <w:szCs w:val="22"/>
+          <w:lang w:val="en-US"/>
+        </w:rPr>
+      </w:pPr>
+      <w:r>
+        <w:rPr>
+          <w:rFonts w:ascii="Calibri" w:hAnsi="Calibri" w:cs="Calibri"/>
+          <w:color w:val="70AD47" w:themeColor="accent6"/>
+          <w:sz w:val="22"/>
+          <w:szCs w:val="22"/>
+          <w:lang w:val="en-US"/>
+        </w:rPr>
+        <w:t>I</w:t>
+      </w:r>
+      <w:r>
+        <w:rPr>
+          <w:rFonts w:ascii="Calibri" w:hAnsi="Calibri" w:cs="Calibri"/>
+          <w:color w:val="70AD47" w:themeColor="accent6"/>
+          <w:sz w:val="22"/>
+          <w:szCs w:val="22"/>
+          <w:lang w:val="en-US"/>
+        </w:rPr>
+        <w:t>4</w:t>
+      </w:r>
+      <w:r>
+        <w:rPr>
+          <w:rFonts w:ascii="Calibri" w:hAnsi="Calibri" w:cs="Calibri"/>
+          <w:color w:val="70AD47" w:themeColor="accent6"/>
+          <w:sz w:val="22"/>
+          <w:szCs w:val="22"/>
+          <w:lang w:val="en-US"/>
+        </w:rPr>
+        <w:t xml:space="preserve"> -&gt; I</w:t>
+      </w:r>
+      <w:r>
+        <w:rPr>
+          <w:rFonts w:ascii="Calibri" w:hAnsi="Calibri" w:cs="Calibri"/>
+          <w:color w:val="70AD47" w:themeColor="accent6"/>
+          <w:sz w:val="22"/>
+          <w:szCs w:val="22"/>
+          <w:lang w:val="en-US"/>
+        </w:rPr>
+        <w:t>2</w:t>
+      </w:r>
+      <w:r>
+        <w:rPr>
+          <w:rFonts w:ascii="Calibri" w:hAnsi="Calibri" w:cs="Calibri"/>
+          <w:color w:val="70AD47" w:themeColor="accent6"/>
+          <w:sz w:val="22"/>
+          <w:szCs w:val="22"/>
+          <w:lang w:val="en-US"/>
+        </w:rPr>
+        <w:t xml:space="preserve">: confidence = </w:t>
+      </w:r>
+      <w:r>
+        <w:rPr>
+          <w:rFonts w:ascii="Calibri" w:hAnsi="Calibri" w:cs="Calibri"/>
+          <w:color w:val="70AD47" w:themeColor="accent6"/>
+          <w:sz w:val="22"/>
+          <w:szCs w:val="22"/>
+          <w:lang w:val="en-US"/>
+        </w:rPr>
+        <w:t>4</w:t>
+      </w:r>
+      <w:r>
+        <w:rPr>
+          <w:rFonts w:ascii="Calibri" w:hAnsi="Calibri" w:cs="Calibri"/>
+          <w:color w:val="70AD47" w:themeColor="accent6"/>
+          <w:sz w:val="22"/>
+          <w:szCs w:val="22"/>
+          <w:lang w:val="en-US"/>
+        </w:rPr>
+        <w:t>/</w:t>
+      </w:r>
+      <w:r>
+        <w:rPr>
+          <w:rFonts w:ascii="Calibri" w:hAnsi="Calibri" w:cs="Calibri"/>
+          <w:color w:val="70AD47" w:themeColor="accent6"/>
+          <w:sz w:val="22"/>
+          <w:szCs w:val="22"/>
+          <w:lang w:val="en-US"/>
+        </w:rPr>
+        <w:t>5</w:t>
+      </w:r>
+      <w:r>
+        <w:rPr>
+          <w:rFonts w:ascii="Calibri" w:hAnsi="Calibri" w:cs="Calibri"/>
+          <w:color w:val="70AD47" w:themeColor="accent6"/>
+          <w:sz w:val="22"/>
+          <w:szCs w:val="22"/>
+          <w:lang w:val="en-US"/>
+        </w:rPr>
+        <w:t xml:space="preserve"> = 0.</w:t>
+      </w:r>
+      <w:r>
+        <w:rPr>
+          <w:rFonts w:ascii="Calibri" w:hAnsi="Calibri" w:cs="Calibri"/>
+          <w:color w:val="70AD47" w:themeColor="accent6"/>
+          <w:sz w:val="22"/>
+          <w:szCs w:val="22"/>
+          <w:lang w:val="en-US"/>
+        </w:rPr>
+        <w:t>8</w:t>
+      </w:r>
+    </w:p>
+    <w:p>
+      <w:pPr>
+        <w:pStyle w:val="NormalWeb"/>
+        <w:spacing w:before="0" w:beforeAutospacing="0" w:after="0" w:afterAutospacing="0"/>
+        <w:rPr>
+          <w:rFonts w:ascii="Calibri" w:hAnsi="Calibri" w:cs="Calibri"/>
+          <w:color w:val="70AD47" w:themeColor="accent6"/>
+          <w:sz w:val="22"/>
+          <w:szCs w:val="22"/>
+          <w:lang w:val="en-US"/>
+        </w:rPr>
+      </w:pPr>
+    </w:p>
     <w:p>
       <w:pPr>
         <w:pStyle w:val="NormalWeb"/>

</xml_diff>

<commit_message>
hw3 q3 frequent items
</commit_message>
<xml_diff>
--- a/data_mining/839/hw3.docx
+++ b/data_mining/839/hw3.docx
@@ -3901,7 +3901,7 @@
                 </mc:Choice>
                 <mc:Fallback>
                   <w:pict>
-                    <v:oval w14:anchorId="6B76EB5A" id="Oval 7" o:spid="_x0000_s1026" style="position:absolute;margin-left:23.05pt;margin-top:13.3pt;width:25.5pt;height:16pt;z-index:251723776;visibility:visible;mso-wrap-style:square;mso-width-percent:0;mso-height-percent:0;mso-wrap-distance-left:9pt;mso-wrap-distance-top:0;mso-wrap-distance-right:9pt;mso-wrap-distance-bottom:0;mso-position-horizontal:absolute;mso-position-horizontal-relative:text;mso-position-vertical:absolute;mso-position-vertical-relative:text;mso-width-percent:0;mso-height-percent:0;mso-width-relative:margin;mso-height-relative:margin;v-text-anchor:middle" o:gfxdata="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" filled="f" strokecolor="red" strokeweight="1pt">
+                    <v:oval w14:anchorId="1B96EFD7" id="Oval 7" o:spid="_x0000_s1026" style="position:absolute;margin-left:23.05pt;margin-top:13.3pt;width:25.5pt;height:16pt;z-index:251723776;visibility:visible;mso-wrap-style:square;mso-width-percent:0;mso-height-percent:0;mso-wrap-distance-left:9pt;mso-wrap-distance-top:0;mso-wrap-distance-right:9pt;mso-wrap-distance-bottom:0;mso-position-horizontal:absolute;mso-position-horizontal-relative:text;mso-position-vertical:absolute;mso-position-vertical-relative:text;mso-width-percent:0;mso-height-percent:0;mso-width-relative:margin;mso-height-relative:margin;v-text-anchor:middle" o:gfxdata="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" filled="f" strokecolor="red" strokeweight="1pt">
                       <v:stroke joinstyle="miter"/>
                     </v:oval>
                   </w:pict>
@@ -4181,7 +4181,7 @@
                 </mc:Choice>
                 <mc:Fallback>
                   <w:pict>
-                    <v:oval w14:anchorId="4BD95C9C" id="Oval 2" o:spid="_x0000_s1026" style="position:absolute;margin-left:-4.65pt;margin-top:-.2pt;width:25.5pt;height:16pt;z-index:251734016;visibility:visible;mso-wrap-style:square;mso-width-percent:0;mso-wrap-distance-left:9pt;mso-wrap-distance-top:0;mso-wrap-distance-right:9pt;mso-wrap-distance-bottom:0;mso-position-horizontal:absolute;mso-position-horizontal-relative:text;mso-position-vertical:absolute;mso-position-vertical-relative:text;mso-width-percent:0;mso-width-relative:margin;v-text-anchor:middle" o:gfxdata="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" filled="f" strokecolor="red" strokeweight="1pt">
+                    <v:oval w14:anchorId="0094B194" id="Oval 2" o:spid="_x0000_s1026" style="position:absolute;margin-left:-4.65pt;margin-top:-.2pt;width:25.5pt;height:16pt;z-index:251734016;visibility:visible;mso-wrap-style:square;mso-width-percent:0;mso-wrap-distance-left:9pt;mso-wrap-distance-top:0;mso-wrap-distance-right:9pt;mso-wrap-distance-bottom:0;mso-position-horizontal:absolute;mso-position-horizontal-relative:text;mso-position-vertical:absolute;mso-position-vertical-relative:text;mso-width-percent:0;mso-width-relative:margin;v-text-anchor:middle" o:gfxdata="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" filled="f" strokecolor="red" strokeweight="1pt">
                       <v:stroke joinstyle="miter"/>
                     </v:oval>
                   </w:pict>
@@ -4335,7 +4335,7 @@
                 </mc:Choice>
                 <mc:Fallback>
                   <w:pict>
-                    <v:oval w14:anchorId="6208308C" id="Oval 4" o:spid="_x0000_s1026" style="position:absolute;margin-left:28.9pt;margin-top:13.4pt;width:25.5pt;height:16pt;z-index:251737088;visibility:visible;mso-wrap-style:square;mso-width-percent:0;mso-height-percent:0;mso-wrap-distance-left:9pt;mso-wrap-distance-top:0;mso-wrap-distance-right:9pt;mso-wrap-distance-bottom:0;mso-position-horizontal:absolute;mso-position-horizontal-relative:text;mso-position-vertical:absolute;mso-position-vertical-relative:text;mso-width-percent:0;mso-height-percent:0;mso-width-relative:margin;mso-height-relative:margin;v-text-anchor:middle" o:gfxdata="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" filled="f" strokecolor="red" strokeweight="1pt">
+                    <v:oval w14:anchorId="037ECF48" id="Oval 4" o:spid="_x0000_s1026" style="position:absolute;margin-left:28.9pt;margin-top:13.4pt;width:25.5pt;height:16pt;z-index:251737088;visibility:visible;mso-wrap-style:square;mso-width-percent:0;mso-height-percent:0;mso-wrap-distance-left:9pt;mso-wrap-distance-top:0;mso-wrap-distance-right:9pt;mso-wrap-distance-bottom:0;mso-position-horizontal:absolute;mso-position-horizontal-relative:text;mso-position-vertical:absolute;mso-position-vertical-relative:text;mso-width-percent:0;mso-height-percent:0;mso-width-relative:margin;mso-height-relative:margin;v-text-anchor:middle" o:gfxdata="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" filled="f" strokecolor="red" strokeweight="1pt">
                       <v:stroke joinstyle="miter"/>
                     </v:oval>
                   </w:pict>
@@ -5153,7 +5153,7 @@
                 </mc:Choice>
                 <mc:Fallback>
                   <w:pict>
-                    <v:oval w14:anchorId="2AC97DE6" id="Oval 8" o:spid="_x0000_s1026" style="position:absolute;margin-left:28.7pt;margin-top:13.5pt;width:25.5pt;height:16pt;z-index:251739136;visibility:visible;mso-wrap-style:square;mso-width-percent:0;mso-height-percent:0;mso-wrap-distance-left:9pt;mso-wrap-distance-top:0;mso-wrap-distance-right:9pt;mso-wrap-distance-bottom:0;mso-position-horizontal:absolute;mso-position-horizontal-relative:text;mso-position-vertical:absolute;mso-position-vertical-relative:text;mso-width-percent:0;mso-height-percent:0;mso-width-relative:margin;mso-height-relative:margin;v-text-anchor:middle" o:gfxdata="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" filled="f" strokecolor="red" strokeweight="1pt">
+                    <v:oval w14:anchorId="33A3B14C" id="Oval 8" o:spid="_x0000_s1026" style="position:absolute;margin-left:28.7pt;margin-top:13.5pt;width:25.5pt;height:16pt;z-index:251739136;visibility:visible;mso-wrap-style:square;mso-width-percent:0;mso-height-percent:0;mso-wrap-distance-left:9pt;mso-wrap-distance-top:0;mso-wrap-distance-right:9pt;mso-wrap-distance-bottom:0;mso-position-horizontal:absolute;mso-position-horizontal-relative:text;mso-position-vertical:absolute;mso-position-vertical-relative:text;mso-width-percent:0;mso-height-percent:0;mso-width-relative:margin;mso-height-relative:margin;v-text-anchor:middle" o:gfxdata="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" filled="f" strokecolor="red" strokeweight="1pt">
                       <v:stroke joinstyle="miter"/>
                     </v:oval>
                   </w:pict>
@@ -5446,7 +5446,7 @@
                 </mc:Choice>
                 <mc:Fallback>
                   <w:pict>
-                    <v:oval w14:anchorId="43CFE78B" id="Oval 3" o:spid="_x0000_s1026" style="position:absolute;margin-left:-3.05pt;margin-top:13.2pt;width:25.5pt;height:16pt;z-index:251735040;visibility:visible;mso-wrap-style:square;mso-width-percent:0;mso-wrap-distance-left:9pt;mso-wrap-distance-top:0;mso-wrap-distance-right:9pt;mso-wrap-distance-bottom:0;mso-position-horizontal:absolute;mso-position-horizontal-relative:text;mso-position-vertical:absolute;mso-position-vertical-relative:text;mso-width-percent:0;mso-width-relative:margin;v-text-anchor:middle" o:gfxdata="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" filled="f" strokecolor="red" strokeweight="1pt">
+                    <v:oval w14:anchorId="2D29FA88" id="Oval 3" o:spid="_x0000_s1026" style="position:absolute;margin-left:-3.05pt;margin-top:13.2pt;width:25.5pt;height:16pt;z-index:251735040;visibility:visible;mso-wrap-style:square;mso-width-percent:0;mso-wrap-distance-left:9pt;mso-wrap-distance-top:0;mso-wrap-distance-right:9pt;mso-wrap-distance-bottom:0;mso-position-horizontal:absolute;mso-position-horizontal-relative:text;mso-position-vertical:absolute;mso-position-vertical-relative:text;mso-width-percent:0;mso-width-relative:margin;v-text-anchor:middle" o:gfxdata="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" filled="f" strokecolor="red" strokeweight="1pt">
                       <v:stroke joinstyle="miter"/>
                     </v:oval>
                   </w:pict>
@@ -5829,7 +5829,7 @@
                 </mc:Choice>
                 <mc:Fallback>
                   <w:pict>
-                    <v:oval w14:anchorId="1050C88E" id="Oval 1" o:spid="_x0000_s1026" style="position:absolute;margin-left:-3.5pt;margin-top:13.05pt;width:30.5pt;height:16pt;z-index:251732992;visibility:visible;mso-wrap-style:square;mso-wrap-distance-left:9pt;mso-wrap-distance-top:0;mso-wrap-distance-right:9pt;mso-wrap-distance-bottom:0;mso-position-horizontal:absolute;mso-position-horizontal-relative:text;mso-position-vertical:absolute;mso-position-vertical-relative:text;v-text-anchor:middle" o:gfxdata="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" filled="f" strokecolor="red" strokeweight="1pt">
+                    <v:oval w14:anchorId="1F3327FC" id="Oval 1" o:spid="_x0000_s1026" style="position:absolute;margin-left:-3.5pt;margin-top:13.05pt;width:30.5pt;height:16pt;z-index:251732992;visibility:visible;mso-wrap-style:square;mso-wrap-distance-left:9pt;mso-wrap-distance-top:0;mso-wrap-distance-right:9pt;mso-wrap-distance-bottom:0;mso-position-horizontal:absolute;mso-position-horizontal-relative:text;mso-position-vertical:absolute;mso-position-vertical-relative:text;v-text-anchor:middle" o:gfxdata="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" filled="f" strokecolor="red" strokeweight="1pt">
                       <v:stroke joinstyle="miter"/>
                     </v:oval>
                   </w:pict>
@@ -5990,7 +5990,7 @@
                 </mc:Choice>
                 <mc:Fallback>
                   <w:pict>
-                    <v:oval w14:anchorId="6BFDAA1C" id="Oval 5" o:spid="_x0000_s1026" style="position:absolute;margin-left:36.95pt;margin-top:13.05pt;width:25.5pt;height:16pt;z-index:251736064;visibility:visible;mso-wrap-style:square;mso-width-percent:0;mso-wrap-distance-left:9pt;mso-wrap-distance-top:0;mso-wrap-distance-right:9pt;mso-wrap-distance-bottom:0;mso-position-horizontal:absolute;mso-position-horizontal-relative:text;mso-position-vertical:absolute;mso-position-vertical-relative:text;mso-width-percent:0;mso-width-relative:margin;v-text-anchor:middle" o:gfxdata="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" filled="f" strokecolor="red" strokeweight="1pt">
+                    <v:oval w14:anchorId="744E4934" id="Oval 5" o:spid="_x0000_s1026" style="position:absolute;margin-left:36.95pt;margin-top:13.05pt;width:25.5pt;height:16pt;z-index:251736064;visibility:visible;mso-wrap-style:square;mso-width-percent:0;mso-wrap-distance-left:9pt;mso-wrap-distance-top:0;mso-wrap-distance-right:9pt;mso-wrap-distance-bottom:0;mso-position-horizontal:absolute;mso-position-horizontal-relative:text;mso-position-vertical:absolute;mso-position-vertical-relative:text;mso-width-percent:0;mso-width-relative:margin;v-text-anchor:middle" o:gfxdata="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" filled="f" strokecolor="red" strokeweight="1pt">
                       <v:stroke joinstyle="miter"/>
                     </v:oval>
                   </w:pict>
@@ -6487,7 +6487,7 @@
                 </mc:Choice>
                 <mc:Fallback>
                   <w:pict>
-                    <v:oval w14:anchorId="508D889A" id="Oval 6" o:spid="_x0000_s1026" style="position:absolute;margin-left:29.95pt;margin-top:12.7pt;width:25.5pt;height:16pt;z-index:251738112;visibility:visible;mso-wrap-style:square;mso-width-percent:0;mso-height-percent:0;mso-wrap-distance-left:9pt;mso-wrap-distance-top:0;mso-wrap-distance-right:9pt;mso-wrap-distance-bottom:0;mso-position-horizontal:absolute;mso-position-horizontal-relative:text;mso-position-vertical:absolute;mso-position-vertical-relative:text;mso-width-percent:0;mso-height-percent:0;mso-width-relative:margin;mso-height-relative:margin;v-text-anchor:middle" o:gfxdata="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" filled="f" strokecolor="red" strokeweight="1pt">
+                    <v:oval w14:anchorId="768D905F" id="Oval 6" o:spid="_x0000_s1026" style="position:absolute;margin-left:29.95pt;margin-top:12.7pt;width:25.5pt;height:16pt;z-index:251738112;visibility:visible;mso-wrap-style:square;mso-width-percent:0;mso-height-percent:0;mso-wrap-distance-left:9pt;mso-wrap-distance-top:0;mso-wrap-distance-right:9pt;mso-wrap-distance-bottom:0;mso-position-horizontal:absolute;mso-position-horizontal-relative:text;mso-position-vertical:absolute;mso-position-vertical-relative:text;mso-width-percent:0;mso-height-percent:0;mso-width-relative:margin;mso-height-relative:margin;v-text-anchor:middle" o:gfxdata="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" filled="f" strokecolor="red" strokeweight="1pt">
                       <v:stroke joinstyle="miter"/>
                     </v:oval>
                   </w:pict>
@@ -10996,6 +10996,87 @@
         </w:rPr>
         <w:t>I1 -&gt; I3: confidence = 2/3 = 0.67</w:t>
       </w:r>
+      <w:r>
+        <w:rPr>
+          <w:rFonts w:ascii="Calibri" w:hAnsi="Calibri" w:cs="Calibri"/>
+          <w:color w:val="70AD47" w:themeColor="accent6"/>
+          <w:sz w:val="22"/>
+          <w:szCs w:val="22"/>
+          <w:lang w:val="en-US"/>
+        </w:rPr>
+        <w:t xml:space="preserve">  </w:t>
+      </w:r>
+      <w:r>
+        <w:rPr>
+          <w:rFonts w:ascii="Calibri" w:hAnsi="Calibri" w:cs="Calibri"/>
+          <w:color w:val="70AD47" w:themeColor="accent6"/>
+          <w:sz w:val="22"/>
+          <w:szCs w:val="22"/>
+          <w:lang w:val="en-US"/>
+        </w:rPr>
+        <w:fldChar w:fldCharType="begin"/>
+      </w:r>
+      <w:r>
+        <w:rPr>
+          <w:rFonts w:ascii="Calibri" w:eastAsia="SimSun" w:hAnsi="Calibri" w:cs="Calibri"/>
+          <w:color w:val="70AD47" w:themeColor="accent6"/>
+          <w:sz w:val="22"/>
+          <w:szCs w:val="22"/>
+          <w:lang w:val="en-US"/>
+        </w:rPr>
+        <w:instrText xml:space="preserve"> </w:instrText>
+      </w:r>
+      <w:r>
+        <w:rPr>
+          <w:rFonts w:ascii="Calibri" w:eastAsia="SimSun" w:hAnsi="Calibri" w:cs="Calibri" w:hint="eastAsia"/>
+          <w:color w:val="70AD47" w:themeColor="accent6"/>
+          <w:sz w:val="22"/>
+          <w:szCs w:val="22"/>
+          <w:lang w:val="en-US"/>
+        </w:rPr>
+        <w:instrText>= 1 \* GB3</w:instrText>
+      </w:r>
+      <w:r>
+        <w:rPr>
+          <w:rFonts w:ascii="Calibri" w:eastAsia="SimSun" w:hAnsi="Calibri" w:cs="Calibri"/>
+          <w:color w:val="70AD47" w:themeColor="accent6"/>
+          <w:sz w:val="22"/>
+          <w:szCs w:val="22"/>
+          <w:lang w:val="en-US"/>
+        </w:rPr>
+        <w:instrText xml:space="preserve"> </w:instrText>
+      </w:r>
+      <w:r>
+        <w:rPr>
+          <w:rFonts w:ascii="Calibri" w:hAnsi="Calibri" w:cs="Calibri"/>
+          <w:color w:val="70AD47" w:themeColor="accent6"/>
+          <w:sz w:val="22"/>
+          <w:szCs w:val="22"/>
+          <w:lang w:val="en-US"/>
+        </w:rPr>
+        <w:fldChar w:fldCharType="separate"/>
+      </w:r>
+      <w:r>
+        <w:rPr>
+          <w:rFonts w:ascii="Calibri" w:eastAsia="SimSun" w:hAnsi="Calibri" w:cs="Calibri" w:hint="eastAsia"/>
+          <w:noProof/>
+          <w:color w:val="70AD47" w:themeColor="accent6"/>
+          <w:sz w:val="22"/>
+          <w:szCs w:val="22"/>
+          <w:lang w:val="en-US"/>
+        </w:rPr>
+        <w:t>①</w:t>
+      </w:r>
+      <w:r>
+        <w:rPr>
+          <w:rFonts w:ascii="Calibri" w:hAnsi="Calibri" w:cs="Calibri"/>
+          <w:color w:val="70AD47" w:themeColor="accent6"/>
+          <w:sz w:val="22"/>
+          <w:szCs w:val="22"/>
+          <w:lang w:val="en-US"/>
+        </w:rPr>
+        <w:fldChar w:fldCharType="end"/>
+      </w:r>
     </w:p>
     <w:p>
       <w:pPr>
@@ -11080,6 +11161,15 @@
         </w:rPr>
         <w:t>4</w:t>
       </w:r>
+      <w:r>
+        <w:rPr>
+          <w:rFonts w:ascii="Calibri" w:hAnsi="Calibri" w:cs="Calibri"/>
+          <w:sz w:val="22"/>
+          <w:szCs w:val="22"/>
+          <w:lang w:val="en-US"/>
+        </w:rPr>
+        <w:t xml:space="preserve"> </w:t>
+      </w:r>
     </w:p>
     <w:p>
       <w:pPr>
@@ -11173,6 +11263,87 @@
         </w:rPr>
         <w:t>67</w:t>
       </w:r>
+      <w:r>
+        <w:rPr>
+          <w:rFonts w:ascii="Calibri" w:hAnsi="Calibri" w:cs="Calibri"/>
+          <w:color w:val="70AD47" w:themeColor="accent6"/>
+          <w:sz w:val="22"/>
+          <w:szCs w:val="22"/>
+          <w:lang w:val="en-US"/>
+        </w:rPr>
+        <w:t xml:space="preserve">  </w:t>
+      </w:r>
+      <w:r>
+        <w:rPr>
+          <w:rFonts w:ascii="Calibri" w:hAnsi="Calibri" w:cs="Calibri"/>
+          <w:color w:val="70AD47" w:themeColor="accent6"/>
+          <w:sz w:val="22"/>
+          <w:szCs w:val="22"/>
+          <w:lang w:val="en-US"/>
+        </w:rPr>
+        <w:fldChar w:fldCharType="begin"/>
+      </w:r>
+      <w:r>
+        <w:rPr>
+          <w:rFonts w:ascii="Calibri" w:eastAsia="SimSun" w:hAnsi="Calibri" w:cs="Calibri"/>
+          <w:color w:val="70AD47" w:themeColor="accent6"/>
+          <w:sz w:val="22"/>
+          <w:szCs w:val="22"/>
+          <w:lang w:val="en-US"/>
+        </w:rPr>
+        <w:instrText xml:space="preserve"> </w:instrText>
+      </w:r>
+      <w:r>
+        <w:rPr>
+          <w:rFonts w:ascii="Calibri" w:eastAsia="SimSun" w:hAnsi="Calibri" w:cs="Calibri" w:hint="eastAsia"/>
+          <w:color w:val="70AD47" w:themeColor="accent6"/>
+          <w:sz w:val="22"/>
+          <w:szCs w:val="22"/>
+          <w:lang w:val="en-US"/>
+        </w:rPr>
+        <w:instrText>= 2 \* GB3</w:instrText>
+      </w:r>
+      <w:r>
+        <w:rPr>
+          <w:rFonts w:ascii="Calibri" w:eastAsia="SimSun" w:hAnsi="Calibri" w:cs="Calibri"/>
+          <w:color w:val="70AD47" w:themeColor="accent6"/>
+          <w:sz w:val="22"/>
+          <w:szCs w:val="22"/>
+          <w:lang w:val="en-US"/>
+        </w:rPr>
+        <w:instrText xml:space="preserve"> </w:instrText>
+      </w:r>
+      <w:r>
+        <w:rPr>
+          <w:rFonts w:ascii="Calibri" w:hAnsi="Calibri" w:cs="Calibri"/>
+          <w:color w:val="70AD47" w:themeColor="accent6"/>
+          <w:sz w:val="22"/>
+          <w:szCs w:val="22"/>
+          <w:lang w:val="en-US"/>
+        </w:rPr>
+        <w:fldChar w:fldCharType="separate"/>
+      </w:r>
+      <w:r>
+        <w:rPr>
+          <w:rFonts w:ascii="Calibri" w:eastAsia="SimSun" w:hAnsi="Calibri" w:cs="Calibri" w:hint="eastAsia"/>
+          <w:noProof/>
+          <w:color w:val="70AD47" w:themeColor="accent6"/>
+          <w:sz w:val="22"/>
+          <w:szCs w:val="22"/>
+          <w:lang w:val="en-US"/>
+        </w:rPr>
+        <w:t>②</w:t>
+      </w:r>
+      <w:r>
+        <w:rPr>
+          <w:rFonts w:ascii="Calibri" w:hAnsi="Calibri" w:cs="Calibri"/>
+          <w:color w:val="70AD47" w:themeColor="accent6"/>
+          <w:sz w:val="22"/>
+          <w:szCs w:val="22"/>
+          <w:lang w:val="en-US"/>
+        </w:rPr>
+        <w:fldChar w:fldCharType="end"/>
+      </w:r>
     </w:p>
     <w:p>
       <w:pPr>
@@ -11352,6 +11523,87 @@
         </w:rPr>
         <w:t>75</w:t>
       </w:r>
+      <w:r>
+        <w:rPr>
+          <w:rFonts w:ascii="Calibri" w:hAnsi="Calibri" w:cs="Calibri"/>
+          <w:color w:val="70AD47" w:themeColor="accent6"/>
+          <w:sz w:val="22"/>
+          <w:szCs w:val="22"/>
+          <w:lang w:val="en-US"/>
+        </w:rPr>
+        <w:t xml:space="preserve">  </w:t>
+      </w:r>
+      <w:r>
+        <w:rPr>
+          <w:rFonts w:ascii="Calibri" w:hAnsi="Calibri" w:cs="Calibri"/>
+          <w:color w:val="70AD47" w:themeColor="accent6"/>
+          <w:sz w:val="22"/>
+          <w:szCs w:val="22"/>
+          <w:lang w:val="en-US"/>
+        </w:rPr>
+        <w:fldChar w:fldCharType="begin"/>
+      </w:r>
+      <w:r>
+        <w:rPr>
+          <w:rFonts w:ascii="Calibri" w:eastAsia="SimSun" w:hAnsi="Calibri" w:cs="Calibri"/>
+          <w:color w:val="70AD47" w:themeColor="accent6"/>
+          <w:sz w:val="22"/>
+          <w:szCs w:val="22"/>
+          <w:lang w:val="en-US"/>
+        </w:rPr>
+        <w:instrText xml:space="preserve"> </w:instrText>
+      </w:r>
+      <w:r>
+        <w:rPr>
+          <w:rFonts w:ascii="Calibri" w:eastAsia="SimSun" w:hAnsi="Calibri" w:cs="Calibri" w:hint="eastAsia"/>
+          <w:color w:val="70AD47" w:themeColor="accent6"/>
+          <w:sz w:val="22"/>
+          <w:szCs w:val="22"/>
+          <w:lang w:val="en-US"/>
+        </w:rPr>
+        <w:instrText>= 3 \* GB3</w:instrText>
+      </w:r>
+      <w:r>
+        <w:rPr>
+          <w:rFonts w:ascii="Calibri" w:eastAsia="SimSun" w:hAnsi="Calibri" w:cs="Calibri"/>
+          <w:color w:val="70AD47" w:themeColor="accent6"/>
+          <w:sz w:val="22"/>
+          <w:szCs w:val="22"/>
+          <w:lang w:val="en-US"/>
+        </w:rPr>
+        <w:instrText xml:space="preserve"> </w:instrText>
+      </w:r>
+      <w:r>
+        <w:rPr>
+          <w:rFonts w:ascii="Calibri" w:hAnsi="Calibri" w:cs="Calibri"/>
+          <w:color w:val="70AD47" w:themeColor="accent6"/>
+          <w:sz w:val="22"/>
+          <w:szCs w:val="22"/>
+          <w:lang w:val="en-US"/>
+        </w:rPr>
+        <w:fldChar w:fldCharType="separate"/>
+      </w:r>
+      <w:r>
+        <w:rPr>
+          <w:rFonts w:ascii="Calibri" w:eastAsia="SimSun" w:hAnsi="Calibri" w:cs="Calibri" w:hint="eastAsia"/>
+          <w:noProof/>
+          <w:color w:val="70AD47" w:themeColor="accent6"/>
+          <w:sz w:val="22"/>
+          <w:szCs w:val="22"/>
+          <w:lang w:val="en-US"/>
+        </w:rPr>
+        <w:t>③</w:t>
+      </w:r>
+      <w:r>
+        <w:rPr>
+          <w:rFonts w:ascii="Calibri" w:hAnsi="Calibri" w:cs="Calibri"/>
+          <w:color w:val="70AD47" w:themeColor="accent6"/>
+          <w:sz w:val="22"/>
+          <w:szCs w:val="22"/>
+          <w:lang w:val="en-US"/>
+        </w:rPr>
+        <w:fldChar w:fldCharType="end"/>
+      </w:r>
     </w:p>
     <w:p>
       <w:pPr>
@@ -11425,6 +11677,16 @@
         </w:rPr>
         <w:t>6</w:t>
       </w:r>
+      <w:r>
+        <w:rPr>
+          <w:rFonts w:ascii="Calibri" w:hAnsi="Calibri" w:cs="Calibri"/>
+          <w:color w:val="70AD47" w:themeColor="accent6"/>
+          <w:sz w:val="22"/>
+          <w:szCs w:val="22"/>
+          <w:lang w:val="en-US"/>
+        </w:rPr>
+        <w:t xml:space="preserve">  </w:t>
+      </w:r>
     </w:p>
     <w:p>
       <w:pPr>
@@ -11651,6 +11913,1523 @@
         </w:rPr>
         <w:t>8</w:t>
       </w:r>
+    </w:p>
+    <w:p>
+      <w:pPr>
+        <w:pStyle w:val="NormalWeb"/>
+        <w:spacing w:before="0" w:beforeAutospacing="0" w:after="0" w:afterAutospacing="0"/>
+        <w:rPr>
+          <w:rFonts w:ascii="Calibri" w:hAnsi="Calibri" w:cs="Calibri"/>
+          <w:color w:val="70AD47" w:themeColor="accent6"/>
+          <w:sz w:val="22"/>
+          <w:szCs w:val="22"/>
+          <w:lang w:val="en-US"/>
+        </w:rPr>
+      </w:pPr>
+      <w:r>
+        <w:rPr>
+          <w:rFonts w:ascii="Calibri" w:hAnsi="Calibri" w:cs="Calibri"/>
+          <w:color w:val="70AD47" w:themeColor="accent6"/>
+          <w:sz w:val="22"/>
+          <w:szCs w:val="22"/>
+          <w:lang w:val="en-US"/>
+        </w:rPr>
+        <w:t>I</w:t>
+      </w:r>
+      <w:r>
+        <w:rPr>
+          <w:rFonts w:ascii="Calibri" w:hAnsi="Calibri" w:cs="Calibri"/>
+          <w:color w:val="70AD47" w:themeColor="accent6"/>
+          <w:sz w:val="22"/>
+          <w:szCs w:val="22"/>
+          <w:lang w:val="en-US"/>
+        </w:rPr>
+        <w:t>3</w:t>
+      </w:r>
+      <w:r>
+        <w:rPr>
+          <w:rFonts w:ascii="Calibri" w:hAnsi="Calibri" w:cs="Calibri"/>
+          <w:color w:val="70AD47" w:themeColor="accent6"/>
+          <w:sz w:val="22"/>
+          <w:szCs w:val="22"/>
+          <w:lang w:val="en-US"/>
+        </w:rPr>
+        <w:t xml:space="preserve"> -&gt; I</w:t>
+      </w:r>
+      <w:r>
+        <w:rPr>
+          <w:rFonts w:ascii="Calibri" w:hAnsi="Calibri" w:cs="Calibri"/>
+          <w:color w:val="70AD47" w:themeColor="accent6"/>
+          <w:sz w:val="22"/>
+          <w:szCs w:val="22"/>
+          <w:lang w:val="en-US"/>
+        </w:rPr>
+        <w:t>4</w:t>
+      </w:r>
+      <w:r>
+        <w:rPr>
+          <w:rFonts w:ascii="Calibri" w:hAnsi="Calibri" w:cs="Calibri"/>
+          <w:color w:val="70AD47" w:themeColor="accent6"/>
+          <w:sz w:val="22"/>
+          <w:szCs w:val="22"/>
+          <w:lang w:val="en-US"/>
+        </w:rPr>
+        <w:t xml:space="preserve">: confidence = </w:t>
+      </w:r>
+      <w:r>
+        <w:rPr>
+          <w:rFonts w:ascii="Calibri" w:hAnsi="Calibri" w:cs="Calibri"/>
+          <w:color w:val="70AD47" w:themeColor="accent6"/>
+          <w:sz w:val="22"/>
+          <w:szCs w:val="22"/>
+          <w:lang w:val="en-US"/>
+        </w:rPr>
+        <w:t>4</w:t>
+      </w:r>
+      <w:r>
+        <w:rPr>
+          <w:rFonts w:ascii="Calibri" w:hAnsi="Calibri" w:cs="Calibri"/>
+          <w:color w:val="70AD47" w:themeColor="accent6"/>
+          <w:sz w:val="22"/>
+          <w:szCs w:val="22"/>
+          <w:lang w:val="en-US"/>
+        </w:rPr>
+        <w:t>/</w:t>
+      </w:r>
+      <w:r>
+        <w:rPr>
+          <w:rFonts w:ascii="Calibri" w:hAnsi="Calibri" w:cs="Calibri"/>
+          <w:color w:val="70AD47" w:themeColor="accent6"/>
+          <w:sz w:val="22"/>
+          <w:szCs w:val="22"/>
+          <w:lang w:val="en-US"/>
+        </w:rPr>
+        <w:t>5</w:t>
+      </w:r>
+      <w:r>
+        <w:rPr>
+          <w:rFonts w:ascii="Calibri" w:hAnsi="Calibri" w:cs="Calibri"/>
+          <w:color w:val="70AD47" w:themeColor="accent6"/>
+          <w:sz w:val="22"/>
+          <w:szCs w:val="22"/>
+          <w:lang w:val="en-US"/>
+        </w:rPr>
+        <w:t xml:space="preserve"> = 0.</w:t>
+      </w:r>
+      <w:r>
+        <w:rPr>
+          <w:rFonts w:ascii="Calibri" w:hAnsi="Calibri" w:cs="Calibri"/>
+          <w:color w:val="70AD47" w:themeColor="accent6"/>
+          <w:sz w:val="22"/>
+          <w:szCs w:val="22"/>
+          <w:lang w:val="en-US"/>
+        </w:rPr>
+        <w:t>8</w:t>
+      </w:r>
+    </w:p>
+    <w:p>
+      <w:pPr>
+        <w:pStyle w:val="NormalWeb"/>
+        <w:spacing w:before="0" w:beforeAutospacing="0" w:after="0" w:afterAutospacing="0"/>
+        <w:rPr>
+          <w:rFonts w:ascii="Calibri" w:hAnsi="Calibri" w:cs="Calibri"/>
+          <w:color w:val="70AD47" w:themeColor="accent6"/>
+          <w:sz w:val="22"/>
+          <w:szCs w:val="22"/>
+          <w:lang w:val="en-US"/>
+        </w:rPr>
+      </w:pPr>
+      <w:r>
+        <w:rPr>
+          <w:rFonts w:ascii="Calibri" w:hAnsi="Calibri" w:cs="Calibri"/>
+          <w:color w:val="70AD47" w:themeColor="accent6"/>
+          <w:sz w:val="22"/>
+          <w:szCs w:val="22"/>
+          <w:lang w:val="en-US"/>
+        </w:rPr>
+        <w:t>I</w:t>
+      </w:r>
+      <w:r>
+        <w:rPr>
+          <w:rFonts w:ascii="Calibri" w:hAnsi="Calibri" w:cs="Calibri"/>
+          <w:color w:val="70AD47" w:themeColor="accent6"/>
+          <w:sz w:val="22"/>
+          <w:szCs w:val="22"/>
+          <w:lang w:val="en-US"/>
+        </w:rPr>
+        <w:t>4</w:t>
+      </w:r>
+      <w:r>
+        <w:rPr>
+          <w:rFonts w:ascii="Calibri" w:hAnsi="Calibri" w:cs="Calibri"/>
+          <w:color w:val="70AD47" w:themeColor="accent6"/>
+          <w:sz w:val="22"/>
+          <w:szCs w:val="22"/>
+          <w:lang w:val="en-US"/>
+        </w:rPr>
+        <w:t xml:space="preserve"> -&gt; I</w:t>
+      </w:r>
+      <w:r>
+        <w:rPr>
+          <w:rFonts w:ascii="Calibri" w:hAnsi="Calibri" w:cs="Calibri"/>
+          <w:color w:val="70AD47" w:themeColor="accent6"/>
+          <w:sz w:val="22"/>
+          <w:szCs w:val="22"/>
+          <w:lang w:val="en-US"/>
+        </w:rPr>
+        <w:t>3</w:t>
+      </w:r>
+      <w:r>
+        <w:rPr>
+          <w:rFonts w:ascii="Calibri" w:hAnsi="Calibri" w:cs="Calibri"/>
+          <w:color w:val="70AD47" w:themeColor="accent6"/>
+          <w:sz w:val="22"/>
+          <w:szCs w:val="22"/>
+          <w:lang w:val="en-US"/>
+        </w:rPr>
+        <w:t xml:space="preserve">: confidence = </w:t>
+      </w:r>
+      <w:r>
+        <w:rPr>
+          <w:rFonts w:ascii="Calibri" w:hAnsi="Calibri" w:cs="Calibri"/>
+          <w:color w:val="70AD47" w:themeColor="accent6"/>
+          <w:sz w:val="22"/>
+          <w:szCs w:val="22"/>
+          <w:lang w:val="en-US"/>
+        </w:rPr>
+        <w:t>4</w:t>
+      </w:r>
+      <w:r>
+        <w:rPr>
+          <w:rFonts w:ascii="Calibri" w:hAnsi="Calibri" w:cs="Calibri"/>
+          <w:color w:val="70AD47" w:themeColor="accent6"/>
+          <w:sz w:val="22"/>
+          <w:szCs w:val="22"/>
+          <w:lang w:val="en-US"/>
+        </w:rPr>
+        <w:t>/</w:t>
+      </w:r>
+      <w:r>
+        <w:rPr>
+          <w:rFonts w:ascii="Calibri" w:hAnsi="Calibri" w:cs="Calibri"/>
+          <w:color w:val="70AD47" w:themeColor="accent6"/>
+          <w:sz w:val="22"/>
+          <w:szCs w:val="22"/>
+          <w:lang w:val="en-US"/>
+        </w:rPr>
+        <w:t>5</w:t>
+      </w:r>
+      <w:r>
+        <w:rPr>
+          <w:rFonts w:ascii="Calibri" w:hAnsi="Calibri" w:cs="Calibri"/>
+          <w:color w:val="70AD47" w:themeColor="accent6"/>
+          <w:sz w:val="22"/>
+          <w:szCs w:val="22"/>
+          <w:lang w:val="en-US"/>
+        </w:rPr>
+        <w:t xml:space="preserve"> = 0.</w:t>
+      </w:r>
+      <w:r>
+        <w:rPr>
+          <w:rFonts w:ascii="Calibri" w:hAnsi="Calibri" w:cs="Calibri"/>
+          <w:color w:val="70AD47" w:themeColor="accent6"/>
+          <w:sz w:val="22"/>
+          <w:szCs w:val="22"/>
+          <w:lang w:val="en-US"/>
+        </w:rPr>
+        <w:t>8</w:t>
+      </w:r>
+    </w:p>
+    <w:p>
+      <w:pPr>
+        <w:pStyle w:val="NormalWeb"/>
+        <w:spacing w:before="0" w:beforeAutospacing="0" w:after="0" w:afterAutospacing="0"/>
+        <w:rPr>
+          <w:rFonts w:ascii="Calibri" w:hAnsi="Calibri" w:cs="Calibri"/>
+          <w:color w:val="70AD47" w:themeColor="accent6"/>
+          <w:sz w:val="22"/>
+          <w:szCs w:val="22"/>
+          <w:lang w:val="en-US"/>
+        </w:rPr>
+      </w:pPr>
+      <w:r>
+        <w:rPr>
+          <w:rFonts w:ascii="Calibri" w:hAnsi="Calibri" w:cs="Calibri"/>
+          <w:color w:val="70AD47" w:themeColor="accent6"/>
+          <w:sz w:val="22"/>
+          <w:szCs w:val="22"/>
+          <w:lang w:val="en-US"/>
+        </w:rPr>
+        <w:t>I</w:t>
+      </w:r>
+      <w:r>
+        <w:rPr>
+          <w:rFonts w:ascii="Calibri" w:hAnsi="Calibri" w:cs="Calibri"/>
+          <w:color w:val="70AD47" w:themeColor="accent6"/>
+          <w:sz w:val="22"/>
+          <w:szCs w:val="22"/>
+          <w:lang w:val="en-US"/>
+        </w:rPr>
+        <w:t>3</w:t>
+      </w:r>
+      <w:r>
+        <w:rPr>
+          <w:rFonts w:ascii="Calibri" w:hAnsi="Calibri" w:cs="Calibri"/>
+          <w:color w:val="70AD47" w:themeColor="accent6"/>
+          <w:sz w:val="22"/>
+          <w:szCs w:val="22"/>
+          <w:lang w:val="en-US"/>
+        </w:rPr>
+        <w:t xml:space="preserve"> -&gt; I</w:t>
+      </w:r>
+      <w:r>
+        <w:rPr>
+          <w:rFonts w:ascii="Calibri" w:hAnsi="Calibri" w:cs="Calibri"/>
+          <w:color w:val="70AD47" w:themeColor="accent6"/>
+          <w:sz w:val="22"/>
+          <w:szCs w:val="22"/>
+          <w:lang w:val="en-US"/>
+        </w:rPr>
+        <w:t>5</w:t>
+      </w:r>
+      <w:r>
+        <w:rPr>
+          <w:rFonts w:ascii="Calibri" w:hAnsi="Calibri" w:cs="Calibri"/>
+          <w:color w:val="70AD47" w:themeColor="accent6"/>
+          <w:sz w:val="22"/>
+          <w:szCs w:val="22"/>
+          <w:lang w:val="en-US"/>
+        </w:rPr>
+        <w:t xml:space="preserve">: confidence = </w:t>
+      </w:r>
+      <w:r>
+        <w:rPr>
+          <w:rFonts w:ascii="Calibri" w:hAnsi="Calibri" w:cs="Calibri"/>
+          <w:color w:val="70AD47" w:themeColor="accent6"/>
+          <w:sz w:val="22"/>
+          <w:szCs w:val="22"/>
+          <w:lang w:val="en-US"/>
+        </w:rPr>
+        <w:t>3</w:t>
+      </w:r>
+      <w:r>
+        <w:rPr>
+          <w:rFonts w:ascii="Calibri" w:hAnsi="Calibri" w:cs="Calibri"/>
+          <w:color w:val="70AD47" w:themeColor="accent6"/>
+          <w:sz w:val="22"/>
+          <w:szCs w:val="22"/>
+          <w:lang w:val="en-US"/>
+        </w:rPr>
+        <w:t>/</w:t>
+      </w:r>
+      <w:r>
+        <w:rPr>
+          <w:rFonts w:ascii="Calibri" w:hAnsi="Calibri" w:cs="Calibri"/>
+          <w:color w:val="70AD47" w:themeColor="accent6"/>
+          <w:sz w:val="22"/>
+          <w:szCs w:val="22"/>
+          <w:lang w:val="en-US"/>
+        </w:rPr>
+        <w:t>5</w:t>
+      </w:r>
+      <w:r>
+        <w:rPr>
+          <w:rFonts w:ascii="Calibri" w:hAnsi="Calibri" w:cs="Calibri"/>
+          <w:color w:val="70AD47" w:themeColor="accent6"/>
+          <w:sz w:val="22"/>
+          <w:szCs w:val="22"/>
+          <w:lang w:val="en-US"/>
+        </w:rPr>
+        <w:t xml:space="preserve"> = 0.</w:t>
+      </w:r>
+      <w:r>
+        <w:rPr>
+          <w:rFonts w:ascii="Calibri" w:hAnsi="Calibri" w:cs="Calibri"/>
+          <w:color w:val="70AD47" w:themeColor="accent6"/>
+          <w:sz w:val="22"/>
+          <w:szCs w:val="22"/>
+          <w:lang w:val="en-US"/>
+        </w:rPr>
+        <w:t>6</w:t>
+      </w:r>
+    </w:p>
+    <w:p>
+      <w:pPr>
+        <w:pStyle w:val="NormalWeb"/>
+        <w:spacing w:before="0" w:beforeAutospacing="0" w:after="0" w:afterAutospacing="0"/>
+        <w:rPr>
+          <w:rFonts w:ascii="Calibri" w:hAnsi="Calibri" w:cs="Calibri"/>
+          <w:color w:val="70AD47" w:themeColor="accent6"/>
+          <w:sz w:val="22"/>
+          <w:szCs w:val="22"/>
+          <w:lang w:val="en-US"/>
+        </w:rPr>
+      </w:pPr>
+      <w:r>
+        <w:rPr>
+          <w:rFonts w:ascii="Calibri" w:hAnsi="Calibri" w:cs="Calibri"/>
+          <w:color w:val="70AD47" w:themeColor="accent6"/>
+          <w:sz w:val="22"/>
+          <w:szCs w:val="22"/>
+          <w:lang w:val="en-US"/>
+        </w:rPr>
+        <w:t>I5 -&gt; I</w:t>
+      </w:r>
+      <w:r>
+        <w:rPr>
+          <w:rFonts w:ascii="Calibri" w:hAnsi="Calibri" w:cs="Calibri"/>
+          <w:color w:val="70AD47" w:themeColor="accent6"/>
+          <w:sz w:val="22"/>
+          <w:szCs w:val="22"/>
+          <w:lang w:val="en-US"/>
+        </w:rPr>
+        <w:t>3</w:t>
+      </w:r>
+      <w:r>
+        <w:rPr>
+          <w:rFonts w:ascii="Calibri" w:hAnsi="Calibri" w:cs="Calibri"/>
+          <w:color w:val="70AD47" w:themeColor="accent6"/>
+          <w:sz w:val="22"/>
+          <w:szCs w:val="22"/>
+          <w:lang w:val="en-US"/>
+        </w:rPr>
+        <w:t xml:space="preserve">: confidence = </w:t>
+      </w:r>
+      <w:r>
+        <w:rPr>
+          <w:rFonts w:ascii="Calibri" w:hAnsi="Calibri" w:cs="Calibri"/>
+          <w:color w:val="70AD47" w:themeColor="accent6"/>
+          <w:sz w:val="22"/>
+          <w:szCs w:val="22"/>
+          <w:lang w:val="en-US"/>
+        </w:rPr>
+        <w:t>3</w:t>
+      </w:r>
+      <w:r>
+        <w:rPr>
+          <w:rFonts w:ascii="Calibri" w:hAnsi="Calibri" w:cs="Calibri"/>
+          <w:color w:val="70AD47" w:themeColor="accent6"/>
+          <w:sz w:val="22"/>
+          <w:szCs w:val="22"/>
+          <w:lang w:val="en-US"/>
+        </w:rPr>
+        <w:t>/4 = 0.</w:t>
+      </w:r>
+      <w:r>
+        <w:rPr>
+          <w:rFonts w:ascii="Calibri" w:hAnsi="Calibri" w:cs="Calibri"/>
+          <w:color w:val="70AD47" w:themeColor="accent6"/>
+          <w:sz w:val="22"/>
+          <w:szCs w:val="22"/>
+          <w:lang w:val="en-US"/>
+        </w:rPr>
+        <w:t>75</w:t>
+      </w:r>
+    </w:p>
+    <w:p>
+      <w:pPr>
+        <w:pStyle w:val="NormalWeb"/>
+        <w:spacing w:before="0" w:beforeAutospacing="0" w:after="0" w:afterAutospacing="0"/>
+        <w:rPr>
+          <w:rFonts w:ascii="Calibri" w:hAnsi="Calibri" w:cs="Calibri"/>
+          <w:sz w:val="22"/>
+          <w:szCs w:val="22"/>
+          <w:lang w:val="en-US"/>
+        </w:rPr>
+      </w:pPr>
+      <w:r>
+        <w:rPr>
+          <w:rFonts w:ascii="Calibri" w:hAnsi="Calibri" w:cs="Calibri"/>
+          <w:sz w:val="22"/>
+          <w:szCs w:val="22"/>
+          <w:lang w:val="en-US"/>
+        </w:rPr>
+        <w:t>I</w:t>
+      </w:r>
+      <w:r>
+        <w:rPr>
+          <w:rFonts w:ascii="Calibri" w:hAnsi="Calibri" w:cs="Calibri"/>
+          <w:sz w:val="22"/>
+          <w:szCs w:val="22"/>
+          <w:lang w:val="en-US"/>
+        </w:rPr>
+        <w:t>4</w:t>
+      </w:r>
+      <w:r>
+        <w:rPr>
+          <w:rFonts w:ascii="Calibri" w:hAnsi="Calibri" w:cs="Calibri"/>
+          <w:sz w:val="22"/>
+          <w:szCs w:val="22"/>
+          <w:lang w:val="en-US"/>
+        </w:rPr>
+        <w:t xml:space="preserve"> -&gt; I</w:t>
+      </w:r>
+      <w:r>
+        <w:rPr>
+          <w:rFonts w:ascii="Calibri" w:hAnsi="Calibri" w:cs="Calibri"/>
+          <w:sz w:val="22"/>
+          <w:szCs w:val="22"/>
+          <w:lang w:val="en-US"/>
+        </w:rPr>
+        <w:t>5</w:t>
+      </w:r>
+      <w:r>
+        <w:rPr>
+          <w:rFonts w:ascii="Calibri" w:hAnsi="Calibri" w:cs="Calibri"/>
+          <w:sz w:val="22"/>
+          <w:szCs w:val="22"/>
+          <w:lang w:val="en-US"/>
+        </w:rPr>
+        <w:t>: confidence = 2/</w:t>
+      </w:r>
+      <w:r>
+        <w:rPr>
+          <w:rFonts w:ascii="Calibri" w:hAnsi="Calibri" w:cs="Calibri"/>
+          <w:sz w:val="22"/>
+          <w:szCs w:val="22"/>
+          <w:lang w:val="en-US"/>
+        </w:rPr>
+        <w:t>5</w:t>
+      </w:r>
+      <w:r>
+        <w:rPr>
+          <w:rFonts w:ascii="Calibri" w:hAnsi="Calibri" w:cs="Calibri"/>
+          <w:sz w:val="22"/>
+          <w:szCs w:val="22"/>
+          <w:lang w:val="en-US"/>
+        </w:rPr>
+        <w:t xml:space="preserve"> = 0.</w:t>
+      </w:r>
+      <w:r>
+        <w:rPr>
+          <w:rFonts w:ascii="Calibri" w:hAnsi="Calibri" w:cs="Calibri"/>
+          <w:sz w:val="22"/>
+          <w:szCs w:val="22"/>
+          <w:lang w:val="en-US"/>
+        </w:rPr>
+        <w:t>4</w:t>
+      </w:r>
+    </w:p>
+    <w:p>
+      <w:pPr>
+        <w:pStyle w:val="NormalWeb"/>
+        <w:spacing w:before="0" w:beforeAutospacing="0" w:after="0" w:afterAutospacing="0"/>
+        <w:rPr>
+          <w:rFonts w:ascii="Calibri" w:hAnsi="Calibri" w:cs="Calibri"/>
+          <w:sz w:val="22"/>
+          <w:szCs w:val="22"/>
+          <w:lang w:val="en-US"/>
+        </w:rPr>
+      </w:pPr>
+      <w:r>
+        <w:rPr>
+          <w:rFonts w:ascii="Calibri" w:hAnsi="Calibri" w:cs="Calibri"/>
+          <w:sz w:val="22"/>
+          <w:szCs w:val="22"/>
+          <w:lang w:val="en-US"/>
+        </w:rPr>
+        <w:t>I5 -&gt; I</w:t>
+      </w:r>
+      <w:r>
+        <w:rPr>
+          <w:rFonts w:ascii="Calibri" w:hAnsi="Calibri" w:cs="Calibri"/>
+          <w:sz w:val="22"/>
+          <w:szCs w:val="22"/>
+          <w:lang w:val="en-US"/>
+        </w:rPr>
+        <w:t>4</w:t>
+      </w:r>
+      <w:r>
+        <w:rPr>
+          <w:rFonts w:ascii="Calibri" w:hAnsi="Calibri" w:cs="Calibri"/>
+          <w:sz w:val="22"/>
+          <w:szCs w:val="22"/>
+          <w:lang w:val="en-US"/>
+        </w:rPr>
+        <w:t>: confidence = 2/4 = 0.5</w:t>
+      </w:r>
+    </w:p>
+    <w:p>
+      <w:pPr>
+        <w:pStyle w:val="NormalWeb"/>
+        <w:spacing w:before="0" w:beforeAutospacing="0" w:after="0" w:afterAutospacing="0"/>
+        <w:rPr>
+          <w:rFonts w:ascii="Calibri" w:hAnsi="Calibri" w:cs="Calibri"/>
+          <w:sz w:val="22"/>
+          <w:szCs w:val="22"/>
+          <w:lang w:val="en-US"/>
+        </w:rPr>
+      </w:pPr>
+    </w:p>
+    <w:p>
+      <w:pPr>
+        <w:pStyle w:val="NormalWeb"/>
+        <w:spacing w:before="0" w:beforeAutospacing="0" w:after="0" w:afterAutospacing="0"/>
+        <w:rPr>
+          <w:rFonts w:ascii="Calibri" w:hAnsi="Calibri" w:cs="Calibri"/>
+          <w:color w:val="70AD47" w:themeColor="accent6"/>
+          <w:sz w:val="22"/>
+          <w:szCs w:val="22"/>
+          <w:lang w:val="en-US"/>
+        </w:rPr>
+      </w:pPr>
+      <w:r>
+        <w:rPr>
+          <w:rFonts w:ascii="Calibri" w:hAnsi="Calibri" w:cs="Calibri"/>
+          <w:color w:val="70AD47" w:themeColor="accent6"/>
+          <w:sz w:val="22"/>
+          <w:szCs w:val="22"/>
+          <w:lang w:val="en-US"/>
+        </w:rPr>
+        <w:t xml:space="preserve">I2 &amp; I3 -&gt; I4: </w:t>
+      </w:r>
+      <w:r>
+        <w:rPr>
+          <w:rFonts w:ascii="Calibri" w:hAnsi="Calibri" w:cs="Calibri"/>
+          <w:color w:val="70AD47" w:themeColor="accent6"/>
+          <w:sz w:val="22"/>
+          <w:szCs w:val="22"/>
+          <w:lang w:val="en-US"/>
+        </w:rPr>
+        <w:t>confidence =</w:t>
+      </w:r>
+      <w:r>
+        <w:rPr>
+          <w:rFonts w:ascii="Calibri" w:hAnsi="Calibri" w:cs="Calibri"/>
+          <w:color w:val="70AD47" w:themeColor="accent6"/>
+          <w:sz w:val="22"/>
+          <w:szCs w:val="22"/>
+          <w:lang w:val="en-US"/>
+        </w:rPr>
+        <w:t xml:space="preserve"> 3/3 = 1</w:t>
+      </w:r>
+    </w:p>
+    <w:p>
+      <w:pPr>
+        <w:pStyle w:val="NormalWeb"/>
+        <w:spacing w:before="0" w:beforeAutospacing="0" w:after="0" w:afterAutospacing="0"/>
+        <w:rPr>
+          <w:rFonts w:ascii="Calibri" w:hAnsi="Calibri" w:cs="Calibri"/>
+          <w:color w:val="70AD47" w:themeColor="accent6"/>
+          <w:sz w:val="22"/>
+          <w:szCs w:val="22"/>
+          <w:lang w:val="en-US"/>
+        </w:rPr>
+      </w:pPr>
+      <w:r>
+        <w:rPr>
+          <w:rFonts w:ascii="Calibri" w:hAnsi="Calibri" w:cs="Calibri"/>
+          <w:color w:val="70AD47" w:themeColor="accent6"/>
+          <w:sz w:val="22"/>
+          <w:szCs w:val="22"/>
+          <w:lang w:val="en-US"/>
+        </w:rPr>
+        <w:t>I2 &amp; I</w:t>
+      </w:r>
+      <w:r>
+        <w:rPr>
+          <w:rFonts w:ascii="Calibri" w:hAnsi="Calibri" w:cs="Calibri"/>
+          <w:color w:val="70AD47" w:themeColor="accent6"/>
+          <w:sz w:val="22"/>
+          <w:szCs w:val="22"/>
+          <w:lang w:val="en-US"/>
+        </w:rPr>
+        <w:t>4</w:t>
+      </w:r>
+      <w:r>
+        <w:rPr>
+          <w:rFonts w:ascii="Calibri" w:hAnsi="Calibri" w:cs="Calibri"/>
+          <w:color w:val="70AD47" w:themeColor="accent6"/>
+          <w:sz w:val="22"/>
+          <w:szCs w:val="22"/>
+          <w:lang w:val="en-US"/>
+        </w:rPr>
+        <w:t xml:space="preserve"> -&gt; I</w:t>
+      </w:r>
+      <w:r>
+        <w:rPr>
+          <w:rFonts w:ascii="Calibri" w:hAnsi="Calibri" w:cs="Calibri"/>
+          <w:color w:val="70AD47" w:themeColor="accent6"/>
+          <w:sz w:val="22"/>
+          <w:szCs w:val="22"/>
+          <w:lang w:val="en-US"/>
+        </w:rPr>
+        <w:t>3</w:t>
+      </w:r>
+      <w:r>
+        <w:rPr>
+          <w:rFonts w:ascii="Calibri" w:hAnsi="Calibri" w:cs="Calibri"/>
+          <w:color w:val="70AD47" w:themeColor="accent6"/>
+          <w:sz w:val="22"/>
+          <w:szCs w:val="22"/>
+          <w:lang w:val="en-US"/>
+        </w:rPr>
+        <w:t>: confidence =</w:t>
+      </w:r>
+      <w:r>
+        <w:rPr>
+          <w:rFonts w:ascii="Calibri" w:hAnsi="Calibri" w:cs="Calibri"/>
+          <w:color w:val="70AD47" w:themeColor="accent6"/>
+          <w:sz w:val="22"/>
+          <w:szCs w:val="22"/>
+          <w:lang w:val="en-US"/>
+        </w:rPr>
+        <w:t xml:space="preserve"> ¾ = 0.75</w:t>
+      </w:r>
+    </w:p>
+    <w:p>
+      <w:pPr>
+        <w:pStyle w:val="NormalWeb"/>
+        <w:spacing w:before="0" w:beforeAutospacing="0" w:after="0" w:afterAutospacing="0"/>
+        <w:rPr>
+          <w:rFonts w:ascii="Calibri" w:hAnsi="Calibri" w:cs="Calibri"/>
+          <w:color w:val="70AD47" w:themeColor="accent6"/>
+          <w:sz w:val="22"/>
+          <w:szCs w:val="22"/>
+          <w:lang w:val="en-US"/>
+        </w:rPr>
+      </w:pPr>
+      <w:r>
+        <w:rPr>
+          <w:rFonts w:ascii="Calibri" w:hAnsi="Calibri" w:cs="Calibri"/>
+          <w:color w:val="70AD47" w:themeColor="accent6"/>
+          <w:sz w:val="22"/>
+          <w:szCs w:val="22"/>
+          <w:lang w:val="en-US"/>
+        </w:rPr>
+        <w:t>I</w:t>
+      </w:r>
+      <w:r>
+        <w:rPr>
+          <w:rFonts w:ascii="Calibri" w:hAnsi="Calibri" w:cs="Calibri"/>
+          <w:color w:val="70AD47" w:themeColor="accent6"/>
+          <w:sz w:val="22"/>
+          <w:szCs w:val="22"/>
+          <w:lang w:val="en-US"/>
+        </w:rPr>
+        <w:t>3</w:t>
+      </w:r>
+      <w:r>
+        <w:rPr>
+          <w:rFonts w:ascii="Calibri" w:hAnsi="Calibri" w:cs="Calibri"/>
+          <w:color w:val="70AD47" w:themeColor="accent6"/>
+          <w:sz w:val="22"/>
+          <w:szCs w:val="22"/>
+          <w:lang w:val="en-US"/>
+        </w:rPr>
+        <w:t xml:space="preserve"> &amp; I</w:t>
+      </w:r>
+      <w:r>
+        <w:rPr>
+          <w:rFonts w:ascii="Calibri" w:hAnsi="Calibri" w:cs="Calibri"/>
+          <w:color w:val="70AD47" w:themeColor="accent6"/>
+          <w:sz w:val="22"/>
+          <w:szCs w:val="22"/>
+          <w:lang w:val="en-US"/>
+        </w:rPr>
+        <w:t>4</w:t>
+      </w:r>
+      <w:r>
+        <w:rPr>
+          <w:rFonts w:ascii="Calibri" w:hAnsi="Calibri" w:cs="Calibri"/>
+          <w:color w:val="70AD47" w:themeColor="accent6"/>
+          <w:sz w:val="22"/>
+          <w:szCs w:val="22"/>
+          <w:lang w:val="en-US"/>
+        </w:rPr>
+        <w:t xml:space="preserve"> -&gt; I</w:t>
+      </w:r>
+      <w:r>
+        <w:rPr>
+          <w:rFonts w:ascii="Calibri" w:hAnsi="Calibri" w:cs="Calibri"/>
+          <w:color w:val="70AD47" w:themeColor="accent6"/>
+          <w:sz w:val="22"/>
+          <w:szCs w:val="22"/>
+          <w:lang w:val="en-US"/>
+        </w:rPr>
+        <w:t>2</w:t>
+      </w:r>
+      <w:r>
+        <w:rPr>
+          <w:rFonts w:ascii="Calibri" w:hAnsi="Calibri" w:cs="Calibri"/>
+          <w:color w:val="70AD47" w:themeColor="accent6"/>
+          <w:sz w:val="22"/>
+          <w:szCs w:val="22"/>
+          <w:lang w:val="en-US"/>
+        </w:rPr>
+        <w:t>: confidence =</w:t>
+      </w:r>
+      <w:r>
+        <w:rPr>
+          <w:rFonts w:ascii="Calibri" w:hAnsi="Calibri" w:cs="Calibri"/>
+          <w:color w:val="70AD47" w:themeColor="accent6"/>
+          <w:sz w:val="22"/>
+          <w:szCs w:val="22"/>
+          <w:lang w:val="en-US"/>
+        </w:rPr>
+        <w:t xml:space="preserve"> ¾ = 0.75</w:t>
+      </w:r>
+    </w:p>
+    <w:p>
+      <w:pPr>
+        <w:pStyle w:val="NormalWeb"/>
+        <w:spacing w:before="0" w:beforeAutospacing="0" w:after="0" w:afterAutospacing="0"/>
+        <w:rPr>
+          <w:rFonts w:ascii="Calibri" w:hAnsi="Calibri" w:cs="Calibri"/>
+          <w:color w:val="70AD47" w:themeColor="accent6"/>
+          <w:sz w:val="22"/>
+          <w:szCs w:val="22"/>
+          <w:lang w:val="en-US"/>
+        </w:rPr>
+      </w:pPr>
+      <w:r>
+        <w:rPr>
+          <w:rFonts w:ascii="Calibri" w:hAnsi="Calibri" w:cs="Calibri"/>
+          <w:color w:val="70AD47" w:themeColor="accent6"/>
+          <w:sz w:val="22"/>
+          <w:szCs w:val="22"/>
+          <w:lang w:val="en-US"/>
+        </w:rPr>
+        <w:t>I2 -&gt;</w:t>
+      </w:r>
+      <w:r>
+        <w:rPr>
+          <w:rFonts w:ascii="Calibri" w:hAnsi="Calibri" w:cs="Calibri"/>
+          <w:color w:val="70AD47" w:themeColor="accent6"/>
+          <w:sz w:val="22"/>
+          <w:szCs w:val="22"/>
+          <w:lang w:val="en-US"/>
+        </w:rPr>
+        <w:t xml:space="preserve"> I3 &amp;</w:t>
+      </w:r>
+      <w:r>
+        <w:rPr>
+          <w:rFonts w:ascii="Calibri" w:hAnsi="Calibri" w:cs="Calibri"/>
+          <w:color w:val="70AD47" w:themeColor="accent6"/>
+          <w:sz w:val="22"/>
+          <w:szCs w:val="22"/>
+          <w:lang w:val="en-US"/>
+        </w:rPr>
+        <w:t xml:space="preserve"> I4: confidence =</w:t>
+      </w:r>
+      <w:r>
+        <w:rPr>
+          <w:rFonts w:ascii="Calibri" w:hAnsi="Calibri" w:cs="Calibri"/>
+          <w:color w:val="70AD47" w:themeColor="accent6"/>
+          <w:sz w:val="22"/>
+          <w:szCs w:val="22"/>
+          <w:lang w:val="en-US"/>
+        </w:rPr>
+        <w:t xml:space="preserve"> ¾ = 0.75</w:t>
+      </w:r>
+    </w:p>
+    <w:p>
+      <w:pPr>
+        <w:pStyle w:val="NormalWeb"/>
+        <w:spacing w:before="0" w:beforeAutospacing="0" w:after="0" w:afterAutospacing="0"/>
+        <w:rPr>
+          <w:rFonts w:ascii="Calibri" w:hAnsi="Calibri" w:cs="Calibri"/>
+          <w:color w:val="70AD47" w:themeColor="accent6"/>
+          <w:sz w:val="22"/>
+          <w:szCs w:val="22"/>
+          <w:lang w:val="en-US"/>
+        </w:rPr>
+      </w:pPr>
+      <w:r>
+        <w:rPr>
+          <w:rFonts w:ascii="Calibri" w:hAnsi="Calibri" w:cs="Calibri"/>
+          <w:color w:val="70AD47" w:themeColor="accent6"/>
+          <w:sz w:val="22"/>
+          <w:szCs w:val="22"/>
+          <w:lang w:val="en-US"/>
+        </w:rPr>
+        <w:t>I</w:t>
+      </w:r>
+      <w:r>
+        <w:rPr>
+          <w:rFonts w:ascii="Calibri" w:hAnsi="Calibri" w:cs="Calibri"/>
+          <w:color w:val="70AD47" w:themeColor="accent6"/>
+          <w:sz w:val="22"/>
+          <w:szCs w:val="22"/>
+          <w:lang w:val="en-US"/>
+        </w:rPr>
+        <w:t>3</w:t>
+      </w:r>
+      <w:r>
+        <w:rPr>
+          <w:rFonts w:ascii="Calibri" w:hAnsi="Calibri" w:cs="Calibri"/>
+          <w:color w:val="70AD47" w:themeColor="accent6"/>
+          <w:sz w:val="22"/>
+          <w:szCs w:val="22"/>
+          <w:lang w:val="en-US"/>
+        </w:rPr>
+        <w:t xml:space="preserve"> -&gt; I</w:t>
+      </w:r>
+      <w:r>
+        <w:rPr>
+          <w:rFonts w:ascii="Calibri" w:hAnsi="Calibri" w:cs="Calibri"/>
+          <w:color w:val="70AD47" w:themeColor="accent6"/>
+          <w:sz w:val="22"/>
+          <w:szCs w:val="22"/>
+          <w:lang w:val="en-US"/>
+        </w:rPr>
+        <w:t>2</w:t>
+      </w:r>
+      <w:r>
+        <w:rPr>
+          <w:rFonts w:ascii="Calibri" w:hAnsi="Calibri" w:cs="Calibri"/>
+          <w:color w:val="70AD47" w:themeColor="accent6"/>
+          <w:sz w:val="22"/>
+          <w:szCs w:val="22"/>
+          <w:lang w:val="en-US"/>
+        </w:rPr>
+        <w:t xml:space="preserve"> &amp; I4: confidence =</w:t>
+      </w:r>
+      <w:r>
+        <w:rPr>
+          <w:rFonts w:ascii="Calibri" w:hAnsi="Calibri" w:cs="Calibri"/>
+          <w:color w:val="70AD47" w:themeColor="accent6"/>
+          <w:sz w:val="22"/>
+          <w:szCs w:val="22"/>
+          <w:lang w:val="en-US"/>
+        </w:rPr>
+        <w:t xml:space="preserve"> 3/5 = 0.6</w:t>
+      </w:r>
+    </w:p>
+    <w:p>
+      <w:pPr>
+        <w:pStyle w:val="NormalWeb"/>
+        <w:spacing w:before="0" w:beforeAutospacing="0" w:after="0" w:afterAutospacing="0"/>
+        <w:rPr>
+          <w:rFonts w:ascii="Calibri" w:hAnsi="Calibri" w:cs="Calibri"/>
+          <w:color w:val="70AD47" w:themeColor="accent6"/>
+          <w:sz w:val="22"/>
+          <w:szCs w:val="22"/>
+          <w:lang w:val="en-US"/>
+        </w:rPr>
+      </w:pPr>
+      <w:r>
+        <w:rPr>
+          <w:rFonts w:ascii="Calibri" w:hAnsi="Calibri" w:cs="Calibri"/>
+          <w:color w:val="70AD47" w:themeColor="accent6"/>
+          <w:sz w:val="22"/>
+          <w:szCs w:val="22"/>
+          <w:lang w:val="en-US"/>
+        </w:rPr>
+        <w:t>I</w:t>
+      </w:r>
+      <w:r>
+        <w:rPr>
+          <w:rFonts w:ascii="Calibri" w:hAnsi="Calibri" w:cs="Calibri"/>
+          <w:color w:val="70AD47" w:themeColor="accent6"/>
+          <w:sz w:val="22"/>
+          <w:szCs w:val="22"/>
+          <w:lang w:val="en-US"/>
+        </w:rPr>
+        <w:t>4</w:t>
+      </w:r>
+      <w:r>
+        <w:rPr>
+          <w:rFonts w:ascii="Calibri" w:hAnsi="Calibri" w:cs="Calibri"/>
+          <w:color w:val="70AD47" w:themeColor="accent6"/>
+          <w:sz w:val="22"/>
+          <w:szCs w:val="22"/>
+          <w:lang w:val="en-US"/>
+        </w:rPr>
+        <w:t xml:space="preserve"> -&gt; I</w:t>
+      </w:r>
+      <w:r>
+        <w:rPr>
+          <w:rFonts w:ascii="Calibri" w:hAnsi="Calibri" w:cs="Calibri"/>
+          <w:color w:val="70AD47" w:themeColor="accent6"/>
+          <w:sz w:val="22"/>
+          <w:szCs w:val="22"/>
+          <w:lang w:val="en-US"/>
+        </w:rPr>
+        <w:t>2</w:t>
+      </w:r>
+      <w:r>
+        <w:rPr>
+          <w:rFonts w:ascii="Calibri" w:hAnsi="Calibri" w:cs="Calibri"/>
+          <w:color w:val="70AD47" w:themeColor="accent6"/>
+          <w:sz w:val="22"/>
+          <w:szCs w:val="22"/>
+          <w:lang w:val="en-US"/>
+        </w:rPr>
+        <w:t xml:space="preserve"> &amp; I</w:t>
+      </w:r>
+      <w:r>
+        <w:rPr>
+          <w:rFonts w:ascii="Calibri" w:hAnsi="Calibri" w:cs="Calibri"/>
+          <w:color w:val="70AD47" w:themeColor="accent6"/>
+          <w:sz w:val="22"/>
+          <w:szCs w:val="22"/>
+          <w:lang w:val="en-US"/>
+        </w:rPr>
+        <w:t>3</w:t>
+      </w:r>
+      <w:r>
+        <w:rPr>
+          <w:rFonts w:ascii="Calibri" w:hAnsi="Calibri" w:cs="Calibri"/>
+          <w:color w:val="70AD47" w:themeColor="accent6"/>
+          <w:sz w:val="22"/>
+          <w:szCs w:val="22"/>
+          <w:lang w:val="en-US"/>
+        </w:rPr>
+        <w:t>: confidence =</w:t>
+      </w:r>
+      <w:r>
+        <w:rPr>
+          <w:rFonts w:ascii="Calibri" w:hAnsi="Calibri" w:cs="Calibri"/>
+          <w:color w:val="70AD47" w:themeColor="accent6"/>
+          <w:sz w:val="22"/>
+          <w:szCs w:val="22"/>
+          <w:lang w:val="en-US"/>
+        </w:rPr>
+        <w:t xml:space="preserve"> 3/5 = 0.6</w:t>
+      </w:r>
+    </w:p>
+    <w:p>
+      <w:pPr>
+        <w:pStyle w:val="NormalWeb"/>
+        <w:spacing w:before="0" w:beforeAutospacing="0" w:after="0" w:afterAutospacing="0"/>
+        <w:rPr>
+          <w:rFonts w:ascii="Calibri" w:hAnsi="Calibri" w:cs="Calibri"/>
+          <w:sz w:val="22"/>
+          <w:szCs w:val="22"/>
+          <w:lang w:val="en-US"/>
+        </w:rPr>
+      </w:pPr>
+    </w:p>
+    <w:p>
+      <w:pPr>
+        <w:pStyle w:val="NormalWeb"/>
+        <w:spacing w:before="0" w:beforeAutospacing="0" w:after="0" w:afterAutospacing="0"/>
+        <w:rPr>
+          <w:rFonts w:ascii="Calibri" w:hAnsi="Calibri" w:cs="Calibri"/>
+          <w:color w:val="000000" w:themeColor="text1"/>
+          <w:sz w:val="22"/>
+          <w:szCs w:val="22"/>
+          <w:lang w:val="en-US"/>
+        </w:rPr>
+      </w:pPr>
+      <w:r>
+        <w:rPr>
+          <w:rFonts w:ascii="Calibri" w:hAnsi="Calibri" w:cs="Calibri"/>
+          <w:color w:val="000000" w:themeColor="text1"/>
+          <w:sz w:val="22"/>
+          <w:szCs w:val="22"/>
+          <w:lang w:val="en-US"/>
+        </w:rPr>
+        <w:t>I</w:t>
+      </w:r>
+      <w:r>
+        <w:rPr>
+          <w:rFonts w:ascii="Calibri" w:hAnsi="Calibri" w:cs="Calibri"/>
+          <w:color w:val="000000" w:themeColor="text1"/>
+          <w:sz w:val="22"/>
+          <w:szCs w:val="22"/>
+          <w:lang w:val="en-US"/>
+        </w:rPr>
+        <w:t>3</w:t>
+      </w:r>
+      <w:r>
+        <w:rPr>
+          <w:rFonts w:ascii="Calibri" w:hAnsi="Calibri" w:cs="Calibri"/>
+          <w:color w:val="000000" w:themeColor="text1"/>
+          <w:sz w:val="22"/>
+          <w:szCs w:val="22"/>
+          <w:lang w:val="en-US"/>
+        </w:rPr>
+        <w:t xml:space="preserve"> &amp; I</w:t>
+      </w:r>
+      <w:r>
+        <w:rPr>
+          <w:rFonts w:ascii="Calibri" w:hAnsi="Calibri" w:cs="Calibri"/>
+          <w:color w:val="000000" w:themeColor="text1"/>
+          <w:sz w:val="22"/>
+          <w:szCs w:val="22"/>
+          <w:lang w:val="en-US"/>
+        </w:rPr>
+        <w:t>4</w:t>
+      </w:r>
+      <w:r>
+        <w:rPr>
+          <w:rFonts w:ascii="Calibri" w:hAnsi="Calibri" w:cs="Calibri"/>
+          <w:color w:val="000000" w:themeColor="text1"/>
+          <w:sz w:val="22"/>
+          <w:szCs w:val="22"/>
+          <w:lang w:val="en-US"/>
+        </w:rPr>
+        <w:t xml:space="preserve"> -&gt; I</w:t>
+      </w:r>
+      <w:r>
+        <w:rPr>
+          <w:rFonts w:ascii="Calibri" w:hAnsi="Calibri" w:cs="Calibri"/>
+          <w:color w:val="000000" w:themeColor="text1"/>
+          <w:sz w:val="22"/>
+          <w:szCs w:val="22"/>
+          <w:lang w:val="en-US"/>
+        </w:rPr>
+        <w:t>5</w:t>
+      </w:r>
+      <w:r>
+        <w:rPr>
+          <w:rFonts w:ascii="Calibri" w:hAnsi="Calibri" w:cs="Calibri"/>
+          <w:color w:val="000000" w:themeColor="text1"/>
+          <w:sz w:val="22"/>
+          <w:szCs w:val="22"/>
+          <w:lang w:val="en-US"/>
+        </w:rPr>
+        <w:t>: confidence =</w:t>
+      </w:r>
+      <w:r>
+        <w:rPr>
+          <w:rFonts w:ascii="Calibri" w:hAnsi="Calibri" w:cs="Calibri"/>
+          <w:color w:val="000000" w:themeColor="text1"/>
+          <w:sz w:val="22"/>
+          <w:szCs w:val="22"/>
+          <w:lang w:val="en-US"/>
+        </w:rPr>
+        <w:t xml:space="preserve"> 2/4 = 0.5</w:t>
+      </w:r>
+    </w:p>
+    <w:p>
+      <w:pPr>
+        <w:pStyle w:val="NormalWeb"/>
+        <w:spacing w:before="0" w:beforeAutospacing="0" w:after="0" w:afterAutospacing="0"/>
+        <w:rPr>
+          <w:rFonts w:ascii="Calibri" w:hAnsi="Calibri" w:cs="Calibri"/>
+          <w:color w:val="70AD47" w:themeColor="accent6"/>
+          <w:sz w:val="22"/>
+          <w:szCs w:val="22"/>
+          <w:lang w:val="en-US"/>
+        </w:rPr>
+      </w:pPr>
+      <w:r>
+        <w:rPr>
+          <w:rFonts w:ascii="Calibri" w:hAnsi="Calibri" w:cs="Calibri"/>
+          <w:color w:val="70AD47" w:themeColor="accent6"/>
+          <w:sz w:val="22"/>
+          <w:szCs w:val="22"/>
+          <w:lang w:val="en-US"/>
+        </w:rPr>
+        <w:t>I</w:t>
+      </w:r>
+      <w:r>
+        <w:rPr>
+          <w:rFonts w:ascii="Calibri" w:hAnsi="Calibri" w:cs="Calibri"/>
+          <w:color w:val="70AD47" w:themeColor="accent6"/>
+          <w:sz w:val="22"/>
+          <w:szCs w:val="22"/>
+          <w:lang w:val="en-US"/>
+        </w:rPr>
+        <w:t>3</w:t>
+      </w:r>
+      <w:r>
+        <w:rPr>
+          <w:rFonts w:ascii="Calibri" w:hAnsi="Calibri" w:cs="Calibri"/>
+          <w:color w:val="70AD47" w:themeColor="accent6"/>
+          <w:sz w:val="22"/>
+          <w:szCs w:val="22"/>
+          <w:lang w:val="en-US"/>
+        </w:rPr>
+        <w:t xml:space="preserve"> &amp; I</w:t>
+      </w:r>
+      <w:r>
+        <w:rPr>
+          <w:rFonts w:ascii="Calibri" w:hAnsi="Calibri" w:cs="Calibri"/>
+          <w:color w:val="70AD47" w:themeColor="accent6"/>
+          <w:sz w:val="22"/>
+          <w:szCs w:val="22"/>
+          <w:lang w:val="en-US"/>
+        </w:rPr>
+        <w:t>5</w:t>
+      </w:r>
+      <w:r>
+        <w:rPr>
+          <w:rFonts w:ascii="Calibri" w:hAnsi="Calibri" w:cs="Calibri"/>
+          <w:color w:val="70AD47" w:themeColor="accent6"/>
+          <w:sz w:val="22"/>
+          <w:szCs w:val="22"/>
+          <w:lang w:val="en-US"/>
+        </w:rPr>
+        <w:t xml:space="preserve"> -&gt; I</w:t>
+      </w:r>
+      <w:r>
+        <w:rPr>
+          <w:rFonts w:ascii="Calibri" w:hAnsi="Calibri" w:cs="Calibri"/>
+          <w:color w:val="70AD47" w:themeColor="accent6"/>
+          <w:sz w:val="22"/>
+          <w:szCs w:val="22"/>
+          <w:lang w:val="en-US"/>
+        </w:rPr>
+        <w:t>4</w:t>
+      </w:r>
+      <w:r>
+        <w:rPr>
+          <w:rFonts w:ascii="Calibri" w:hAnsi="Calibri" w:cs="Calibri"/>
+          <w:color w:val="70AD47" w:themeColor="accent6"/>
+          <w:sz w:val="22"/>
+          <w:szCs w:val="22"/>
+          <w:lang w:val="en-US"/>
+        </w:rPr>
+        <w:t>: confidence =</w:t>
+      </w:r>
+      <w:r>
+        <w:rPr>
+          <w:rFonts w:ascii="Calibri" w:hAnsi="Calibri" w:cs="Calibri"/>
+          <w:color w:val="70AD47" w:themeColor="accent6"/>
+          <w:sz w:val="22"/>
+          <w:szCs w:val="22"/>
+          <w:lang w:val="en-US"/>
+        </w:rPr>
+        <w:t xml:space="preserve"> 2/3 = 0.67</w:t>
+      </w:r>
+    </w:p>
+    <w:p>
+      <w:pPr>
+        <w:pStyle w:val="NormalWeb"/>
+        <w:spacing w:before="0" w:beforeAutospacing="0" w:after="0" w:afterAutospacing="0"/>
+        <w:rPr>
+          <w:rFonts w:ascii="Calibri" w:hAnsi="Calibri" w:cs="Calibri"/>
+          <w:color w:val="70AD47" w:themeColor="accent6"/>
+          <w:sz w:val="22"/>
+          <w:szCs w:val="22"/>
+          <w:lang w:val="en-US"/>
+        </w:rPr>
+      </w:pPr>
+      <w:r>
+        <w:rPr>
+          <w:rFonts w:ascii="Calibri" w:hAnsi="Calibri" w:cs="Calibri"/>
+          <w:color w:val="70AD47" w:themeColor="accent6"/>
+          <w:sz w:val="22"/>
+          <w:szCs w:val="22"/>
+          <w:lang w:val="en-US"/>
+        </w:rPr>
+        <w:t>I</w:t>
+      </w:r>
+      <w:r>
+        <w:rPr>
+          <w:rFonts w:ascii="Calibri" w:hAnsi="Calibri" w:cs="Calibri"/>
+          <w:color w:val="70AD47" w:themeColor="accent6"/>
+          <w:sz w:val="22"/>
+          <w:szCs w:val="22"/>
+          <w:lang w:val="en-US"/>
+        </w:rPr>
+        <w:t>4</w:t>
+      </w:r>
+      <w:r>
+        <w:rPr>
+          <w:rFonts w:ascii="Calibri" w:hAnsi="Calibri" w:cs="Calibri"/>
+          <w:color w:val="70AD47" w:themeColor="accent6"/>
+          <w:sz w:val="22"/>
+          <w:szCs w:val="22"/>
+          <w:lang w:val="en-US"/>
+        </w:rPr>
+        <w:t xml:space="preserve"> &amp; I</w:t>
+      </w:r>
+      <w:r>
+        <w:rPr>
+          <w:rFonts w:ascii="Calibri" w:hAnsi="Calibri" w:cs="Calibri"/>
+          <w:color w:val="70AD47" w:themeColor="accent6"/>
+          <w:sz w:val="22"/>
+          <w:szCs w:val="22"/>
+          <w:lang w:val="en-US"/>
+        </w:rPr>
+        <w:t>5</w:t>
+      </w:r>
+      <w:r>
+        <w:rPr>
+          <w:rFonts w:ascii="Calibri" w:hAnsi="Calibri" w:cs="Calibri"/>
+          <w:color w:val="70AD47" w:themeColor="accent6"/>
+          <w:sz w:val="22"/>
+          <w:szCs w:val="22"/>
+          <w:lang w:val="en-US"/>
+        </w:rPr>
+        <w:t xml:space="preserve"> -&gt; I</w:t>
+      </w:r>
+      <w:r>
+        <w:rPr>
+          <w:rFonts w:ascii="Calibri" w:hAnsi="Calibri" w:cs="Calibri"/>
+          <w:color w:val="70AD47" w:themeColor="accent6"/>
+          <w:sz w:val="22"/>
+          <w:szCs w:val="22"/>
+          <w:lang w:val="en-US"/>
+        </w:rPr>
+        <w:t>3</w:t>
+      </w:r>
+      <w:r>
+        <w:rPr>
+          <w:rFonts w:ascii="Calibri" w:hAnsi="Calibri" w:cs="Calibri"/>
+          <w:color w:val="70AD47" w:themeColor="accent6"/>
+          <w:sz w:val="22"/>
+          <w:szCs w:val="22"/>
+          <w:lang w:val="en-US"/>
+        </w:rPr>
+        <w:t>: confidence =</w:t>
+      </w:r>
+      <w:r>
+        <w:rPr>
+          <w:rFonts w:ascii="Calibri" w:hAnsi="Calibri" w:cs="Calibri"/>
+          <w:color w:val="70AD47" w:themeColor="accent6"/>
+          <w:sz w:val="22"/>
+          <w:szCs w:val="22"/>
+          <w:lang w:val="en-US"/>
+        </w:rPr>
+        <w:t xml:space="preserve"> 2/2 = 1</w:t>
+      </w:r>
+    </w:p>
+    <w:p>
+      <w:pPr>
+        <w:pStyle w:val="NormalWeb"/>
+        <w:spacing w:before="0" w:beforeAutospacing="0" w:after="0" w:afterAutospacing="0"/>
+        <w:rPr>
+          <w:rFonts w:ascii="Calibri" w:hAnsi="Calibri" w:cs="Calibri"/>
+          <w:color w:val="000000" w:themeColor="text1"/>
+          <w:sz w:val="22"/>
+          <w:szCs w:val="22"/>
+          <w:lang w:val="en-US"/>
+        </w:rPr>
+      </w:pPr>
+      <w:r>
+        <w:rPr>
+          <w:rFonts w:ascii="Calibri" w:hAnsi="Calibri" w:cs="Calibri"/>
+          <w:color w:val="000000" w:themeColor="text1"/>
+          <w:sz w:val="22"/>
+          <w:szCs w:val="22"/>
+          <w:lang w:val="en-US"/>
+        </w:rPr>
+        <w:t>I</w:t>
+      </w:r>
+      <w:r>
+        <w:rPr>
+          <w:rFonts w:ascii="Calibri" w:hAnsi="Calibri" w:cs="Calibri"/>
+          <w:color w:val="000000" w:themeColor="text1"/>
+          <w:sz w:val="22"/>
+          <w:szCs w:val="22"/>
+          <w:lang w:val="en-US"/>
+        </w:rPr>
+        <w:t>3</w:t>
+      </w:r>
+      <w:r>
+        <w:rPr>
+          <w:rFonts w:ascii="Calibri" w:hAnsi="Calibri" w:cs="Calibri"/>
+          <w:color w:val="000000" w:themeColor="text1"/>
+          <w:sz w:val="22"/>
+          <w:szCs w:val="22"/>
+          <w:lang w:val="en-US"/>
+        </w:rPr>
+        <w:t xml:space="preserve"> -&gt; I4</w:t>
+      </w:r>
+      <w:r>
+        <w:rPr>
+          <w:rFonts w:ascii="Calibri" w:hAnsi="Calibri" w:cs="Calibri"/>
+          <w:color w:val="000000" w:themeColor="text1"/>
+          <w:sz w:val="22"/>
+          <w:szCs w:val="22"/>
+          <w:lang w:val="en-US"/>
+        </w:rPr>
+        <w:t xml:space="preserve"> &amp; I5</w:t>
+      </w:r>
+      <w:r>
+        <w:rPr>
+          <w:rFonts w:ascii="Calibri" w:hAnsi="Calibri" w:cs="Calibri"/>
+          <w:color w:val="000000" w:themeColor="text1"/>
+          <w:sz w:val="22"/>
+          <w:szCs w:val="22"/>
+          <w:lang w:val="en-US"/>
+        </w:rPr>
+        <w:t>: confidence =</w:t>
+      </w:r>
+      <w:r>
+        <w:rPr>
+          <w:rFonts w:ascii="Calibri" w:hAnsi="Calibri" w:cs="Calibri"/>
+          <w:color w:val="000000" w:themeColor="text1"/>
+          <w:sz w:val="22"/>
+          <w:szCs w:val="22"/>
+          <w:lang w:val="en-US"/>
+        </w:rPr>
+        <w:t xml:space="preserve"> 2/5 = 0.4</w:t>
+      </w:r>
+    </w:p>
+    <w:p>
+      <w:pPr>
+        <w:pStyle w:val="NormalWeb"/>
+        <w:spacing w:before="0" w:beforeAutospacing="0" w:after="0" w:afterAutospacing="0"/>
+        <w:rPr>
+          <w:rFonts w:ascii="Calibri" w:hAnsi="Calibri" w:cs="Calibri"/>
+          <w:color w:val="000000" w:themeColor="text1"/>
+          <w:sz w:val="22"/>
+          <w:szCs w:val="22"/>
+          <w:lang w:val="en-US"/>
+        </w:rPr>
+      </w:pPr>
+      <w:r>
+        <w:rPr>
+          <w:rFonts w:ascii="Calibri" w:hAnsi="Calibri" w:cs="Calibri"/>
+          <w:color w:val="000000" w:themeColor="text1"/>
+          <w:sz w:val="22"/>
+          <w:szCs w:val="22"/>
+          <w:lang w:val="en-US"/>
+        </w:rPr>
+        <w:t>I</w:t>
+      </w:r>
+      <w:r>
+        <w:rPr>
+          <w:rFonts w:ascii="Calibri" w:hAnsi="Calibri" w:cs="Calibri"/>
+          <w:color w:val="000000" w:themeColor="text1"/>
+          <w:sz w:val="22"/>
+          <w:szCs w:val="22"/>
+          <w:lang w:val="en-US"/>
+        </w:rPr>
+        <w:t>4</w:t>
+      </w:r>
+      <w:r>
+        <w:rPr>
+          <w:rFonts w:ascii="Calibri" w:hAnsi="Calibri" w:cs="Calibri"/>
+          <w:color w:val="000000" w:themeColor="text1"/>
+          <w:sz w:val="22"/>
+          <w:szCs w:val="22"/>
+          <w:lang w:val="en-US"/>
+        </w:rPr>
+        <w:t xml:space="preserve"> -&gt; I</w:t>
+      </w:r>
+      <w:r>
+        <w:rPr>
+          <w:rFonts w:ascii="Calibri" w:hAnsi="Calibri" w:cs="Calibri"/>
+          <w:color w:val="000000" w:themeColor="text1"/>
+          <w:sz w:val="22"/>
+          <w:szCs w:val="22"/>
+          <w:lang w:val="en-US"/>
+        </w:rPr>
+        <w:t>3</w:t>
+      </w:r>
+      <w:r>
+        <w:rPr>
+          <w:rFonts w:ascii="Calibri" w:hAnsi="Calibri" w:cs="Calibri"/>
+          <w:color w:val="000000" w:themeColor="text1"/>
+          <w:sz w:val="22"/>
+          <w:szCs w:val="22"/>
+          <w:lang w:val="en-US"/>
+        </w:rPr>
+        <w:t xml:space="preserve"> &amp; I5</w:t>
+      </w:r>
+      <w:r>
+        <w:rPr>
+          <w:rFonts w:ascii="Calibri" w:hAnsi="Calibri" w:cs="Calibri"/>
+          <w:color w:val="000000" w:themeColor="text1"/>
+          <w:sz w:val="22"/>
+          <w:szCs w:val="22"/>
+          <w:lang w:val="en-US"/>
+        </w:rPr>
+        <w:t>: confidence =</w:t>
+      </w:r>
+      <w:r>
+        <w:rPr>
+          <w:rFonts w:ascii="Calibri" w:hAnsi="Calibri" w:cs="Calibri"/>
+          <w:color w:val="000000" w:themeColor="text1"/>
+          <w:sz w:val="22"/>
+          <w:szCs w:val="22"/>
+          <w:lang w:val="en-US"/>
+        </w:rPr>
+        <w:t xml:space="preserve"> 2/5 = 0.4</w:t>
+      </w:r>
+    </w:p>
+    <w:p>
+      <w:pPr>
+        <w:pStyle w:val="NormalWeb"/>
+        <w:spacing w:before="0" w:beforeAutospacing="0" w:after="0" w:afterAutospacing="0"/>
+        <w:rPr>
+          <w:rFonts w:ascii="Calibri" w:hAnsi="Calibri" w:cs="Calibri"/>
+          <w:color w:val="000000" w:themeColor="text1"/>
+          <w:sz w:val="22"/>
+          <w:szCs w:val="22"/>
+          <w:lang w:val="en-US"/>
+        </w:rPr>
+      </w:pPr>
+      <w:r>
+        <w:rPr>
+          <w:rFonts w:ascii="Calibri" w:hAnsi="Calibri" w:cs="Calibri"/>
+          <w:color w:val="000000" w:themeColor="text1"/>
+          <w:sz w:val="22"/>
+          <w:szCs w:val="22"/>
+          <w:lang w:val="en-US"/>
+        </w:rPr>
+        <w:t>I</w:t>
+      </w:r>
+      <w:r>
+        <w:rPr>
+          <w:rFonts w:ascii="Calibri" w:hAnsi="Calibri" w:cs="Calibri"/>
+          <w:color w:val="000000" w:themeColor="text1"/>
+          <w:sz w:val="22"/>
+          <w:szCs w:val="22"/>
+          <w:lang w:val="en-US"/>
+        </w:rPr>
+        <w:t>5</w:t>
+      </w:r>
+      <w:r>
+        <w:rPr>
+          <w:rFonts w:ascii="Calibri" w:hAnsi="Calibri" w:cs="Calibri"/>
+          <w:color w:val="000000" w:themeColor="text1"/>
+          <w:sz w:val="22"/>
+          <w:szCs w:val="22"/>
+          <w:lang w:val="en-US"/>
+        </w:rPr>
+        <w:t xml:space="preserve"> -&gt; I4</w:t>
+      </w:r>
+      <w:r>
+        <w:rPr>
+          <w:rFonts w:ascii="Calibri" w:hAnsi="Calibri" w:cs="Calibri"/>
+          <w:color w:val="000000" w:themeColor="text1"/>
+          <w:sz w:val="22"/>
+          <w:szCs w:val="22"/>
+          <w:lang w:val="en-US"/>
+        </w:rPr>
+        <w:t xml:space="preserve"> &amp; I</w:t>
+      </w:r>
+      <w:r>
+        <w:rPr>
+          <w:rFonts w:ascii="Calibri" w:hAnsi="Calibri" w:cs="Calibri"/>
+          <w:color w:val="000000" w:themeColor="text1"/>
+          <w:sz w:val="22"/>
+          <w:szCs w:val="22"/>
+          <w:lang w:val="en-US"/>
+        </w:rPr>
+        <w:t>3</w:t>
+      </w:r>
+      <w:r>
+        <w:rPr>
+          <w:rFonts w:ascii="Calibri" w:hAnsi="Calibri" w:cs="Calibri"/>
+          <w:color w:val="000000" w:themeColor="text1"/>
+          <w:sz w:val="22"/>
+          <w:szCs w:val="22"/>
+          <w:lang w:val="en-US"/>
+        </w:rPr>
+        <w:t>: confidence =</w:t>
+      </w:r>
+      <w:r>
+        <w:rPr>
+          <w:rFonts w:ascii="Calibri" w:hAnsi="Calibri" w:cs="Calibri"/>
+          <w:color w:val="000000" w:themeColor="text1"/>
+          <w:sz w:val="22"/>
+          <w:szCs w:val="22"/>
+          <w:lang w:val="en-US"/>
+        </w:rPr>
+        <w:t xml:space="preserve"> 2/4 = 0.5</w:t>
+      </w:r>
+    </w:p>
+    <w:p>
+      <w:pPr>
+        <w:pStyle w:val="NormalWeb"/>
+        <w:spacing w:before="0" w:beforeAutospacing="0" w:after="0" w:afterAutospacing="0"/>
+        <w:rPr>
+          <w:rFonts w:ascii="Calibri" w:hAnsi="Calibri" w:cs="Calibri"/>
+          <w:sz w:val="22"/>
+          <w:szCs w:val="22"/>
+          <w:lang w:val="en-US"/>
+        </w:rPr>
+      </w:pPr>
     </w:p>
     <w:p>
       <w:pPr>

</xml_diff>

<commit_message>
hw3 q3 association rules
</commit_message>
<xml_diff>
--- a/data_mining/839/hw3.docx
+++ b/data_mining/839/hw3.docx
@@ -3901,7 +3901,7 @@
                 </mc:Choice>
                 <mc:Fallback>
                   <w:pict>
-                    <v:oval w14:anchorId="1B96EFD7" id="Oval 7" o:spid="_x0000_s1026" style="position:absolute;margin-left:23.05pt;margin-top:13.3pt;width:25.5pt;height:16pt;z-index:251723776;visibility:visible;mso-wrap-style:square;mso-width-percent:0;mso-height-percent:0;mso-wrap-distance-left:9pt;mso-wrap-distance-top:0;mso-wrap-distance-right:9pt;mso-wrap-distance-bottom:0;mso-position-horizontal:absolute;mso-position-horizontal-relative:text;mso-position-vertical:absolute;mso-position-vertical-relative:text;mso-width-percent:0;mso-height-percent:0;mso-width-relative:margin;mso-height-relative:margin;v-text-anchor:middle" o:gfxdata="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" filled="f" strokecolor="red" strokeweight="1pt">
+                    <v:oval w14:anchorId="2D108469" id="Oval 7" o:spid="_x0000_s1026" style="position:absolute;margin-left:23.05pt;margin-top:13.3pt;width:25.5pt;height:16pt;z-index:251723776;visibility:visible;mso-wrap-style:square;mso-width-percent:0;mso-height-percent:0;mso-wrap-distance-left:9pt;mso-wrap-distance-top:0;mso-wrap-distance-right:9pt;mso-wrap-distance-bottom:0;mso-position-horizontal:absolute;mso-position-horizontal-relative:text;mso-position-vertical:absolute;mso-position-vertical-relative:text;mso-width-percent:0;mso-height-percent:0;mso-width-relative:margin;mso-height-relative:margin;v-text-anchor:middle" o:gfxdata="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" filled="f" strokecolor="red" strokeweight="1pt">
                       <v:stroke joinstyle="miter"/>
                     </v:oval>
                   </w:pict>
@@ -4181,7 +4181,7 @@
                 </mc:Choice>
                 <mc:Fallback>
                   <w:pict>
-                    <v:oval w14:anchorId="0094B194" id="Oval 2" o:spid="_x0000_s1026" style="position:absolute;margin-left:-4.65pt;margin-top:-.2pt;width:25.5pt;height:16pt;z-index:251734016;visibility:visible;mso-wrap-style:square;mso-width-percent:0;mso-wrap-distance-left:9pt;mso-wrap-distance-top:0;mso-wrap-distance-right:9pt;mso-wrap-distance-bottom:0;mso-position-horizontal:absolute;mso-position-horizontal-relative:text;mso-position-vertical:absolute;mso-position-vertical-relative:text;mso-width-percent:0;mso-width-relative:margin;v-text-anchor:middle" o:gfxdata="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" filled="f" strokecolor="red" strokeweight="1pt">
+                    <v:oval w14:anchorId="7B6838C3" id="Oval 2" o:spid="_x0000_s1026" style="position:absolute;margin-left:-4.65pt;margin-top:-.2pt;width:25.5pt;height:16pt;z-index:251734016;visibility:visible;mso-wrap-style:square;mso-width-percent:0;mso-wrap-distance-left:9pt;mso-wrap-distance-top:0;mso-wrap-distance-right:9pt;mso-wrap-distance-bottom:0;mso-position-horizontal:absolute;mso-position-horizontal-relative:text;mso-position-vertical:absolute;mso-position-vertical-relative:text;mso-width-percent:0;mso-width-relative:margin;v-text-anchor:middle" o:gfxdata="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" filled="f" strokecolor="red" strokeweight="1pt">
                       <v:stroke joinstyle="miter"/>
                     </v:oval>
                   </w:pict>
@@ -4335,7 +4335,7 @@
                 </mc:Choice>
                 <mc:Fallback>
                   <w:pict>
-                    <v:oval w14:anchorId="037ECF48" id="Oval 4" o:spid="_x0000_s1026" style="position:absolute;margin-left:28.9pt;margin-top:13.4pt;width:25.5pt;height:16pt;z-index:251737088;visibility:visible;mso-wrap-style:square;mso-width-percent:0;mso-height-percent:0;mso-wrap-distance-left:9pt;mso-wrap-distance-top:0;mso-wrap-distance-right:9pt;mso-wrap-distance-bottom:0;mso-position-horizontal:absolute;mso-position-horizontal-relative:text;mso-position-vertical:absolute;mso-position-vertical-relative:text;mso-width-percent:0;mso-height-percent:0;mso-width-relative:margin;mso-height-relative:margin;v-text-anchor:middle" o:gfxdata="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" filled="f" strokecolor="red" strokeweight="1pt">
+                    <v:oval w14:anchorId="2FF1A2F4" id="Oval 4" o:spid="_x0000_s1026" style="position:absolute;margin-left:28.9pt;margin-top:13.4pt;width:25.5pt;height:16pt;z-index:251737088;visibility:visible;mso-wrap-style:square;mso-width-percent:0;mso-height-percent:0;mso-wrap-distance-left:9pt;mso-wrap-distance-top:0;mso-wrap-distance-right:9pt;mso-wrap-distance-bottom:0;mso-position-horizontal:absolute;mso-position-horizontal-relative:text;mso-position-vertical:absolute;mso-position-vertical-relative:text;mso-width-percent:0;mso-height-percent:0;mso-width-relative:margin;mso-height-relative:margin;v-text-anchor:middle" o:gfxdata="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" filled="f" strokecolor="red" strokeweight="1pt">
                       <v:stroke joinstyle="miter"/>
                     </v:oval>
                   </w:pict>
@@ -5153,7 +5153,7 @@
                 </mc:Choice>
                 <mc:Fallback>
                   <w:pict>
-                    <v:oval w14:anchorId="33A3B14C" id="Oval 8" o:spid="_x0000_s1026" style="position:absolute;margin-left:28.7pt;margin-top:13.5pt;width:25.5pt;height:16pt;z-index:251739136;visibility:visible;mso-wrap-style:square;mso-width-percent:0;mso-height-percent:0;mso-wrap-distance-left:9pt;mso-wrap-distance-top:0;mso-wrap-distance-right:9pt;mso-wrap-distance-bottom:0;mso-position-horizontal:absolute;mso-position-horizontal-relative:text;mso-position-vertical:absolute;mso-position-vertical-relative:text;mso-width-percent:0;mso-height-percent:0;mso-width-relative:margin;mso-height-relative:margin;v-text-anchor:middle" o:gfxdata="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" filled="f" strokecolor="red" strokeweight="1pt">
+                    <v:oval w14:anchorId="46B29DD7" id="Oval 8" o:spid="_x0000_s1026" style="position:absolute;margin-left:28.7pt;margin-top:13.5pt;width:25.5pt;height:16pt;z-index:251739136;visibility:visible;mso-wrap-style:square;mso-width-percent:0;mso-height-percent:0;mso-wrap-distance-left:9pt;mso-wrap-distance-top:0;mso-wrap-distance-right:9pt;mso-wrap-distance-bottom:0;mso-position-horizontal:absolute;mso-position-horizontal-relative:text;mso-position-vertical:absolute;mso-position-vertical-relative:text;mso-width-percent:0;mso-height-percent:0;mso-width-relative:margin;mso-height-relative:margin;v-text-anchor:middle" o:gfxdata="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" filled="f" strokecolor="red" strokeweight="1pt">
                       <v:stroke joinstyle="miter"/>
                     </v:oval>
                   </w:pict>
@@ -5446,7 +5446,7 @@
                 </mc:Choice>
                 <mc:Fallback>
                   <w:pict>
-                    <v:oval w14:anchorId="2D29FA88" id="Oval 3" o:spid="_x0000_s1026" style="position:absolute;margin-left:-3.05pt;margin-top:13.2pt;width:25.5pt;height:16pt;z-index:251735040;visibility:visible;mso-wrap-style:square;mso-width-percent:0;mso-wrap-distance-left:9pt;mso-wrap-distance-top:0;mso-wrap-distance-right:9pt;mso-wrap-distance-bottom:0;mso-position-horizontal:absolute;mso-position-horizontal-relative:text;mso-position-vertical:absolute;mso-position-vertical-relative:text;mso-width-percent:0;mso-width-relative:margin;v-text-anchor:middle" o:gfxdata="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" filled="f" strokecolor="red" strokeweight="1pt">
+                    <v:oval w14:anchorId="62B376A6" id="Oval 3" o:spid="_x0000_s1026" style="position:absolute;margin-left:-3.05pt;margin-top:13.2pt;width:25.5pt;height:16pt;z-index:251735040;visibility:visible;mso-wrap-style:square;mso-width-percent:0;mso-wrap-distance-left:9pt;mso-wrap-distance-top:0;mso-wrap-distance-right:9pt;mso-wrap-distance-bottom:0;mso-position-horizontal:absolute;mso-position-horizontal-relative:text;mso-position-vertical:absolute;mso-position-vertical-relative:text;mso-width-percent:0;mso-width-relative:margin;v-text-anchor:middle" o:gfxdata="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" filled="f" strokecolor="red" strokeweight="1pt">
                       <v:stroke joinstyle="miter"/>
                     </v:oval>
                   </w:pict>
@@ -5829,7 +5829,7 @@
                 </mc:Choice>
                 <mc:Fallback>
                   <w:pict>
-                    <v:oval w14:anchorId="1F3327FC" id="Oval 1" o:spid="_x0000_s1026" style="position:absolute;margin-left:-3.5pt;margin-top:13.05pt;width:30.5pt;height:16pt;z-index:251732992;visibility:visible;mso-wrap-style:square;mso-wrap-distance-left:9pt;mso-wrap-distance-top:0;mso-wrap-distance-right:9pt;mso-wrap-distance-bottom:0;mso-position-horizontal:absolute;mso-position-horizontal-relative:text;mso-position-vertical:absolute;mso-position-vertical-relative:text;v-text-anchor:middle" o:gfxdata="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" filled="f" strokecolor="red" strokeweight="1pt">
+                    <v:oval w14:anchorId="01AC2DCC" id="Oval 1" o:spid="_x0000_s1026" style="position:absolute;margin-left:-3.5pt;margin-top:13.05pt;width:30.5pt;height:16pt;z-index:251732992;visibility:visible;mso-wrap-style:square;mso-wrap-distance-left:9pt;mso-wrap-distance-top:0;mso-wrap-distance-right:9pt;mso-wrap-distance-bottom:0;mso-position-horizontal:absolute;mso-position-horizontal-relative:text;mso-position-vertical:absolute;mso-position-vertical-relative:text;v-text-anchor:middle" o:gfxdata="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" filled="f" strokecolor="red" strokeweight="1pt">
                       <v:stroke joinstyle="miter"/>
                     </v:oval>
                   </w:pict>
@@ -5990,7 +5990,7 @@
                 </mc:Choice>
                 <mc:Fallback>
                   <w:pict>
-                    <v:oval w14:anchorId="744E4934" id="Oval 5" o:spid="_x0000_s1026" style="position:absolute;margin-left:36.95pt;margin-top:13.05pt;width:25.5pt;height:16pt;z-index:251736064;visibility:visible;mso-wrap-style:square;mso-width-percent:0;mso-wrap-distance-left:9pt;mso-wrap-distance-top:0;mso-wrap-distance-right:9pt;mso-wrap-distance-bottom:0;mso-position-horizontal:absolute;mso-position-horizontal-relative:text;mso-position-vertical:absolute;mso-position-vertical-relative:text;mso-width-percent:0;mso-width-relative:margin;v-text-anchor:middle" o:gfxdata="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" filled="f" strokecolor="red" strokeweight="1pt">
+                    <v:oval w14:anchorId="68667DE6" id="Oval 5" o:spid="_x0000_s1026" style="position:absolute;margin-left:36.95pt;margin-top:13.05pt;width:25.5pt;height:16pt;z-index:251736064;visibility:visible;mso-wrap-style:square;mso-width-percent:0;mso-wrap-distance-left:9pt;mso-wrap-distance-top:0;mso-wrap-distance-right:9pt;mso-wrap-distance-bottom:0;mso-position-horizontal:absolute;mso-position-horizontal-relative:text;mso-position-vertical:absolute;mso-position-vertical-relative:text;mso-width-percent:0;mso-width-relative:margin;v-text-anchor:middle" o:gfxdata="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" filled="f" strokecolor="red" strokeweight="1pt">
                       <v:stroke joinstyle="miter"/>
                     </v:oval>
                   </w:pict>
@@ -6487,7 +6487,7 @@
                 </mc:Choice>
                 <mc:Fallback>
                   <w:pict>
-                    <v:oval w14:anchorId="768D905F" id="Oval 6" o:spid="_x0000_s1026" style="position:absolute;margin-left:29.95pt;margin-top:12.7pt;width:25.5pt;height:16pt;z-index:251738112;visibility:visible;mso-wrap-style:square;mso-width-percent:0;mso-height-percent:0;mso-wrap-distance-left:9pt;mso-wrap-distance-top:0;mso-wrap-distance-right:9pt;mso-wrap-distance-bottom:0;mso-position-horizontal:absolute;mso-position-horizontal-relative:text;mso-position-vertical:absolute;mso-position-vertical-relative:text;mso-width-percent:0;mso-height-percent:0;mso-width-relative:margin;mso-height-relative:margin;v-text-anchor:middle" o:gfxdata="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" filled="f" strokecolor="red" strokeweight="1pt">
+                    <v:oval w14:anchorId="2BBB9B7A" id="Oval 6" o:spid="_x0000_s1026" style="position:absolute;margin-left:29.95pt;margin-top:12.7pt;width:25.5pt;height:16pt;z-index:251738112;visibility:visible;mso-wrap-style:square;mso-width-percent:0;mso-height-percent:0;mso-wrap-distance-left:9pt;mso-wrap-distance-top:0;mso-wrap-distance-right:9pt;mso-wrap-distance-bottom:0;mso-position-horizontal:absolute;mso-position-horizontal-relative:text;mso-position-vertical:absolute;mso-position-vertical-relative:text;mso-width-percent:0;mso-height-percent:0;mso-width-relative:margin;mso-height-relative:margin;v-text-anchor:middle" o:gfxdata="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" filled="f" strokecolor="red" strokeweight="1pt">
                       <v:stroke joinstyle="miter"/>
                     </v:oval>
                   </w:pict>
@@ -11687,6 +11687,77 @@
         </w:rPr>
         <w:t xml:space="preserve">  </w:t>
       </w:r>
+      <w:r>
+        <w:rPr>
+          <w:rFonts w:ascii="Calibri" w:hAnsi="Calibri" w:cs="Calibri"/>
+          <w:color w:val="70AD47" w:themeColor="accent6"/>
+          <w:sz w:val="22"/>
+          <w:szCs w:val="22"/>
+          <w:lang w:val="en-US"/>
+        </w:rPr>
+        <w:fldChar w:fldCharType="begin"/>
+      </w:r>
+      <w:r>
+        <w:rPr>
+          <w:rFonts w:ascii="Calibri" w:eastAsia="SimSun" w:hAnsi="Calibri" w:cs="Calibri"/>
+          <w:color w:val="70AD47" w:themeColor="accent6"/>
+          <w:sz w:val="22"/>
+          <w:szCs w:val="22"/>
+          <w:lang w:val="en-US"/>
+        </w:rPr>
+        <w:instrText xml:space="preserve"> </w:instrText>
+      </w:r>
+      <w:r>
+        <w:rPr>
+          <w:rFonts w:ascii="Calibri" w:eastAsia="SimSun" w:hAnsi="Calibri" w:cs="Calibri" w:hint="eastAsia"/>
+          <w:color w:val="70AD47" w:themeColor="accent6"/>
+          <w:sz w:val="22"/>
+          <w:szCs w:val="22"/>
+          <w:lang w:val="en-US"/>
+        </w:rPr>
+        <w:instrText>= 4 \* GB3</w:instrText>
+      </w:r>
+      <w:r>
+        <w:rPr>
+          <w:rFonts w:ascii="Calibri" w:eastAsia="SimSun" w:hAnsi="Calibri" w:cs="Calibri"/>
+          <w:color w:val="70AD47" w:themeColor="accent6"/>
+          <w:sz w:val="22"/>
+          <w:szCs w:val="22"/>
+          <w:lang w:val="en-US"/>
+        </w:rPr>
+        <w:instrText xml:space="preserve"> </w:instrText>
+      </w:r>
+      <w:r>
+        <w:rPr>
+          <w:rFonts w:ascii="Calibri" w:hAnsi="Calibri" w:cs="Calibri"/>
+          <w:color w:val="70AD47" w:themeColor="accent6"/>
+          <w:sz w:val="22"/>
+          <w:szCs w:val="22"/>
+          <w:lang w:val="en-US"/>
+        </w:rPr>
+        <w:fldChar w:fldCharType="separate"/>
+      </w:r>
+      <w:r>
+        <w:rPr>
+          <w:rFonts w:ascii="Calibri" w:eastAsia="SimSun" w:hAnsi="Calibri" w:cs="Calibri" w:hint="eastAsia"/>
+          <w:noProof/>
+          <w:color w:val="70AD47" w:themeColor="accent6"/>
+          <w:sz w:val="22"/>
+          <w:szCs w:val="22"/>
+          <w:lang w:val="en-US"/>
+        </w:rPr>
+        <w:t>④</w:t>
+      </w:r>
+      <w:r>
+        <w:rPr>
+          <w:rFonts w:ascii="Calibri" w:hAnsi="Calibri" w:cs="Calibri"/>
+          <w:color w:val="70AD47" w:themeColor="accent6"/>
+          <w:sz w:val="22"/>
+          <w:szCs w:val="22"/>
+          <w:lang w:val="en-US"/>
+        </w:rPr>
+        <w:fldChar w:fldCharType="end"/>
+      </w:r>
     </w:p>
     <w:p>
       <w:pPr>
@@ -11800,6 +11871,87 @@
         </w:rPr>
         <w:t>1</w:t>
       </w:r>
+      <w:r>
+        <w:rPr>
+          <w:rFonts w:ascii="Calibri" w:hAnsi="Calibri" w:cs="Calibri"/>
+          <w:color w:val="70AD47" w:themeColor="accent6"/>
+          <w:sz w:val="22"/>
+          <w:szCs w:val="22"/>
+          <w:lang w:val="en-US"/>
+        </w:rPr>
+        <w:t xml:space="preserve">  </w:t>
+      </w:r>
+      <w:r>
+        <w:rPr>
+          <w:rFonts w:ascii="Calibri" w:hAnsi="Calibri" w:cs="Calibri"/>
+          <w:color w:val="70AD47" w:themeColor="accent6"/>
+          <w:sz w:val="22"/>
+          <w:szCs w:val="22"/>
+          <w:lang w:val="en-US"/>
+        </w:rPr>
+        <w:fldChar w:fldCharType="begin"/>
+      </w:r>
+      <w:r>
+        <w:rPr>
+          <w:rFonts w:ascii="Calibri" w:eastAsia="SimSun" w:hAnsi="Calibri" w:cs="Calibri"/>
+          <w:color w:val="70AD47" w:themeColor="accent6"/>
+          <w:sz w:val="22"/>
+          <w:szCs w:val="22"/>
+          <w:lang w:val="en-US"/>
+        </w:rPr>
+        <w:instrText xml:space="preserve"> </w:instrText>
+      </w:r>
+      <w:r>
+        <w:rPr>
+          <w:rFonts w:ascii="Calibri" w:eastAsia="SimSun" w:hAnsi="Calibri" w:cs="Calibri" w:hint="eastAsia"/>
+          <w:color w:val="70AD47" w:themeColor="accent6"/>
+          <w:sz w:val="22"/>
+          <w:szCs w:val="22"/>
+          <w:lang w:val="en-US"/>
+        </w:rPr>
+        <w:instrText>= 5 \* GB3</w:instrText>
+      </w:r>
+      <w:r>
+        <w:rPr>
+          <w:rFonts w:ascii="Calibri" w:eastAsia="SimSun" w:hAnsi="Calibri" w:cs="Calibri"/>
+          <w:color w:val="70AD47" w:themeColor="accent6"/>
+          <w:sz w:val="22"/>
+          <w:szCs w:val="22"/>
+          <w:lang w:val="en-US"/>
+        </w:rPr>
+        <w:instrText xml:space="preserve"> </w:instrText>
+      </w:r>
+      <w:r>
+        <w:rPr>
+          <w:rFonts w:ascii="Calibri" w:hAnsi="Calibri" w:cs="Calibri"/>
+          <w:color w:val="70AD47" w:themeColor="accent6"/>
+          <w:sz w:val="22"/>
+          <w:szCs w:val="22"/>
+          <w:lang w:val="en-US"/>
+        </w:rPr>
+        <w:fldChar w:fldCharType="separate"/>
+      </w:r>
+      <w:r>
+        <w:rPr>
+          <w:rFonts w:ascii="Calibri" w:eastAsia="SimSun" w:hAnsi="Calibri" w:cs="Calibri" w:hint="eastAsia"/>
+          <w:noProof/>
+          <w:color w:val="70AD47" w:themeColor="accent6"/>
+          <w:sz w:val="22"/>
+          <w:szCs w:val="22"/>
+          <w:lang w:val="en-US"/>
+        </w:rPr>
+        <w:t>⑤</w:t>
+      </w:r>
+      <w:r>
+        <w:rPr>
+          <w:rFonts w:ascii="Calibri" w:hAnsi="Calibri" w:cs="Calibri"/>
+          <w:color w:val="70AD47" w:themeColor="accent6"/>
+          <w:sz w:val="22"/>
+          <w:szCs w:val="22"/>
+          <w:lang w:val="en-US"/>
+        </w:rPr>
+        <w:fldChar w:fldCharType="end"/>
+      </w:r>
     </w:p>
     <w:p>
       <w:pPr>
@@ -11913,6 +12065,87 @@
         </w:rPr>
         <w:t>8</w:t>
       </w:r>
+      <w:r>
+        <w:rPr>
+          <w:rFonts w:ascii="Calibri" w:hAnsi="Calibri" w:cs="Calibri"/>
+          <w:color w:val="70AD47" w:themeColor="accent6"/>
+          <w:sz w:val="22"/>
+          <w:szCs w:val="22"/>
+          <w:lang w:val="en-US"/>
+        </w:rPr>
+        <w:t xml:space="preserve">  </w:t>
+      </w:r>
+      <w:r>
+        <w:rPr>
+          <w:rFonts w:ascii="Calibri" w:hAnsi="Calibri" w:cs="Calibri"/>
+          <w:color w:val="70AD47" w:themeColor="accent6"/>
+          <w:sz w:val="22"/>
+          <w:szCs w:val="22"/>
+          <w:lang w:val="en-US"/>
+        </w:rPr>
+        <w:fldChar w:fldCharType="begin"/>
+      </w:r>
+      <w:r>
+        <w:rPr>
+          <w:rFonts w:ascii="Calibri" w:eastAsia="SimSun" w:hAnsi="Calibri" w:cs="Calibri"/>
+          <w:color w:val="70AD47" w:themeColor="accent6"/>
+          <w:sz w:val="22"/>
+          <w:szCs w:val="22"/>
+          <w:lang w:val="en-US"/>
+        </w:rPr>
+        <w:instrText xml:space="preserve"> </w:instrText>
+      </w:r>
+      <w:r>
+        <w:rPr>
+          <w:rFonts w:ascii="Calibri" w:eastAsia="SimSun" w:hAnsi="Calibri" w:cs="Calibri" w:hint="eastAsia"/>
+          <w:color w:val="70AD47" w:themeColor="accent6"/>
+          <w:sz w:val="22"/>
+          <w:szCs w:val="22"/>
+          <w:lang w:val="en-US"/>
+        </w:rPr>
+        <w:instrText>= 6 \* GB3</w:instrText>
+      </w:r>
+      <w:r>
+        <w:rPr>
+          <w:rFonts w:ascii="Calibri" w:eastAsia="SimSun" w:hAnsi="Calibri" w:cs="Calibri"/>
+          <w:color w:val="70AD47" w:themeColor="accent6"/>
+          <w:sz w:val="22"/>
+          <w:szCs w:val="22"/>
+          <w:lang w:val="en-US"/>
+        </w:rPr>
+        <w:instrText xml:space="preserve"> </w:instrText>
+      </w:r>
+      <w:r>
+        <w:rPr>
+          <w:rFonts w:ascii="Calibri" w:hAnsi="Calibri" w:cs="Calibri"/>
+          <w:color w:val="70AD47" w:themeColor="accent6"/>
+          <w:sz w:val="22"/>
+          <w:szCs w:val="22"/>
+          <w:lang w:val="en-US"/>
+        </w:rPr>
+        <w:fldChar w:fldCharType="separate"/>
+      </w:r>
+      <w:r>
+        <w:rPr>
+          <w:rFonts w:ascii="Calibri" w:eastAsia="SimSun" w:hAnsi="Calibri" w:cs="Calibri" w:hint="eastAsia"/>
+          <w:noProof/>
+          <w:color w:val="70AD47" w:themeColor="accent6"/>
+          <w:sz w:val="22"/>
+          <w:szCs w:val="22"/>
+          <w:lang w:val="en-US"/>
+        </w:rPr>
+        <w:t>⑥</w:t>
+      </w:r>
+      <w:r>
+        <w:rPr>
+          <w:rFonts w:ascii="Calibri" w:hAnsi="Calibri" w:cs="Calibri"/>
+          <w:color w:val="70AD47" w:themeColor="accent6"/>
+          <w:sz w:val="22"/>
+          <w:szCs w:val="22"/>
+          <w:lang w:val="en-US"/>
+        </w:rPr>
+        <w:fldChar w:fldCharType="end"/>
+      </w:r>
     </w:p>
     <w:p>
       <w:pPr>
@@ -12026,6 +12259,87 @@
         </w:rPr>
         <w:t>8</w:t>
       </w:r>
+      <w:r>
+        <w:rPr>
+          <w:rFonts w:ascii="Calibri" w:hAnsi="Calibri" w:cs="Calibri"/>
+          <w:color w:val="70AD47" w:themeColor="accent6"/>
+          <w:sz w:val="22"/>
+          <w:szCs w:val="22"/>
+          <w:lang w:val="en-US"/>
+        </w:rPr>
+        <w:t xml:space="preserve">  </w:t>
+      </w:r>
+      <w:r>
+        <w:rPr>
+          <w:rFonts w:ascii="Calibri" w:hAnsi="Calibri" w:cs="Calibri"/>
+          <w:color w:val="70AD47" w:themeColor="accent6"/>
+          <w:sz w:val="22"/>
+          <w:szCs w:val="22"/>
+          <w:lang w:val="en-US"/>
+        </w:rPr>
+        <w:fldChar w:fldCharType="begin"/>
+      </w:r>
+      <w:r>
+        <w:rPr>
+          <w:rFonts w:ascii="Calibri" w:eastAsia="SimSun" w:hAnsi="Calibri" w:cs="Calibri"/>
+          <w:color w:val="70AD47" w:themeColor="accent6"/>
+          <w:sz w:val="22"/>
+          <w:szCs w:val="22"/>
+          <w:lang w:val="en-US"/>
+        </w:rPr>
+        <w:instrText xml:space="preserve"> </w:instrText>
+      </w:r>
+      <w:r>
+        <w:rPr>
+          <w:rFonts w:ascii="Calibri" w:eastAsia="SimSun" w:hAnsi="Calibri" w:cs="Calibri" w:hint="eastAsia"/>
+          <w:color w:val="70AD47" w:themeColor="accent6"/>
+          <w:sz w:val="22"/>
+          <w:szCs w:val="22"/>
+          <w:lang w:val="en-US"/>
+        </w:rPr>
+        <w:instrText>= 7 \* GB3</w:instrText>
+      </w:r>
+      <w:r>
+        <w:rPr>
+          <w:rFonts w:ascii="Calibri" w:eastAsia="SimSun" w:hAnsi="Calibri" w:cs="Calibri"/>
+          <w:color w:val="70AD47" w:themeColor="accent6"/>
+          <w:sz w:val="22"/>
+          <w:szCs w:val="22"/>
+          <w:lang w:val="en-US"/>
+        </w:rPr>
+        <w:instrText xml:space="preserve"> </w:instrText>
+      </w:r>
+      <w:r>
+        <w:rPr>
+          <w:rFonts w:ascii="Calibri" w:hAnsi="Calibri" w:cs="Calibri"/>
+          <w:color w:val="70AD47" w:themeColor="accent6"/>
+          <w:sz w:val="22"/>
+          <w:szCs w:val="22"/>
+          <w:lang w:val="en-US"/>
+        </w:rPr>
+        <w:fldChar w:fldCharType="separate"/>
+      </w:r>
+      <w:r>
+        <w:rPr>
+          <w:rFonts w:ascii="Calibri" w:eastAsia="SimSun" w:hAnsi="Calibri" w:cs="Calibri" w:hint="eastAsia"/>
+          <w:noProof/>
+          <w:color w:val="70AD47" w:themeColor="accent6"/>
+          <w:sz w:val="22"/>
+          <w:szCs w:val="22"/>
+          <w:lang w:val="en-US"/>
+        </w:rPr>
+        <w:t>⑦</w:t>
+      </w:r>
+      <w:r>
+        <w:rPr>
+          <w:rFonts w:ascii="Calibri" w:hAnsi="Calibri" w:cs="Calibri"/>
+          <w:color w:val="70AD47" w:themeColor="accent6"/>
+          <w:sz w:val="22"/>
+          <w:szCs w:val="22"/>
+          <w:lang w:val="en-US"/>
+        </w:rPr>
+        <w:fldChar w:fldCharType="end"/>
+      </w:r>
     </w:p>
     <w:p>
       <w:pPr>
@@ -12139,6 +12453,87 @@
         </w:rPr>
         <w:t>8</w:t>
       </w:r>
+      <w:r>
+        <w:rPr>
+          <w:rFonts w:ascii="Calibri" w:hAnsi="Calibri" w:cs="Calibri"/>
+          <w:color w:val="70AD47" w:themeColor="accent6"/>
+          <w:sz w:val="22"/>
+          <w:szCs w:val="22"/>
+          <w:lang w:val="en-US"/>
+        </w:rPr>
+        <w:t xml:space="preserve">  </w:t>
+      </w:r>
+      <w:r>
+        <w:rPr>
+          <w:rFonts w:ascii="Calibri" w:hAnsi="Calibri" w:cs="Calibri"/>
+          <w:color w:val="70AD47" w:themeColor="accent6"/>
+          <w:sz w:val="22"/>
+          <w:szCs w:val="22"/>
+          <w:lang w:val="en-US"/>
+        </w:rPr>
+        <w:fldChar w:fldCharType="begin"/>
+      </w:r>
+      <w:r>
+        <w:rPr>
+          <w:rFonts w:ascii="Calibri" w:eastAsia="SimSun" w:hAnsi="Calibri" w:cs="Calibri"/>
+          <w:color w:val="70AD47" w:themeColor="accent6"/>
+          <w:sz w:val="22"/>
+          <w:szCs w:val="22"/>
+          <w:lang w:val="en-US"/>
+        </w:rPr>
+        <w:instrText xml:space="preserve"> </w:instrText>
+      </w:r>
+      <w:r>
+        <w:rPr>
+          <w:rFonts w:ascii="Calibri" w:eastAsia="SimSun" w:hAnsi="Calibri" w:cs="Calibri" w:hint="eastAsia"/>
+          <w:color w:val="70AD47" w:themeColor="accent6"/>
+          <w:sz w:val="22"/>
+          <w:szCs w:val="22"/>
+          <w:lang w:val="en-US"/>
+        </w:rPr>
+        <w:instrText>= 8 \* GB3</w:instrText>
+      </w:r>
+      <w:r>
+        <w:rPr>
+          <w:rFonts w:ascii="Calibri" w:eastAsia="SimSun" w:hAnsi="Calibri" w:cs="Calibri"/>
+          <w:color w:val="70AD47" w:themeColor="accent6"/>
+          <w:sz w:val="22"/>
+          <w:szCs w:val="22"/>
+          <w:lang w:val="en-US"/>
+        </w:rPr>
+        <w:instrText xml:space="preserve"> </w:instrText>
+      </w:r>
+      <w:r>
+        <w:rPr>
+          <w:rFonts w:ascii="Calibri" w:hAnsi="Calibri" w:cs="Calibri"/>
+          <w:color w:val="70AD47" w:themeColor="accent6"/>
+          <w:sz w:val="22"/>
+          <w:szCs w:val="22"/>
+          <w:lang w:val="en-US"/>
+        </w:rPr>
+        <w:fldChar w:fldCharType="separate"/>
+      </w:r>
+      <w:r>
+        <w:rPr>
+          <w:rFonts w:ascii="Calibri" w:eastAsia="SimSun" w:hAnsi="Calibri" w:cs="Calibri" w:hint="eastAsia"/>
+          <w:noProof/>
+          <w:color w:val="70AD47" w:themeColor="accent6"/>
+          <w:sz w:val="22"/>
+          <w:szCs w:val="22"/>
+          <w:lang w:val="en-US"/>
+        </w:rPr>
+        <w:t>⑧</w:t>
+      </w:r>
+      <w:r>
+        <w:rPr>
+          <w:rFonts w:ascii="Calibri" w:hAnsi="Calibri" w:cs="Calibri"/>
+          <w:color w:val="70AD47" w:themeColor="accent6"/>
+          <w:sz w:val="22"/>
+          <w:szCs w:val="22"/>
+          <w:lang w:val="en-US"/>
+        </w:rPr>
+        <w:fldChar w:fldCharType="end"/>
+      </w:r>
     </w:p>
     <w:p>
       <w:pPr>
@@ -12252,6 +12647,87 @@
         </w:rPr>
         <w:t>6</w:t>
       </w:r>
+      <w:r>
+        <w:rPr>
+          <w:rFonts w:ascii="Calibri" w:hAnsi="Calibri" w:cs="Calibri"/>
+          <w:color w:val="70AD47" w:themeColor="accent6"/>
+          <w:sz w:val="22"/>
+          <w:szCs w:val="22"/>
+          <w:lang w:val="en-US"/>
+        </w:rPr>
+        <w:t xml:space="preserve">  </w:t>
+      </w:r>
+      <w:r>
+        <w:rPr>
+          <w:rFonts w:ascii="Calibri" w:hAnsi="Calibri" w:cs="Calibri"/>
+          <w:color w:val="70AD47" w:themeColor="accent6"/>
+          <w:sz w:val="22"/>
+          <w:szCs w:val="22"/>
+          <w:lang w:val="en-US"/>
+        </w:rPr>
+        <w:fldChar w:fldCharType="begin"/>
+      </w:r>
+      <w:r>
+        <w:rPr>
+          <w:rFonts w:ascii="Calibri" w:eastAsia="SimSun" w:hAnsi="Calibri" w:cs="Calibri"/>
+          <w:color w:val="70AD47" w:themeColor="accent6"/>
+          <w:sz w:val="22"/>
+          <w:szCs w:val="22"/>
+          <w:lang w:val="en-US"/>
+        </w:rPr>
+        <w:instrText xml:space="preserve"> </w:instrText>
+      </w:r>
+      <w:r>
+        <w:rPr>
+          <w:rFonts w:ascii="Calibri" w:eastAsia="SimSun" w:hAnsi="Calibri" w:cs="Calibri" w:hint="eastAsia"/>
+          <w:color w:val="70AD47" w:themeColor="accent6"/>
+          <w:sz w:val="22"/>
+          <w:szCs w:val="22"/>
+          <w:lang w:val="en-US"/>
+        </w:rPr>
+        <w:instrText>= 9 \* GB3</w:instrText>
+      </w:r>
+      <w:r>
+        <w:rPr>
+          <w:rFonts w:ascii="Calibri" w:eastAsia="SimSun" w:hAnsi="Calibri" w:cs="Calibri"/>
+          <w:color w:val="70AD47" w:themeColor="accent6"/>
+          <w:sz w:val="22"/>
+          <w:szCs w:val="22"/>
+          <w:lang w:val="en-US"/>
+        </w:rPr>
+        <w:instrText xml:space="preserve"> </w:instrText>
+      </w:r>
+      <w:r>
+        <w:rPr>
+          <w:rFonts w:ascii="Calibri" w:hAnsi="Calibri" w:cs="Calibri"/>
+          <w:color w:val="70AD47" w:themeColor="accent6"/>
+          <w:sz w:val="22"/>
+          <w:szCs w:val="22"/>
+          <w:lang w:val="en-US"/>
+        </w:rPr>
+        <w:fldChar w:fldCharType="separate"/>
+      </w:r>
+      <w:r>
+        <w:rPr>
+          <w:rFonts w:ascii="Calibri" w:eastAsia="SimSun" w:hAnsi="Calibri" w:cs="Calibri" w:hint="eastAsia"/>
+          <w:noProof/>
+          <w:color w:val="70AD47" w:themeColor="accent6"/>
+          <w:sz w:val="22"/>
+          <w:szCs w:val="22"/>
+          <w:lang w:val="en-US"/>
+        </w:rPr>
+        <w:t>⑨</w:t>
+      </w:r>
+      <w:r>
+        <w:rPr>
+          <w:rFonts w:ascii="Calibri" w:hAnsi="Calibri" w:cs="Calibri"/>
+          <w:color w:val="70AD47" w:themeColor="accent6"/>
+          <w:sz w:val="22"/>
+          <w:szCs w:val="22"/>
+          <w:lang w:val="en-US"/>
+        </w:rPr>
+        <w:fldChar w:fldCharType="end"/>
+      </w:r>
     </w:p>
     <w:p>
       <w:pPr>
@@ -12324,6 +12800,87 @@
           <w:lang w:val="en-US"/>
         </w:rPr>
         <w:t>75</w:t>
+      </w:r>
+      <w:r>
+        <w:rPr>
+          <w:rFonts w:ascii="Calibri" w:hAnsi="Calibri" w:cs="Calibri"/>
+          <w:color w:val="70AD47" w:themeColor="accent6"/>
+          <w:sz w:val="22"/>
+          <w:szCs w:val="22"/>
+          <w:lang w:val="en-US"/>
+        </w:rPr>
+        <w:t xml:space="preserve">  </w:t>
+      </w:r>
+      <w:r>
+        <w:rPr>
+          <w:rFonts w:ascii="Calibri" w:hAnsi="Calibri" w:cs="Calibri"/>
+          <w:color w:val="70AD47" w:themeColor="accent6"/>
+          <w:sz w:val="22"/>
+          <w:szCs w:val="22"/>
+          <w:lang w:val="en-US"/>
+        </w:rPr>
+        <w:fldChar w:fldCharType="begin"/>
+      </w:r>
+      <w:r>
+        <w:rPr>
+          <w:rFonts w:ascii="Calibri" w:eastAsia="SimSun" w:hAnsi="Calibri" w:cs="Calibri"/>
+          <w:color w:val="70AD47" w:themeColor="accent6"/>
+          <w:sz w:val="22"/>
+          <w:szCs w:val="22"/>
+          <w:lang w:val="en-US"/>
+        </w:rPr>
+        <w:instrText xml:space="preserve"> </w:instrText>
+      </w:r>
+      <w:r>
+        <w:rPr>
+          <w:rFonts w:ascii="Calibri" w:eastAsia="SimSun" w:hAnsi="Calibri" w:cs="Calibri" w:hint="eastAsia"/>
+          <w:color w:val="70AD47" w:themeColor="accent6"/>
+          <w:sz w:val="22"/>
+          <w:szCs w:val="22"/>
+          <w:lang w:val="en-US"/>
+        </w:rPr>
+        <w:instrText>= 10 \* GB3</w:instrText>
+      </w:r>
+      <w:r>
+        <w:rPr>
+          <w:rFonts w:ascii="Calibri" w:eastAsia="SimSun" w:hAnsi="Calibri" w:cs="Calibri"/>
+          <w:color w:val="70AD47" w:themeColor="accent6"/>
+          <w:sz w:val="22"/>
+          <w:szCs w:val="22"/>
+          <w:lang w:val="en-US"/>
+        </w:rPr>
+        <w:instrText xml:space="preserve"> </w:instrText>
+      </w:r>
+      <w:r>
+        <w:rPr>
+          <w:rFonts w:ascii="Calibri" w:hAnsi="Calibri" w:cs="Calibri"/>
+          <w:color w:val="70AD47" w:themeColor="accent6"/>
+          <w:sz w:val="22"/>
+          <w:szCs w:val="22"/>
+          <w:lang w:val="en-US"/>
+        </w:rPr>
+        <w:fldChar w:fldCharType="separate"/>
+      </w:r>
+      <w:r>
+        <w:rPr>
+          <w:rFonts w:ascii="Calibri" w:eastAsia="SimSun" w:hAnsi="Calibri" w:cs="Calibri" w:hint="eastAsia"/>
+          <w:noProof/>
+          <w:color w:val="70AD47" w:themeColor="accent6"/>
+          <w:sz w:val="22"/>
+          <w:szCs w:val="22"/>
+          <w:lang w:val="en-US"/>
+        </w:rPr>
+        <w:t>⑩</w:t>
+      </w:r>
+      <w:r>
+        <w:rPr>
+          <w:rFonts w:ascii="Calibri" w:hAnsi="Calibri" w:cs="Calibri"/>
+          <w:color w:val="70AD47" w:themeColor="accent6"/>
+          <w:sz w:val="22"/>
+          <w:szCs w:val="22"/>
+          <w:lang w:val="en-US"/>
+        </w:rPr>
+        <w:fldChar w:fldCharType="end"/>
       </w:r>
     </w:p>
     <w:p>

</xml_diff>